<commit_message>
[docker-deploy] Fix: DeviceState.Remove() missing (thiết bị không biến mất sau khi xóa) + audit behavior parity
- State/DeviceState.cs: thêm method Remove(string serial) dùng ConcurrentDictionary.TryRemove
- Endpoints/DeviceEndpoints.cs: handler POST /api/devices/remove nhận thêm DeviceState qua DI,
  gọi deviceState.Remove() + repo.Remove() song song — parity WinForms MainForm.cs:572-577
- Audit behavior parity: confirm dialog JS đã có từ trước (parity WinForms MessageBox YesNo)
- Re-detect khi thiết bị vẫn live sau xóa là hành vi đúng theo thiết kế (không fix thêm)
- Cập nhật PLAN-MASTER: thêm rủi ro R9, ghi nhận fix vào lịch sử cập nhật
- CODE-GRAPH: cập nhật đầy đủ sau Phase 2+3 (nhiều module còn ⬜), thêm thay đổi R9

Co-Authored-By: Claude Sonnet 4.6 <noreply@anthropic.com>
</commit_message>
<xml_diff>
--- a/code-graph/CODE-GRAPH.docx
+++ b/code-graph/CODE-GRAPH.docx
@@ -29,7 +29,7 @@
         <w:rPr>
           <w:sz w:val="21"/>
         </w:rPr>
-        <w:t>last_updated: 2026-08-05</w:t>
+        <w:t>last_updated: 2026-08-10</w:t>
       </w:r>
     </w:p>
     <w:p>
@@ -278,6 +278,79 @@
           </w:p>
         </w:tc>
       </w:tr>
+      <w:tr>
+        <w:tc>
+          <w:tcPr>
+            <w:tcW w:type="dxa" w:w="3230"/>
+            <w:tcBorders>
+              <w:top w:val="single" w:sz="4" w:space="0" w:color="CBCBCB"/>
+              <w:left w:val="single" w:sz="4" w:space="0" w:color="CBCBCB"/>
+              <w:bottom w:val="single" w:sz="4" w:space="0" w:color="CBCBCB"/>
+              <w:right w:val="single" w:sz="4" w:space="0" w:color="CBCBCB"/>
+            </w:tcBorders>
+          </w:tcPr>
+          <w:p>
+            <w:r>
+              <w:rPr>
+                <w:sz w:val="20"/>
+              </w:rPr>
+              <w:t>2026-08-10</w:t>
+            </w:r>
+          </w:p>
+        </w:tc>
+        <w:tc>
+          <w:tcPr>
+            <w:tcW w:type="dxa" w:w="3230"/>
+            <w:tcBorders>
+              <w:top w:val="single" w:sz="4" w:space="0" w:color="CBCBCB"/>
+              <w:left w:val="single" w:sz="4" w:space="0" w:color="CBCBCB"/>
+              <w:bottom w:val="single" w:sz="4" w:space="0" w:color="CBCBCB"/>
+              <w:right w:val="single" w:sz="4" w:space="0" w:color="CBCBCB"/>
+            </w:tcBorders>
+          </w:tcPr>
+          <w:p>
+            <w:r>
+              <w:rPr>
+                <w:sz w:val="20"/>
+              </w:rPr>
+              <w:t>Senior Developer</w:t>
+            </w:r>
+          </w:p>
+        </w:tc>
+        <w:tc>
+          <w:tcPr>
+            <w:tcW w:type="dxa" w:w="3230"/>
+            <w:tcBorders>
+              <w:top w:val="single" w:sz="4" w:space="0" w:color="CBCBCB"/>
+              <w:left w:val="single" w:sz="4" w:space="0" w:color="CBCBCB"/>
+              <w:bottom w:val="single" w:sz="4" w:space="0" w:color="CBCBCB"/>
+              <w:right w:val="single" w:sz="4" w:space="0" w:color="CBCBCB"/>
+            </w:tcBorders>
+          </w:tcPr>
+          <w:p>
+            <w:r>
+              <w:rPr>
+                <w:sz w:val="20"/>
+              </w:rPr>
+              <w:t xml:space="preserve">Cập nhật đầy đủ sau Phase 2+3 hoàn tất; thêm </w:t>
+            </w:r>
+            <w:r>
+              <w:rPr>
+                <w:rFonts w:ascii="Courier New" w:hAnsi="Courier New"/>
+                <w:color w:val="F05922"/>
+                <w:sz w:val="20"/>
+              </w:rPr>
+              <w:t>DeviceState.Remove()</w:t>
+            </w:r>
+            <w:r>
+              <w:rPr>
+                <w:sz w:val="20"/>
+              </w:rPr>
+              <w:t xml:space="preserve"> (bug fix R9); bổ sung toàn bộ module Services/Endpoints/State còn thiếu</w:t>
+            </w:r>
+          </w:p>
+        </w:tc>
+      </w:tr>
     </w:tbl>
     <w:p/>
     <w:p>
@@ -788,49 +861,79 @@
         <w:br/>
         <w:t>├── Configuration/</w:t>
         <w:br/>
-        <w:t>│   └── AdbSettings.cs          ← POCO config (AdbPath, PollIntervalMs, DbPath, UploadsPath, MaxUploadBytes)</w:t>
+        <w:t>│   └── AdbSettings.cs              ← POCO config (AdbPath, PollIntervalMs, DbPath, UploadsPath, MaxUploadBytes)</w:t>
+        <w:br/>
+        <w:t>├── Endpoints/</w:t>
+        <w:br/>
+        <w:t>│   ├── ApkEndpoints.cs             ← POST /api/apk/upload, DELETE /api/apk</w:t>
+        <w:br/>
+        <w:t>│   ├── DeviceEndpoints.cs          ← POST /api/devices/{connect,connect-batch,remove,poll}, GET /api/devices, POST /api/settings/package, /api/polling/toggle</w:t>
+        <w:br/>
+        <w:t>│   ├── HealthEndpoints.cs          ← GET /health</w:t>
+        <w:br/>
+        <w:t>│   ├── InstallEndpoints.cs         ← POST /api/install</w:t>
+        <w:br/>
+        <w:t>│   └── ScanEndpoints.cs            ← POST /api/scan/start, /api/scan/cancel</w:t>
         <w:br/>
         <w:t>├── Hubs/</w:t>
         <w:br/>
-        <w:t>│   └── DeviceHub.cs            ← SignalR Hub, endpoint /hubs/device</w:t>
+        <w:t>│   └── DeviceHub.cs                ← SignalR Hub, endpoint /hubs/device</w:t>
         <w:br/>
         <w:t>├── Models/</w:t>
         <w:br/>
-        <w:t>│   └── DeviceRecord.cs         ← POCO entity (9 property), dùng làm DB row + SignalR DTO</w:t>
+        <w:t>│   └── DeviceRecord.cs             ← POCO entity (9 property), dùng làm DB row + SignalR DTO</w:t>
         <w:br/>
         <w:t>├── Pages/</w:t>
         <w:br/>
-        <w:t>│   ├── _ViewImports.cshtml</w:t>
+        <w:t>│   ├── Index.cshtml                ← Dashboard: toolbar 3 hàng, grid 9 cột, action panel, log area</w:t>
         <w:br/>
-        <w:t>│   ├── _ViewStart.cshtml</w:t>
-        <w:br/>
-        <w:t>│   ├── Index.cshtml             ← Dashboard (Phase 2 sẽ hoàn thiện)</w:t>
-        <w:br/>
-        <w:t>│   ├── Index.cshtml.cs          ← IndexModel : PageModel</w:t>
+        <w:t>│   ├── Index.cshtml.cs             ← IndexModel : PageModel</w:t>
         <w:br/>
         <w:t>│   └── Shared/</w:t>
         <w:br/>
-        <w:t>│       └── _Layout.cshtml       ← Bootstrap 5, navbar KZTEK brand (Navy/Cam)</w:t>
+        <w:t>│       └── _Layout.cshtml          ← Bootstrap 5 local, navbar KZTEK brand (Navy/Cam)</w:t>
         <w:br/>
         <w:t>├── Services/</w:t>
         <w:br/>
-        <w:t>│   ├── AdbService.cs            ← Singleton; wrap adb binary; constructor: IOptions&lt;AdbSettings&gt;</w:t>
+        <w:t>│   ├── AdbService.cs               ← Singleton; wrap adb binary; GetDevices/Connect/Install/LaunchApp/GetVersion</w:t>
         <w:br/>
-        <w:t>│   ├── ApkManifestReader.cs     ← Singleton; parse AXML từ .apk; stateless</w:t>
+        <w:t>│   ├── ApkManifestReader.cs        ← Singleton; parse AXML từ .apk; stateless</w:t>
         <w:br/>
-        <w:t>│   └── DeviceRepository.cs      ← Singleton; SQLite CRUD; constructor: IOptions&lt;AdbSettings&gt;</w:t>
+        <w:t>│   ├── DeviceRepository.cs         ← Singleton; SQLite CRUD (Upsert/Remove/GetAll/GetSetting/SetSetting/UpdateInstallResult)</w:t>
+        <w:br/>
+        <w:t>│   ├── InstallCoordinator.cs       ← Singleton; queue install per-device (SemaphoreSlim(1)), global (SemaphoreSlim(4))</w:t>
+        <w:br/>
+        <w:t>│   ├── PollControlService.cs       ← Singleton; PollingEnabled flag + TriggerAsync (manual poll trigger)</w:t>
+        <w:br/>
+        <w:t>│   ├── ScanCoordinator.cs          ← Singleton; TCP probe scan (SemaphoreSlim(24), max 512 IP, timeout 1200ms)</w:t>
+        <w:br/>
+        <w:t>│   └── ScanRangeParser.cs          ← Static; parse IP range string → List&lt;string&gt; IPs</w:t>
+        <w:br/>
+        <w:t>├── State/</w:t>
+        <w:br/>
+        <w:t>│   └── DeviceState.cs              ← Singleton; ConcurrentDictionary in-memory snapshot; AddOrUpdate/TryGet/GetAll/GetSerials/Remove</w:t>
         <w:br/>
         <w:t>├── Workers/</w:t>
         <w:br/>
-        <w:t>│   └── DevicePollWorker.cs      ← BackgroundService; poll 3s heartbeat (Phase 2: logic thực)</w:t>
+        <w:t>│   └── DevicePollWorker.cs         ← BackgroundService; poll 3s → Upsert → RefreshVersion → push SignalR DevicesUpdated</w:t>
         <w:br/>
         <w:t>├── wwwroot/</w:t>
         <w:br/>
-        <w:t>│   └── js/</w:t>
+        <w:t>│   ├── js/</w:t>
         <w:br/>
-        <w:t>│       └── signalr-client.js    ← SignalR client (auto-reconnect, expose window.kzHubConnection)</w:t>
+        <w:t>│   │   ├── dashboard.js            ← Main UI logic: SignalR handlers, device grid, install/remove/connect buttons</w:t>
         <w:br/>
-        <w:t>├── Program.cs                   ← Entry point, DI registration, Kestrel 500MB limit</w:t>
+        <w:t>│   │   ├── scan-modal.js           ← Network scan modal JS</w:t>
+        <w:br/>
+        <w:t>│   │   └── signalr-client.js       ← SignalR client (auto-reconnect, expose window.kzHubConnection)</w:t>
+        <w:br/>
+        <w:t>│   └── lib/</w:t>
+        <w:br/>
+        <w:t>│       ├── bootstrap.bundle.min.js ← Bootstrap 5 local (tránh CDN fail trong Docker LAN)</w:t>
+        <w:br/>
+        <w:t>│       └── signalr.min.js          ← SignalR client lib local</w:t>
+        <w:br/>
+        <w:t>├── Program.cs                      ← Entry point, DI registration, Kestrel+FormOptions 500MB limit</w:t>
         <w:br/>
         <w:t>├── appsettings.json</w:t>
         <w:br/>
@@ -1111,7 +1214,7 @@
               <w:rPr>
                 <w:sz w:val="20"/>
               </w:rPr>
-              <w:t>AdbSettings, AdbService, DeviceRepository, ApkManifestReader, DevicePollWorker, DeviceHub</w:t>
+              <w:t>AdbSettings, AdbService, DeviceRepository, ApkManifestReader, DevicePollWorker, DeviceHub, DeviceState, InstallCoordinator, ScanCoordinator, PollControlService</w:t>
             </w:r>
           </w:p>
         </w:tc>
@@ -1171,7 +1274,7 @@
               <w:rPr>
                 <w:sz w:val="20"/>
               </w:rPr>
-              <w:t>2026-08-05</w:t>
+              <w:t>2026-08-10</w:t>
             </w:r>
           </w:p>
         </w:tc>
@@ -1270,7 +1373,7 @@
               <w:rPr>
                 <w:sz w:val="20"/>
               </w:rPr>
-              <w:t>2026-08-05</w:t>
+              <w:t>2026-08-10</w:t>
             </w:r>
           </w:p>
         </w:tc>
@@ -1334,7 +1437,7 @@
               <w:rPr>
                 <w:sz w:val="20"/>
               </w:rPr>
-              <w:t>DevicePollWorker (Phase 2), InstallCoordinator (Phase 2)</w:t>
+              <w:t>DevicePollWorker, InstallCoordinator</w:t>
             </w:r>
           </w:p>
         </w:tc>
@@ -1374,7 +1477,7 @@
               <w:rPr>
                 <w:sz w:val="20"/>
               </w:rPr>
-              <w:t>2026-08-05</w:t>
+              <w:t>2026-08-10</w:t>
             </w:r>
           </w:p>
         </w:tc>
@@ -1435,7 +1538,7 @@
               <w:rPr>
                 <w:sz w:val="20"/>
               </w:rPr>
-              <w:t>DevicePollWorker (Phase 2), API endpoints (Phase 2)</w:t>
+              <w:t>DevicePollWorker, DeviceEndpoints, InstallEndpoints, ApkEndpoints, InstallCoordinator</w:t>
             </w:r>
           </w:p>
         </w:tc>
@@ -1473,7 +1576,7 @@
               <w:rPr>
                 <w:sz w:val="20"/>
               </w:rPr>
-              <w:t>2026-08-05</w:t>
+              <w:t>2026-08-10</w:t>
             </w:r>
           </w:p>
         </w:tc>
@@ -1537,7 +1640,7 @@
               <w:rPr>
                 <w:sz w:val="20"/>
               </w:rPr>
-              <w:t>APK upload endpoint (Phase 2)</w:t>
+              <w:t>ApkEndpoints</w:t>
             </w:r>
           </w:p>
         </w:tc>
@@ -1577,7 +1680,7 @@
               <w:rPr>
                 <w:sz w:val="20"/>
               </w:rPr>
-              <w:t>2026-08-05</w:t>
+              <w:t>2026-08-10</w:t>
             </w:r>
           </w:p>
         </w:tc>
@@ -1600,7 +1703,7 @@
                 <w:color w:val="F05922"/>
                 <w:sz w:val="20"/>
               </w:rPr>
-              <w:t>Hubs/DeviceHub</w:t>
+              <w:t>Services/InstallCoordinator</w:t>
             </w:r>
           </w:p>
         </w:tc>
@@ -1619,7 +1722,7 @@
               <w:rPr>
                 <w:sz w:val="20"/>
               </w:rPr>
-              <w:t>Microsoft.AspNetCore.SignalR.Hub</w:t>
+              <w:t>AdbService, DeviceRepository, DeviceState, IHubContext\&lt;DeviceHub\&gt;</w:t>
             </w:r>
           </w:p>
         </w:tc>
@@ -1638,7 +1741,7 @@
               <w:rPr>
                 <w:sz w:val="20"/>
               </w:rPr>
-              <w:t>Program.cs (MapHub), Workers (Phase 2)</w:t>
+              <w:t>InstallEndpoints</w:t>
             </w:r>
           </w:p>
         </w:tc>
@@ -1676,7 +1779,7 @@
               <w:rPr>
                 <w:sz w:val="20"/>
               </w:rPr>
-              <w:t>2026-08-05</w:t>
+              <w:t>2026-08-10</w:t>
             </w:r>
           </w:p>
         </w:tc>
@@ -1700,7 +1803,7 @@
                 <w:color w:val="F05922"/>
                 <w:sz w:val="20"/>
               </w:rPr>
-              <w:t>Workers/DevicePollWorker</w:t>
+              <w:t>Services/PollControlService</w:t>
             </w:r>
           </w:p>
         </w:tc>
@@ -1720,7 +1823,7 @@
               <w:rPr>
                 <w:sz w:val="20"/>
               </w:rPr>
-              <w:t>IOptions\&lt;AdbSettings\&gt;, ILogger</w:t>
+              <w:t>—</w:t>
             </w:r>
           </w:p>
         </w:tc>
@@ -1740,7 +1843,7 @@
               <w:rPr>
                 <w:sz w:val="20"/>
               </w:rPr>
-              <w:t>Program.cs (AddHostedService)</w:t>
+              <w:t>DevicePollWorker, DeviceEndpoints</w:t>
             </w:r>
           </w:p>
         </w:tc>
@@ -1780,7 +1883,7 @@
               <w:rPr>
                 <w:sz w:val="20"/>
               </w:rPr>
-              <w:t>2026-08-05</w:t>
+              <w:t>2026-08-10</w:t>
             </w:r>
           </w:p>
         </w:tc>
@@ -1803,7 +1906,7 @@
                 <w:color w:val="F05922"/>
                 <w:sz w:val="20"/>
               </w:rPr>
-              <w:t>Models/DeviceRecord</w:t>
+              <w:t>Services/ScanCoordinator</w:t>
             </w:r>
           </w:p>
         </w:tc>
@@ -1822,7 +1925,7 @@
               <w:rPr>
                 <w:sz w:val="20"/>
               </w:rPr>
-              <w:t>—</w:t>
+              <w:t>IHubContext\&lt;DeviceHub\&gt;, ScanRangeParser</w:t>
             </w:r>
           </w:p>
         </w:tc>
@@ -1841,7 +1944,7 @@
               <w:rPr>
                 <w:sz w:val="20"/>
               </w:rPr>
-              <w:t>DeviceRepository, SignalR push (Phase 2), API JSON response (Phase 2)</w:t>
+              <w:t>ScanEndpoints</w:t>
             </w:r>
           </w:p>
         </w:tc>
@@ -1879,7 +1982,7 @@
               <w:rPr>
                 <w:sz w:val="20"/>
               </w:rPr>
-              <w:t>2026-08-05</w:t>
+              <w:t>2026-08-10</w:t>
             </w:r>
           </w:p>
         </w:tc>
@@ -1903,7 +2006,7 @@
                 <w:color w:val="F05922"/>
                 <w:sz w:val="20"/>
               </w:rPr>
-              <w:t>Pages/Index</w:t>
+              <w:t>Services/ScanRangeParser</w:t>
             </w:r>
           </w:p>
         </w:tc>
@@ -1923,7 +2026,7 @@
               <w:rPr>
                 <w:sz w:val="20"/>
               </w:rPr>
-              <w:t>IndexModel : PageModel</w:t>
+              <w:t>—</w:t>
             </w:r>
           </w:p>
         </w:tc>
@@ -1943,7 +2046,7 @@
               <w:rPr>
                 <w:sz w:val="20"/>
               </w:rPr>
-              <w:t>Router (/)</w:t>
+              <w:t>ScanCoordinator</w:t>
             </w:r>
           </w:p>
         </w:tc>
@@ -1983,7 +2086,7 @@
               <w:rPr>
                 <w:sz w:val="20"/>
               </w:rPr>
-              <w:t>2026-08-05</w:t>
+              <w:t>2026-08-10</w:t>
             </w:r>
           </w:p>
         </w:tc>
@@ -2006,7 +2109,7 @@
                 <w:color w:val="F05922"/>
                 <w:sz w:val="20"/>
               </w:rPr>
-              <w:t>wwwroot/js/signalr-client.js</w:t>
+              <w:t>State/DeviceState</w:t>
             </w:r>
           </w:p>
         </w:tc>
@@ -2025,7 +2128,7 @@
               <w:rPr>
                 <w:sz w:val="20"/>
               </w:rPr>
-              <w:t>signalr.min.js (CDN)</w:t>
+              <w:t>System.Collections.Concurrent, Models/DeviceRecord</w:t>
             </w:r>
           </w:p>
         </w:tc>
@@ -2044,7 +2147,7 @@
               <w:rPr>
                 <w:sz w:val="20"/>
               </w:rPr>
-              <w:t>_Layout.cshtml</w:t>
+              <w:t>DevicePollWorker, DeviceEndpoints, InstallEndpoints, InstallCoordinator</w:t>
             </w:r>
           </w:p>
         </w:tc>
@@ -2082,7 +2185,1225 @@
               <w:rPr>
                 <w:sz w:val="20"/>
               </w:rPr>
-              <w:t>2026-08-05</w:t>
+              <w:t>2026-08-10</w:t>
+            </w:r>
+          </w:p>
+        </w:tc>
+      </w:tr>
+      <w:tr>
+        <w:tc>
+          <w:tcPr>
+            <w:tcW w:type="dxa" w:w="1938"/>
+            <w:shd w:val="clear" w:color="auto" w:fill="B8B3D6"/>
+            <w:tcBorders>
+              <w:top w:val="single" w:sz="4" w:space="0" w:color="CBCBCB"/>
+              <w:left w:val="single" w:sz="4" w:space="0" w:color="CBCBCB"/>
+              <w:bottom w:val="single" w:sz="4" w:space="0" w:color="CBCBCB"/>
+              <w:right w:val="single" w:sz="4" w:space="0" w:color="CBCBCB"/>
+            </w:tcBorders>
+          </w:tcPr>
+          <w:p>
+            <w:r>
+              <w:rPr>
+                <w:rFonts w:ascii="Courier New" w:hAnsi="Courier New"/>
+                <w:color w:val="F05922"/>
+                <w:sz w:val="20"/>
+              </w:rPr>
+              <w:t>Hubs/DeviceHub</w:t>
+            </w:r>
+          </w:p>
+        </w:tc>
+        <w:tc>
+          <w:tcPr>
+            <w:tcW w:type="dxa" w:w="1938"/>
+            <w:shd w:val="clear" w:color="auto" w:fill="B8B3D6"/>
+            <w:tcBorders>
+              <w:top w:val="single" w:sz="4" w:space="0" w:color="CBCBCB"/>
+              <w:left w:val="single" w:sz="4" w:space="0" w:color="CBCBCB"/>
+              <w:bottom w:val="single" w:sz="4" w:space="0" w:color="CBCBCB"/>
+              <w:right w:val="single" w:sz="4" w:space="0" w:color="CBCBCB"/>
+            </w:tcBorders>
+          </w:tcPr>
+          <w:p>
+            <w:r>
+              <w:rPr>
+                <w:sz w:val="20"/>
+              </w:rPr>
+              <w:t>Microsoft.AspNetCore.SignalR.Hub</w:t>
+            </w:r>
+          </w:p>
+        </w:tc>
+        <w:tc>
+          <w:tcPr>
+            <w:tcW w:type="dxa" w:w="1938"/>
+            <w:shd w:val="clear" w:color="auto" w:fill="B8B3D6"/>
+            <w:tcBorders>
+              <w:top w:val="single" w:sz="4" w:space="0" w:color="CBCBCB"/>
+              <w:left w:val="single" w:sz="4" w:space="0" w:color="CBCBCB"/>
+              <w:bottom w:val="single" w:sz="4" w:space="0" w:color="CBCBCB"/>
+              <w:right w:val="single" w:sz="4" w:space="0" w:color="CBCBCB"/>
+            </w:tcBorders>
+          </w:tcPr>
+          <w:p>
+            <w:r>
+              <w:rPr>
+                <w:sz w:val="20"/>
+              </w:rPr>
+              <w:t>Program.cs (MapHub), DevicePollWorker, InstallCoordinator, ScanCoordinator</w:t>
+            </w:r>
+          </w:p>
+        </w:tc>
+        <w:tc>
+          <w:tcPr>
+            <w:tcW w:type="dxa" w:w="1938"/>
+            <w:shd w:val="clear" w:color="auto" w:fill="B8B3D6"/>
+            <w:tcBorders>
+              <w:top w:val="single" w:sz="4" w:space="0" w:color="CBCBCB"/>
+              <w:left w:val="single" w:sz="4" w:space="0" w:color="CBCBCB"/>
+              <w:bottom w:val="single" w:sz="4" w:space="0" w:color="CBCBCB"/>
+              <w:right w:val="single" w:sz="4" w:space="0" w:color="CBCBCB"/>
+            </w:tcBorders>
+          </w:tcPr>
+          <w:p>
+            <w:r>
+              <w:rPr>
+                <w:sz w:val="20"/>
+              </w:rPr>
+              <w:t>CONFIRMED</w:t>
+            </w:r>
+          </w:p>
+        </w:tc>
+        <w:tc>
+          <w:tcPr>
+            <w:tcW w:type="dxa" w:w="1938"/>
+            <w:shd w:val="clear" w:color="auto" w:fill="B8B3D6"/>
+            <w:tcBorders>
+              <w:top w:val="single" w:sz="4" w:space="0" w:color="CBCBCB"/>
+              <w:left w:val="single" w:sz="4" w:space="0" w:color="CBCBCB"/>
+              <w:bottom w:val="single" w:sz="4" w:space="0" w:color="CBCBCB"/>
+              <w:right w:val="single" w:sz="4" w:space="0" w:color="CBCBCB"/>
+            </w:tcBorders>
+          </w:tcPr>
+          <w:p>
+            <w:r>
+              <w:rPr>
+                <w:sz w:val="20"/>
+              </w:rPr>
+              <w:t>2026-08-10</w:t>
+            </w:r>
+          </w:p>
+        </w:tc>
+      </w:tr>
+      <w:tr>
+        <w:tc>
+          <w:tcPr>
+            <w:tcW w:type="dxa" w:w="1938"/>
+            <w:tcBorders>
+              <w:top w:val="single" w:sz="4" w:space="0" w:color="CBCBCB"/>
+              <w:left w:val="single" w:sz="4" w:space="0" w:color="CBCBCB"/>
+              <w:bottom w:val="single" w:sz="4" w:space="0" w:color="CBCBCB"/>
+              <w:right w:val="single" w:sz="4" w:space="0" w:color="CBCBCB"/>
+            </w:tcBorders>
+          </w:tcPr>
+          <w:p>
+            <w:r>
+              <w:rPr>
+                <w:rFonts w:ascii="Courier New" w:hAnsi="Courier New"/>
+                <w:color w:val="F05922"/>
+                <w:sz w:val="20"/>
+              </w:rPr>
+              <w:t>Workers/DevicePollWorker</w:t>
+            </w:r>
+          </w:p>
+        </w:tc>
+        <w:tc>
+          <w:tcPr>
+            <w:tcW w:type="dxa" w:w="1938"/>
+            <w:tcBorders>
+              <w:top w:val="single" w:sz="4" w:space="0" w:color="CBCBCB"/>
+              <w:left w:val="single" w:sz="4" w:space="0" w:color="CBCBCB"/>
+              <w:bottom w:val="single" w:sz="4" w:space="0" w:color="CBCBCB"/>
+              <w:right w:val="single" w:sz="4" w:space="0" w:color="CBCBCB"/>
+            </w:tcBorders>
+          </w:tcPr>
+          <w:p>
+            <w:r>
+              <w:rPr>
+                <w:sz w:val="20"/>
+              </w:rPr>
+              <w:t>IOptions\&lt;AdbSettings\&gt;, AdbService, DeviceRepository, DeviceState, PollControlService, IHubContext\&lt;DeviceHub\&gt;</w:t>
+            </w:r>
+          </w:p>
+        </w:tc>
+        <w:tc>
+          <w:tcPr>
+            <w:tcW w:type="dxa" w:w="1938"/>
+            <w:tcBorders>
+              <w:top w:val="single" w:sz="4" w:space="0" w:color="CBCBCB"/>
+              <w:left w:val="single" w:sz="4" w:space="0" w:color="CBCBCB"/>
+              <w:bottom w:val="single" w:sz="4" w:space="0" w:color="CBCBCB"/>
+              <w:right w:val="single" w:sz="4" w:space="0" w:color="CBCBCB"/>
+            </w:tcBorders>
+          </w:tcPr>
+          <w:p>
+            <w:r>
+              <w:rPr>
+                <w:sz w:val="20"/>
+              </w:rPr>
+              <w:t>Program.cs (AddHostedService)</w:t>
+            </w:r>
+          </w:p>
+        </w:tc>
+        <w:tc>
+          <w:tcPr>
+            <w:tcW w:type="dxa" w:w="1938"/>
+            <w:tcBorders>
+              <w:top w:val="single" w:sz="4" w:space="0" w:color="CBCBCB"/>
+              <w:left w:val="single" w:sz="4" w:space="0" w:color="CBCBCB"/>
+              <w:bottom w:val="single" w:sz="4" w:space="0" w:color="CBCBCB"/>
+              <w:right w:val="single" w:sz="4" w:space="0" w:color="CBCBCB"/>
+            </w:tcBorders>
+          </w:tcPr>
+          <w:p>
+            <w:r>
+              <w:rPr>
+                <w:sz w:val="20"/>
+              </w:rPr>
+              <w:t>CONFIRMED</w:t>
+            </w:r>
+          </w:p>
+        </w:tc>
+        <w:tc>
+          <w:tcPr>
+            <w:tcW w:type="dxa" w:w="1938"/>
+            <w:tcBorders>
+              <w:top w:val="single" w:sz="4" w:space="0" w:color="CBCBCB"/>
+              <w:left w:val="single" w:sz="4" w:space="0" w:color="CBCBCB"/>
+              <w:bottom w:val="single" w:sz="4" w:space="0" w:color="CBCBCB"/>
+              <w:right w:val="single" w:sz="4" w:space="0" w:color="CBCBCB"/>
+            </w:tcBorders>
+          </w:tcPr>
+          <w:p>
+            <w:r>
+              <w:rPr>
+                <w:sz w:val="20"/>
+              </w:rPr>
+              <w:t>2026-08-10</w:t>
+            </w:r>
+          </w:p>
+        </w:tc>
+      </w:tr>
+      <w:tr>
+        <w:tc>
+          <w:tcPr>
+            <w:tcW w:type="dxa" w:w="1938"/>
+            <w:shd w:val="clear" w:color="auto" w:fill="B8B3D6"/>
+            <w:tcBorders>
+              <w:top w:val="single" w:sz="4" w:space="0" w:color="CBCBCB"/>
+              <w:left w:val="single" w:sz="4" w:space="0" w:color="CBCBCB"/>
+              <w:bottom w:val="single" w:sz="4" w:space="0" w:color="CBCBCB"/>
+              <w:right w:val="single" w:sz="4" w:space="0" w:color="CBCBCB"/>
+            </w:tcBorders>
+          </w:tcPr>
+          <w:p>
+            <w:r>
+              <w:rPr>
+                <w:rFonts w:ascii="Courier New" w:hAnsi="Courier New"/>
+                <w:color w:val="F05922"/>
+                <w:sz w:val="20"/>
+              </w:rPr>
+              <w:t>Models/DeviceRecord</w:t>
+            </w:r>
+          </w:p>
+        </w:tc>
+        <w:tc>
+          <w:tcPr>
+            <w:tcW w:type="dxa" w:w="1938"/>
+            <w:shd w:val="clear" w:color="auto" w:fill="B8B3D6"/>
+            <w:tcBorders>
+              <w:top w:val="single" w:sz="4" w:space="0" w:color="CBCBCB"/>
+              <w:left w:val="single" w:sz="4" w:space="0" w:color="CBCBCB"/>
+              <w:bottom w:val="single" w:sz="4" w:space="0" w:color="CBCBCB"/>
+              <w:right w:val="single" w:sz="4" w:space="0" w:color="CBCBCB"/>
+            </w:tcBorders>
+          </w:tcPr>
+          <w:p>
+            <w:r>
+              <w:rPr>
+                <w:sz w:val="20"/>
+              </w:rPr>
+              <w:t>—</w:t>
+            </w:r>
+          </w:p>
+        </w:tc>
+        <w:tc>
+          <w:tcPr>
+            <w:tcW w:type="dxa" w:w="1938"/>
+            <w:shd w:val="clear" w:color="auto" w:fill="B8B3D6"/>
+            <w:tcBorders>
+              <w:top w:val="single" w:sz="4" w:space="0" w:color="CBCBCB"/>
+              <w:left w:val="single" w:sz="4" w:space="0" w:color="CBCBCB"/>
+              <w:bottom w:val="single" w:sz="4" w:space="0" w:color="CBCBCB"/>
+              <w:right w:val="single" w:sz="4" w:space="0" w:color="CBCBCB"/>
+            </w:tcBorders>
+          </w:tcPr>
+          <w:p>
+            <w:r>
+              <w:rPr>
+                <w:sz w:val="20"/>
+              </w:rPr>
+              <w:t>DeviceRepository, DeviceState, DevicePollWorker, InstallCoordinator, API JSON response</w:t>
+            </w:r>
+          </w:p>
+        </w:tc>
+        <w:tc>
+          <w:tcPr>
+            <w:tcW w:type="dxa" w:w="1938"/>
+            <w:shd w:val="clear" w:color="auto" w:fill="B8B3D6"/>
+            <w:tcBorders>
+              <w:top w:val="single" w:sz="4" w:space="0" w:color="CBCBCB"/>
+              <w:left w:val="single" w:sz="4" w:space="0" w:color="CBCBCB"/>
+              <w:bottom w:val="single" w:sz="4" w:space="0" w:color="CBCBCB"/>
+              <w:right w:val="single" w:sz="4" w:space="0" w:color="CBCBCB"/>
+            </w:tcBorders>
+          </w:tcPr>
+          <w:p>
+            <w:r>
+              <w:rPr>
+                <w:sz w:val="20"/>
+              </w:rPr>
+              <w:t>CONFIRMED</w:t>
+            </w:r>
+          </w:p>
+        </w:tc>
+        <w:tc>
+          <w:tcPr>
+            <w:tcW w:type="dxa" w:w="1938"/>
+            <w:shd w:val="clear" w:color="auto" w:fill="B8B3D6"/>
+            <w:tcBorders>
+              <w:top w:val="single" w:sz="4" w:space="0" w:color="CBCBCB"/>
+              <w:left w:val="single" w:sz="4" w:space="0" w:color="CBCBCB"/>
+              <w:bottom w:val="single" w:sz="4" w:space="0" w:color="CBCBCB"/>
+              <w:right w:val="single" w:sz="4" w:space="0" w:color="CBCBCB"/>
+            </w:tcBorders>
+          </w:tcPr>
+          <w:p>
+            <w:r>
+              <w:rPr>
+                <w:sz w:val="20"/>
+              </w:rPr>
+              <w:t>2026-08-10</w:t>
+            </w:r>
+          </w:p>
+        </w:tc>
+      </w:tr>
+      <w:tr>
+        <w:tc>
+          <w:tcPr>
+            <w:tcW w:type="dxa" w:w="1938"/>
+            <w:tcBorders>
+              <w:top w:val="single" w:sz="4" w:space="0" w:color="CBCBCB"/>
+              <w:left w:val="single" w:sz="4" w:space="0" w:color="CBCBCB"/>
+              <w:bottom w:val="single" w:sz="4" w:space="0" w:color="CBCBCB"/>
+              <w:right w:val="single" w:sz="4" w:space="0" w:color="CBCBCB"/>
+            </w:tcBorders>
+          </w:tcPr>
+          <w:p>
+            <w:r>
+              <w:rPr>
+                <w:rFonts w:ascii="Courier New" w:hAnsi="Courier New"/>
+                <w:color w:val="F05922"/>
+                <w:sz w:val="20"/>
+              </w:rPr>
+              <w:t>Endpoints/DeviceEndpoints</w:t>
+            </w:r>
+          </w:p>
+        </w:tc>
+        <w:tc>
+          <w:tcPr>
+            <w:tcW w:type="dxa" w:w="1938"/>
+            <w:tcBorders>
+              <w:top w:val="single" w:sz="4" w:space="0" w:color="CBCBCB"/>
+              <w:left w:val="single" w:sz="4" w:space="0" w:color="CBCBCB"/>
+              <w:bottom w:val="single" w:sz="4" w:space="0" w:color="CBCBCB"/>
+              <w:right w:val="single" w:sz="4" w:space="0" w:color="CBCBCB"/>
+            </w:tcBorders>
+          </w:tcPr>
+          <w:p>
+            <w:r>
+              <w:rPr>
+                <w:sz w:val="20"/>
+              </w:rPr>
+              <w:t>DeviceRepository, DeviceState, AdbService, PollControlService</w:t>
+            </w:r>
+          </w:p>
+        </w:tc>
+        <w:tc>
+          <w:tcPr>
+            <w:tcW w:type="dxa" w:w="1938"/>
+            <w:tcBorders>
+              <w:top w:val="single" w:sz="4" w:space="0" w:color="CBCBCB"/>
+              <w:left w:val="single" w:sz="4" w:space="0" w:color="CBCBCB"/>
+              <w:bottom w:val="single" w:sz="4" w:space="0" w:color="CBCBCB"/>
+              <w:right w:val="single" w:sz="4" w:space="0" w:color="CBCBCB"/>
+            </w:tcBorders>
+          </w:tcPr>
+          <w:p>
+            <w:r>
+              <w:rPr>
+                <w:sz w:val="20"/>
+              </w:rPr>
+              <w:t>Program.cs (MapDeviceEndpoints)</w:t>
+            </w:r>
+          </w:p>
+        </w:tc>
+        <w:tc>
+          <w:tcPr>
+            <w:tcW w:type="dxa" w:w="1938"/>
+            <w:tcBorders>
+              <w:top w:val="single" w:sz="4" w:space="0" w:color="CBCBCB"/>
+              <w:left w:val="single" w:sz="4" w:space="0" w:color="CBCBCB"/>
+              <w:bottom w:val="single" w:sz="4" w:space="0" w:color="CBCBCB"/>
+              <w:right w:val="single" w:sz="4" w:space="0" w:color="CBCBCB"/>
+            </w:tcBorders>
+          </w:tcPr>
+          <w:p>
+            <w:r>
+              <w:rPr>
+                <w:sz w:val="20"/>
+              </w:rPr>
+              <w:t>CONFIRMED</w:t>
+            </w:r>
+          </w:p>
+        </w:tc>
+        <w:tc>
+          <w:tcPr>
+            <w:tcW w:type="dxa" w:w="1938"/>
+            <w:tcBorders>
+              <w:top w:val="single" w:sz="4" w:space="0" w:color="CBCBCB"/>
+              <w:left w:val="single" w:sz="4" w:space="0" w:color="CBCBCB"/>
+              <w:bottom w:val="single" w:sz="4" w:space="0" w:color="CBCBCB"/>
+              <w:right w:val="single" w:sz="4" w:space="0" w:color="CBCBCB"/>
+            </w:tcBorders>
+          </w:tcPr>
+          <w:p>
+            <w:r>
+              <w:rPr>
+                <w:sz w:val="20"/>
+              </w:rPr>
+              <w:t>2026-08-10</w:t>
+            </w:r>
+          </w:p>
+        </w:tc>
+      </w:tr>
+      <w:tr>
+        <w:tc>
+          <w:tcPr>
+            <w:tcW w:type="dxa" w:w="1938"/>
+            <w:shd w:val="clear" w:color="auto" w:fill="B8B3D6"/>
+            <w:tcBorders>
+              <w:top w:val="single" w:sz="4" w:space="0" w:color="CBCBCB"/>
+              <w:left w:val="single" w:sz="4" w:space="0" w:color="CBCBCB"/>
+              <w:bottom w:val="single" w:sz="4" w:space="0" w:color="CBCBCB"/>
+              <w:right w:val="single" w:sz="4" w:space="0" w:color="CBCBCB"/>
+            </w:tcBorders>
+          </w:tcPr>
+          <w:p>
+            <w:r>
+              <w:rPr>
+                <w:rFonts w:ascii="Courier New" w:hAnsi="Courier New"/>
+                <w:color w:val="F05922"/>
+                <w:sz w:val="20"/>
+              </w:rPr>
+              <w:t>Endpoints/InstallEndpoints</w:t>
+            </w:r>
+          </w:p>
+        </w:tc>
+        <w:tc>
+          <w:tcPr>
+            <w:tcW w:type="dxa" w:w="1938"/>
+            <w:shd w:val="clear" w:color="auto" w:fill="B8B3D6"/>
+            <w:tcBorders>
+              <w:top w:val="single" w:sz="4" w:space="0" w:color="CBCBCB"/>
+              <w:left w:val="single" w:sz="4" w:space="0" w:color="CBCBCB"/>
+              <w:bottom w:val="single" w:sz="4" w:space="0" w:color="CBCBCB"/>
+              <w:right w:val="single" w:sz="4" w:space="0" w:color="CBCBCB"/>
+            </w:tcBorders>
+          </w:tcPr>
+          <w:p>
+            <w:r>
+              <w:rPr>
+                <w:sz w:val="20"/>
+              </w:rPr>
+              <w:t>DeviceState, DeviceRepository, InstallCoordinator</w:t>
+            </w:r>
+          </w:p>
+        </w:tc>
+        <w:tc>
+          <w:tcPr>
+            <w:tcW w:type="dxa" w:w="1938"/>
+            <w:shd w:val="clear" w:color="auto" w:fill="B8B3D6"/>
+            <w:tcBorders>
+              <w:top w:val="single" w:sz="4" w:space="0" w:color="CBCBCB"/>
+              <w:left w:val="single" w:sz="4" w:space="0" w:color="CBCBCB"/>
+              <w:bottom w:val="single" w:sz="4" w:space="0" w:color="CBCBCB"/>
+              <w:right w:val="single" w:sz="4" w:space="0" w:color="CBCBCB"/>
+            </w:tcBorders>
+          </w:tcPr>
+          <w:p>
+            <w:r>
+              <w:rPr>
+                <w:sz w:val="20"/>
+              </w:rPr>
+              <w:t>Program.cs (MapInstallEndpoints)</w:t>
+            </w:r>
+          </w:p>
+        </w:tc>
+        <w:tc>
+          <w:tcPr>
+            <w:tcW w:type="dxa" w:w="1938"/>
+            <w:shd w:val="clear" w:color="auto" w:fill="B8B3D6"/>
+            <w:tcBorders>
+              <w:top w:val="single" w:sz="4" w:space="0" w:color="CBCBCB"/>
+              <w:left w:val="single" w:sz="4" w:space="0" w:color="CBCBCB"/>
+              <w:bottom w:val="single" w:sz="4" w:space="0" w:color="CBCBCB"/>
+              <w:right w:val="single" w:sz="4" w:space="0" w:color="CBCBCB"/>
+            </w:tcBorders>
+          </w:tcPr>
+          <w:p>
+            <w:r>
+              <w:rPr>
+                <w:sz w:val="20"/>
+              </w:rPr>
+              <w:t>CONFIRMED</w:t>
+            </w:r>
+          </w:p>
+        </w:tc>
+        <w:tc>
+          <w:tcPr>
+            <w:tcW w:type="dxa" w:w="1938"/>
+            <w:shd w:val="clear" w:color="auto" w:fill="B8B3D6"/>
+            <w:tcBorders>
+              <w:top w:val="single" w:sz="4" w:space="0" w:color="CBCBCB"/>
+              <w:left w:val="single" w:sz="4" w:space="0" w:color="CBCBCB"/>
+              <w:bottom w:val="single" w:sz="4" w:space="0" w:color="CBCBCB"/>
+              <w:right w:val="single" w:sz="4" w:space="0" w:color="CBCBCB"/>
+            </w:tcBorders>
+          </w:tcPr>
+          <w:p>
+            <w:r>
+              <w:rPr>
+                <w:sz w:val="20"/>
+              </w:rPr>
+              <w:t>2026-08-10</w:t>
+            </w:r>
+          </w:p>
+        </w:tc>
+      </w:tr>
+      <w:tr>
+        <w:tc>
+          <w:tcPr>
+            <w:tcW w:type="dxa" w:w="1938"/>
+            <w:tcBorders>
+              <w:top w:val="single" w:sz="4" w:space="0" w:color="CBCBCB"/>
+              <w:left w:val="single" w:sz="4" w:space="0" w:color="CBCBCB"/>
+              <w:bottom w:val="single" w:sz="4" w:space="0" w:color="CBCBCB"/>
+              <w:right w:val="single" w:sz="4" w:space="0" w:color="CBCBCB"/>
+            </w:tcBorders>
+          </w:tcPr>
+          <w:p>
+            <w:r>
+              <w:rPr>
+                <w:rFonts w:ascii="Courier New" w:hAnsi="Courier New"/>
+                <w:color w:val="F05922"/>
+                <w:sz w:val="20"/>
+              </w:rPr>
+              <w:t>Endpoints/ScanEndpoints</w:t>
+            </w:r>
+          </w:p>
+        </w:tc>
+        <w:tc>
+          <w:tcPr>
+            <w:tcW w:type="dxa" w:w="1938"/>
+            <w:tcBorders>
+              <w:top w:val="single" w:sz="4" w:space="0" w:color="CBCBCB"/>
+              <w:left w:val="single" w:sz="4" w:space="0" w:color="CBCBCB"/>
+              <w:bottom w:val="single" w:sz="4" w:space="0" w:color="CBCBCB"/>
+              <w:right w:val="single" w:sz="4" w:space="0" w:color="CBCBCB"/>
+            </w:tcBorders>
+          </w:tcPr>
+          <w:p>
+            <w:r>
+              <w:rPr>
+                <w:sz w:val="20"/>
+              </w:rPr>
+              <w:t>ScanCoordinator</w:t>
+            </w:r>
+          </w:p>
+        </w:tc>
+        <w:tc>
+          <w:tcPr>
+            <w:tcW w:type="dxa" w:w="1938"/>
+            <w:tcBorders>
+              <w:top w:val="single" w:sz="4" w:space="0" w:color="CBCBCB"/>
+              <w:left w:val="single" w:sz="4" w:space="0" w:color="CBCBCB"/>
+              <w:bottom w:val="single" w:sz="4" w:space="0" w:color="CBCBCB"/>
+              <w:right w:val="single" w:sz="4" w:space="0" w:color="CBCBCB"/>
+            </w:tcBorders>
+          </w:tcPr>
+          <w:p>
+            <w:r>
+              <w:rPr>
+                <w:sz w:val="20"/>
+              </w:rPr>
+              <w:t>Program.cs (MapScanEndpoints)</w:t>
+            </w:r>
+          </w:p>
+        </w:tc>
+        <w:tc>
+          <w:tcPr>
+            <w:tcW w:type="dxa" w:w="1938"/>
+            <w:tcBorders>
+              <w:top w:val="single" w:sz="4" w:space="0" w:color="CBCBCB"/>
+              <w:left w:val="single" w:sz="4" w:space="0" w:color="CBCBCB"/>
+              <w:bottom w:val="single" w:sz="4" w:space="0" w:color="CBCBCB"/>
+              <w:right w:val="single" w:sz="4" w:space="0" w:color="CBCBCB"/>
+            </w:tcBorders>
+          </w:tcPr>
+          <w:p>
+            <w:r>
+              <w:rPr>
+                <w:sz w:val="20"/>
+              </w:rPr>
+              <w:t>CONFIRMED</w:t>
+            </w:r>
+          </w:p>
+        </w:tc>
+        <w:tc>
+          <w:tcPr>
+            <w:tcW w:type="dxa" w:w="1938"/>
+            <w:tcBorders>
+              <w:top w:val="single" w:sz="4" w:space="0" w:color="CBCBCB"/>
+              <w:left w:val="single" w:sz="4" w:space="0" w:color="CBCBCB"/>
+              <w:bottom w:val="single" w:sz="4" w:space="0" w:color="CBCBCB"/>
+              <w:right w:val="single" w:sz="4" w:space="0" w:color="CBCBCB"/>
+            </w:tcBorders>
+          </w:tcPr>
+          <w:p>
+            <w:r>
+              <w:rPr>
+                <w:sz w:val="20"/>
+              </w:rPr>
+              <w:t>2026-08-10</w:t>
+            </w:r>
+          </w:p>
+        </w:tc>
+      </w:tr>
+      <w:tr>
+        <w:tc>
+          <w:tcPr>
+            <w:tcW w:type="dxa" w:w="1938"/>
+            <w:shd w:val="clear" w:color="auto" w:fill="B8B3D6"/>
+            <w:tcBorders>
+              <w:top w:val="single" w:sz="4" w:space="0" w:color="CBCBCB"/>
+              <w:left w:val="single" w:sz="4" w:space="0" w:color="CBCBCB"/>
+              <w:bottom w:val="single" w:sz="4" w:space="0" w:color="CBCBCB"/>
+              <w:right w:val="single" w:sz="4" w:space="0" w:color="CBCBCB"/>
+            </w:tcBorders>
+          </w:tcPr>
+          <w:p>
+            <w:r>
+              <w:rPr>
+                <w:rFonts w:ascii="Courier New" w:hAnsi="Courier New"/>
+                <w:color w:val="F05922"/>
+                <w:sz w:val="20"/>
+              </w:rPr>
+              <w:t>Endpoints/ApkEndpoints</w:t>
+            </w:r>
+          </w:p>
+        </w:tc>
+        <w:tc>
+          <w:tcPr>
+            <w:tcW w:type="dxa" w:w="1938"/>
+            <w:shd w:val="clear" w:color="auto" w:fill="B8B3D6"/>
+            <w:tcBorders>
+              <w:top w:val="single" w:sz="4" w:space="0" w:color="CBCBCB"/>
+              <w:left w:val="single" w:sz="4" w:space="0" w:color="CBCBCB"/>
+              <w:bottom w:val="single" w:sz="4" w:space="0" w:color="CBCBCB"/>
+              <w:right w:val="single" w:sz="4" w:space="0" w:color="CBCBCB"/>
+            </w:tcBorders>
+          </w:tcPr>
+          <w:p>
+            <w:r>
+              <w:rPr>
+                <w:sz w:val="20"/>
+              </w:rPr>
+              <w:t>IOptions\&lt;AdbSettings\&gt;, ApkManifestReader, DeviceRepository</w:t>
+            </w:r>
+          </w:p>
+        </w:tc>
+        <w:tc>
+          <w:tcPr>
+            <w:tcW w:type="dxa" w:w="1938"/>
+            <w:shd w:val="clear" w:color="auto" w:fill="B8B3D6"/>
+            <w:tcBorders>
+              <w:top w:val="single" w:sz="4" w:space="0" w:color="CBCBCB"/>
+              <w:left w:val="single" w:sz="4" w:space="0" w:color="CBCBCB"/>
+              <w:bottom w:val="single" w:sz="4" w:space="0" w:color="CBCBCB"/>
+              <w:right w:val="single" w:sz="4" w:space="0" w:color="CBCBCB"/>
+            </w:tcBorders>
+          </w:tcPr>
+          <w:p>
+            <w:r>
+              <w:rPr>
+                <w:sz w:val="20"/>
+              </w:rPr>
+              <w:t>Program.cs (MapApkEndpoints)</w:t>
+            </w:r>
+          </w:p>
+        </w:tc>
+        <w:tc>
+          <w:tcPr>
+            <w:tcW w:type="dxa" w:w="1938"/>
+            <w:shd w:val="clear" w:color="auto" w:fill="B8B3D6"/>
+            <w:tcBorders>
+              <w:top w:val="single" w:sz="4" w:space="0" w:color="CBCBCB"/>
+              <w:left w:val="single" w:sz="4" w:space="0" w:color="CBCBCB"/>
+              <w:bottom w:val="single" w:sz="4" w:space="0" w:color="CBCBCB"/>
+              <w:right w:val="single" w:sz="4" w:space="0" w:color="CBCBCB"/>
+            </w:tcBorders>
+          </w:tcPr>
+          <w:p>
+            <w:r>
+              <w:rPr>
+                <w:sz w:val="20"/>
+              </w:rPr>
+              <w:t>CONFIRMED</w:t>
+            </w:r>
+          </w:p>
+        </w:tc>
+        <w:tc>
+          <w:tcPr>
+            <w:tcW w:type="dxa" w:w="1938"/>
+            <w:shd w:val="clear" w:color="auto" w:fill="B8B3D6"/>
+            <w:tcBorders>
+              <w:top w:val="single" w:sz="4" w:space="0" w:color="CBCBCB"/>
+              <w:left w:val="single" w:sz="4" w:space="0" w:color="CBCBCB"/>
+              <w:bottom w:val="single" w:sz="4" w:space="0" w:color="CBCBCB"/>
+              <w:right w:val="single" w:sz="4" w:space="0" w:color="CBCBCB"/>
+            </w:tcBorders>
+          </w:tcPr>
+          <w:p>
+            <w:r>
+              <w:rPr>
+                <w:sz w:val="20"/>
+              </w:rPr>
+              <w:t>2026-08-10</w:t>
+            </w:r>
+          </w:p>
+        </w:tc>
+      </w:tr>
+      <w:tr>
+        <w:tc>
+          <w:tcPr>
+            <w:tcW w:type="dxa" w:w="1938"/>
+            <w:tcBorders>
+              <w:top w:val="single" w:sz="4" w:space="0" w:color="CBCBCB"/>
+              <w:left w:val="single" w:sz="4" w:space="0" w:color="CBCBCB"/>
+              <w:bottom w:val="single" w:sz="4" w:space="0" w:color="CBCBCB"/>
+              <w:right w:val="single" w:sz="4" w:space="0" w:color="CBCBCB"/>
+            </w:tcBorders>
+          </w:tcPr>
+          <w:p>
+            <w:r>
+              <w:rPr>
+                <w:rFonts w:ascii="Courier New" w:hAnsi="Courier New"/>
+                <w:color w:val="F05922"/>
+                <w:sz w:val="20"/>
+              </w:rPr>
+              <w:t>Endpoints/HealthEndpoints</w:t>
+            </w:r>
+          </w:p>
+        </w:tc>
+        <w:tc>
+          <w:tcPr>
+            <w:tcW w:type="dxa" w:w="1938"/>
+            <w:tcBorders>
+              <w:top w:val="single" w:sz="4" w:space="0" w:color="CBCBCB"/>
+              <w:left w:val="single" w:sz="4" w:space="0" w:color="CBCBCB"/>
+              <w:bottom w:val="single" w:sz="4" w:space="0" w:color="CBCBCB"/>
+              <w:right w:val="single" w:sz="4" w:space="0" w:color="CBCBCB"/>
+            </w:tcBorders>
+          </w:tcPr>
+          <w:p>
+            <w:r>
+              <w:rPr>
+                <w:sz w:val="20"/>
+              </w:rPr>
+              <w:t>—</w:t>
+            </w:r>
+          </w:p>
+        </w:tc>
+        <w:tc>
+          <w:tcPr>
+            <w:tcW w:type="dxa" w:w="1938"/>
+            <w:tcBorders>
+              <w:top w:val="single" w:sz="4" w:space="0" w:color="CBCBCB"/>
+              <w:left w:val="single" w:sz="4" w:space="0" w:color="CBCBCB"/>
+              <w:bottom w:val="single" w:sz="4" w:space="0" w:color="CBCBCB"/>
+              <w:right w:val="single" w:sz="4" w:space="0" w:color="CBCBCB"/>
+            </w:tcBorders>
+          </w:tcPr>
+          <w:p>
+            <w:r>
+              <w:rPr>
+                <w:sz w:val="20"/>
+              </w:rPr>
+              <w:t>Program.cs (MapHealthEndpoints)</w:t>
+            </w:r>
+          </w:p>
+        </w:tc>
+        <w:tc>
+          <w:tcPr>
+            <w:tcW w:type="dxa" w:w="1938"/>
+            <w:tcBorders>
+              <w:top w:val="single" w:sz="4" w:space="0" w:color="CBCBCB"/>
+              <w:left w:val="single" w:sz="4" w:space="0" w:color="CBCBCB"/>
+              <w:bottom w:val="single" w:sz="4" w:space="0" w:color="CBCBCB"/>
+              <w:right w:val="single" w:sz="4" w:space="0" w:color="CBCBCB"/>
+            </w:tcBorders>
+          </w:tcPr>
+          <w:p>
+            <w:r>
+              <w:rPr>
+                <w:sz w:val="20"/>
+              </w:rPr>
+              <w:t>CONFIRMED</w:t>
+            </w:r>
+          </w:p>
+        </w:tc>
+        <w:tc>
+          <w:tcPr>
+            <w:tcW w:type="dxa" w:w="1938"/>
+            <w:tcBorders>
+              <w:top w:val="single" w:sz="4" w:space="0" w:color="CBCBCB"/>
+              <w:left w:val="single" w:sz="4" w:space="0" w:color="CBCBCB"/>
+              <w:bottom w:val="single" w:sz="4" w:space="0" w:color="CBCBCB"/>
+              <w:right w:val="single" w:sz="4" w:space="0" w:color="CBCBCB"/>
+            </w:tcBorders>
+          </w:tcPr>
+          <w:p>
+            <w:r>
+              <w:rPr>
+                <w:sz w:val="20"/>
+              </w:rPr>
+              <w:t>2026-08-10</w:t>
+            </w:r>
+          </w:p>
+        </w:tc>
+      </w:tr>
+      <w:tr>
+        <w:tc>
+          <w:tcPr>
+            <w:tcW w:type="dxa" w:w="1938"/>
+            <w:shd w:val="clear" w:color="auto" w:fill="B8B3D6"/>
+            <w:tcBorders>
+              <w:top w:val="single" w:sz="4" w:space="0" w:color="CBCBCB"/>
+              <w:left w:val="single" w:sz="4" w:space="0" w:color="CBCBCB"/>
+              <w:bottom w:val="single" w:sz="4" w:space="0" w:color="CBCBCB"/>
+              <w:right w:val="single" w:sz="4" w:space="0" w:color="CBCBCB"/>
+            </w:tcBorders>
+          </w:tcPr>
+          <w:p>
+            <w:r>
+              <w:rPr>
+                <w:rFonts w:ascii="Courier New" w:hAnsi="Courier New"/>
+                <w:color w:val="F05922"/>
+                <w:sz w:val="20"/>
+              </w:rPr>
+              <w:t>Pages/Index</w:t>
+            </w:r>
+          </w:p>
+        </w:tc>
+        <w:tc>
+          <w:tcPr>
+            <w:tcW w:type="dxa" w:w="1938"/>
+            <w:shd w:val="clear" w:color="auto" w:fill="B8B3D6"/>
+            <w:tcBorders>
+              <w:top w:val="single" w:sz="4" w:space="0" w:color="CBCBCB"/>
+              <w:left w:val="single" w:sz="4" w:space="0" w:color="CBCBCB"/>
+              <w:bottom w:val="single" w:sz="4" w:space="0" w:color="CBCBCB"/>
+              <w:right w:val="single" w:sz="4" w:space="0" w:color="CBCBCB"/>
+            </w:tcBorders>
+          </w:tcPr>
+          <w:p>
+            <w:r>
+              <w:rPr>
+                <w:sz w:val="20"/>
+              </w:rPr>
+              <w:t>IndexModel : PageModel</w:t>
+            </w:r>
+          </w:p>
+        </w:tc>
+        <w:tc>
+          <w:tcPr>
+            <w:tcW w:type="dxa" w:w="1938"/>
+            <w:shd w:val="clear" w:color="auto" w:fill="B8B3D6"/>
+            <w:tcBorders>
+              <w:top w:val="single" w:sz="4" w:space="0" w:color="CBCBCB"/>
+              <w:left w:val="single" w:sz="4" w:space="0" w:color="CBCBCB"/>
+              <w:bottom w:val="single" w:sz="4" w:space="0" w:color="CBCBCB"/>
+              <w:right w:val="single" w:sz="4" w:space="0" w:color="CBCBCB"/>
+            </w:tcBorders>
+          </w:tcPr>
+          <w:p>
+            <w:r>
+              <w:rPr>
+                <w:sz w:val="20"/>
+              </w:rPr>
+              <w:t>Router (/)</w:t>
+            </w:r>
+          </w:p>
+        </w:tc>
+        <w:tc>
+          <w:tcPr>
+            <w:tcW w:type="dxa" w:w="1938"/>
+            <w:shd w:val="clear" w:color="auto" w:fill="B8B3D6"/>
+            <w:tcBorders>
+              <w:top w:val="single" w:sz="4" w:space="0" w:color="CBCBCB"/>
+              <w:left w:val="single" w:sz="4" w:space="0" w:color="CBCBCB"/>
+              <w:bottom w:val="single" w:sz="4" w:space="0" w:color="CBCBCB"/>
+              <w:right w:val="single" w:sz="4" w:space="0" w:color="CBCBCB"/>
+            </w:tcBorders>
+          </w:tcPr>
+          <w:p>
+            <w:r>
+              <w:rPr>
+                <w:sz w:val="20"/>
+              </w:rPr>
+              <w:t>CONFIRMED</w:t>
+            </w:r>
+          </w:p>
+        </w:tc>
+        <w:tc>
+          <w:tcPr>
+            <w:tcW w:type="dxa" w:w="1938"/>
+            <w:shd w:val="clear" w:color="auto" w:fill="B8B3D6"/>
+            <w:tcBorders>
+              <w:top w:val="single" w:sz="4" w:space="0" w:color="CBCBCB"/>
+              <w:left w:val="single" w:sz="4" w:space="0" w:color="CBCBCB"/>
+              <w:bottom w:val="single" w:sz="4" w:space="0" w:color="CBCBCB"/>
+              <w:right w:val="single" w:sz="4" w:space="0" w:color="CBCBCB"/>
+            </w:tcBorders>
+          </w:tcPr>
+          <w:p>
+            <w:r>
+              <w:rPr>
+                <w:sz w:val="20"/>
+              </w:rPr>
+              <w:t>2026-08-10</w:t>
+            </w:r>
+          </w:p>
+        </w:tc>
+      </w:tr>
+      <w:tr>
+        <w:tc>
+          <w:tcPr>
+            <w:tcW w:type="dxa" w:w="1938"/>
+            <w:tcBorders>
+              <w:top w:val="single" w:sz="4" w:space="0" w:color="CBCBCB"/>
+              <w:left w:val="single" w:sz="4" w:space="0" w:color="CBCBCB"/>
+              <w:bottom w:val="single" w:sz="4" w:space="0" w:color="CBCBCB"/>
+              <w:right w:val="single" w:sz="4" w:space="0" w:color="CBCBCB"/>
+            </w:tcBorders>
+          </w:tcPr>
+          <w:p>
+            <w:r>
+              <w:rPr>
+                <w:rFonts w:ascii="Courier New" w:hAnsi="Courier New"/>
+                <w:color w:val="F05922"/>
+                <w:sz w:val="20"/>
+              </w:rPr>
+              <w:t>wwwroot/js/signalr-client.js</w:t>
+            </w:r>
+          </w:p>
+        </w:tc>
+        <w:tc>
+          <w:tcPr>
+            <w:tcW w:type="dxa" w:w="1938"/>
+            <w:tcBorders>
+              <w:top w:val="single" w:sz="4" w:space="0" w:color="CBCBCB"/>
+              <w:left w:val="single" w:sz="4" w:space="0" w:color="CBCBCB"/>
+              <w:bottom w:val="single" w:sz="4" w:space="0" w:color="CBCBCB"/>
+              <w:right w:val="single" w:sz="4" w:space="0" w:color="CBCBCB"/>
+            </w:tcBorders>
+          </w:tcPr>
+          <w:p>
+            <w:r>
+              <w:rPr>
+                <w:sz w:val="20"/>
+              </w:rPr>
+              <w:t>signalr.min.js (local lib)</w:t>
+            </w:r>
+          </w:p>
+        </w:tc>
+        <w:tc>
+          <w:tcPr>
+            <w:tcW w:type="dxa" w:w="1938"/>
+            <w:tcBorders>
+              <w:top w:val="single" w:sz="4" w:space="0" w:color="CBCBCB"/>
+              <w:left w:val="single" w:sz="4" w:space="0" w:color="CBCBCB"/>
+              <w:bottom w:val="single" w:sz="4" w:space="0" w:color="CBCBCB"/>
+              <w:right w:val="single" w:sz="4" w:space="0" w:color="CBCBCB"/>
+            </w:tcBorders>
+          </w:tcPr>
+          <w:p>
+            <w:r>
+              <w:rPr>
+                <w:sz w:val="20"/>
+              </w:rPr>
+              <w:t>_Layout.cshtml</w:t>
+            </w:r>
+          </w:p>
+        </w:tc>
+        <w:tc>
+          <w:tcPr>
+            <w:tcW w:type="dxa" w:w="1938"/>
+            <w:tcBorders>
+              <w:top w:val="single" w:sz="4" w:space="0" w:color="CBCBCB"/>
+              <w:left w:val="single" w:sz="4" w:space="0" w:color="CBCBCB"/>
+              <w:bottom w:val="single" w:sz="4" w:space="0" w:color="CBCBCB"/>
+              <w:right w:val="single" w:sz="4" w:space="0" w:color="CBCBCB"/>
+            </w:tcBorders>
+          </w:tcPr>
+          <w:p>
+            <w:r>
+              <w:rPr>
+                <w:sz w:val="20"/>
+              </w:rPr>
+              <w:t>CONFIRMED</w:t>
+            </w:r>
+          </w:p>
+        </w:tc>
+        <w:tc>
+          <w:tcPr>
+            <w:tcW w:type="dxa" w:w="1938"/>
+            <w:tcBorders>
+              <w:top w:val="single" w:sz="4" w:space="0" w:color="CBCBCB"/>
+              <w:left w:val="single" w:sz="4" w:space="0" w:color="CBCBCB"/>
+              <w:bottom w:val="single" w:sz="4" w:space="0" w:color="CBCBCB"/>
+              <w:right w:val="single" w:sz="4" w:space="0" w:color="CBCBCB"/>
+            </w:tcBorders>
+          </w:tcPr>
+          <w:p>
+            <w:r>
+              <w:rPr>
+                <w:sz w:val="20"/>
+              </w:rPr>
+              <w:t>2026-08-10</w:t>
+            </w:r>
+          </w:p>
+        </w:tc>
+      </w:tr>
+      <w:tr>
+        <w:tc>
+          <w:tcPr>
+            <w:tcW w:type="dxa" w:w="1938"/>
+            <w:shd w:val="clear" w:color="auto" w:fill="B8B3D6"/>
+            <w:tcBorders>
+              <w:top w:val="single" w:sz="4" w:space="0" w:color="CBCBCB"/>
+              <w:left w:val="single" w:sz="4" w:space="0" w:color="CBCBCB"/>
+              <w:bottom w:val="single" w:sz="4" w:space="0" w:color="CBCBCB"/>
+              <w:right w:val="single" w:sz="4" w:space="0" w:color="CBCBCB"/>
+            </w:tcBorders>
+          </w:tcPr>
+          <w:p>
+            <w:r>
+              <w:rPr>
+                <w:rFonts w:ascii="Courier New" w:hAnsi="Courier New"/>
+                <w:color w:val="F05922"/>
+                <w:sz w:val="20"/>
+              </w:rPr>
+              <w:t>wwwroot/js/dashboard.js</w:t>
+            </w:r>
+          </w:p>
+        </w:tc>
+        <w:tc>
+          <w:tcPr>
+            <w:tcW w:type="dxa" w:w="1938"/>
+            <w:shd w:val="clear" w:color="auto" w:fill="B8B3D6"/>
+            <w:tcBorders>
+              <w:top w:val="single" w:sz="4" w:space="0" w:color="CBCBCB"/>
+              <w:left w:val="single" w:sz="4" w:space="0" w:color="CBCBCB"/>
+              <w:bottom w:val="single" w:sz="4" w:space="0" w:color="CBCBCB"/>
+              <w:right w:val="single" w:sz="4" w:space="0" w:color="CBCBCB"/>
+            </w:tcBorders>
+          </w:tcPr>
+          <w:p>
+            <w:r>
+              <w:rPr>
+                <w:sz w:val="20"/>
+              </w:rPr>
+              <w:t>signalr-client.js, bootstrap.bundle.min.js (local)</w:t>
+            </w:r>
+          </w:p>
+        </w:tc>
+        <w:tc>
+          <w:tcPr>
+            <w:tcW w:type="dxa" w:w="1938"/>
+            <w:shd w:val="clear" w:color="auto" w:fill="B8B3D6"/>
+            <w:tcBorders>
+              <w:top w:val="single" w:sz="4" w:space="0" w:color="CBCBCB"/>
+              <w:left w:val="single" w:sz="4" w:space="0" w:color="CBCBCB"/>
+              <w:bottom w:val="single" w:sz="4" w:space="0" w:color="CBCBCB"/>
+              <w:right w:val="single" w:sz="4" w:space="0" w:color="CBCBCB"/>
+            </w:tcBorders>
+          </w:tcPr>
+          <w:p>
+            <w:r>
+              <w:rPr>
+                <w:sz w:val="20"/>
+              </w:rPr>
+              <w:t>_Layout.cshtml</w:t>
+            </w:r>
+          </w:p>
+        </w:tc>
+        <w:tc>
+          <w:tcPr>
+            <w:tcW w:type="dxa" w:w="1938"/>
+            <w:shd w:val="clear" w:color="auto" w:fill="B8B3D6"/>
+            <w:tcBorders>
+              <w:top w:val="single" w:sz="4" w:space="0" w:color="CBCBCB"/>
+              <w:left w:val="single" w:sz="4" w:space="0" w:color="CBCBCB"/>
+              <w:bottom w:val="single" w:sz="4" w:space="0" w:color="CBCBCB"/>
+              <w:right w:val="single" w:sz="4" w:space="0" w:color="CBCBCB"/>
+            </w:tcBorders>
+          </w:tcPr>
+          <w:p>
+            <w:r>
+              <w:rPr>
+                <w:sz w:val="20"/>
+              </w:rPr>
+              <w:t>CONFIRMED</w:t>
+            </w:r>
+          </w:p>
+        </w:tc>
+        <w:tc>
+          <w:tcPr>
+            <w:tcW w:type="dxa" w:w="1938"/>
+            <w:shd w:val="clear" w:color="auto" w:fill="B8B3D6"/>
+            <w:tcBorders>
+              <w:top w:val="single" w:sz="4" w:space="0" w:color="CBCBCB"/>
+              <w:left w:val="single" w:sz="4" w:space="0" w:color="CBCBCB"/>
+              <w:bottom w:val="single" w:sz="4" w:space="0" w:color="CBCBCB"/>
+              <w:right w:val="single" w:sz="4" w:space="0" w:color="CBCBCB"/>
+            </w:tcBorders>
+          </w:tcPr>
+          <w:p>
+            <w:r>
+              <w:rPr>
+                <w:sz w:val="20"/>
+              </w:rPr>
+              <w:t>2026-08-10</w:t>
+            </w:r>
+          </w:p>
+        </w:tc>
+      </w:tr>
+      <w:tr>
+        <w:tc>
+          <w:tcPr>
+            <w:tcW w:type="dxa" w:w="1938"/>
+            <w:tcBorders>
+              <w:top w:val="single" w:sz="4" w:space="0" w:color="CBCBCB"/>
+              <w:left w:val="single" w:sz="4" w:space="0" w:color="CBCBCB"/>
+              <w:bottom w:val="single" w:sz="4" w:space="0" w:color="CBCBCB"/>
+              <w:right w:val="single" w:sz="4" w:space="0" w:color="CBCBCB"/>
+            </w:tcBorders>
+          </w:tcPr>
+          <w:p>
+            <w:r>
+              <w:rPr>
+                <w:rFonts w:ascii="Courier New" w:hAnsi="Courier New"/>
+                <w:color w:val="F05922"/>
+                <w:sz w:val="20"/>
+              </w:rPr>
+              <w:t>wwwroot/js/scan-modal.js</w:t>
+            </w:r>
+          </w:p>
+        </w:tc>
+        <w:tc>
+          <w:tcPr>
+            <w:tcW w:type="dxa" w:w="1938"/>
+            <w:tcBorders>
+              <w:top w:val="single" w:sz="4" w:space="0" w:color="CBCBCB"/>
+              <w:left w:val="single" w:sz="4" w:space="0" w:color="CBCBCB"/>
+              <w:bottom w:val="single" w:sz="4" w:space="0" w:color="CBCBCB"/>
+              <w:right w:val="single" w:sz="4" w:space="0" w:color="CBCBCB"/>
+            </w:tcBorders>
+          </w:tcPr>
+          <w:p>
+            <w:r>
+              <w:rPr>
+                <w:sz w:val="20"/>
+              </w:rPr>
+              <w:t>signalr-client.js</w:t>
+            </w:r>
+          </w:p>
+        </w:tc>
+        <w:tc>
+          <w:tcPr>
+            <w:tcW w:type="dxa" w:w="1938"/>
+            <w:tcBorders>
+              <w:top w:val="single" w:sz="4" w:space="0" w:color="CBCBCB"/>
+              <w:left w:val="single" w:sz="4" w:space="0" w:color="CBCBCB"/>
+              <w:bottom w:val="single" w:sz="4" w:space="0" w:color="CBCBCB"/>
+              <w:right w:val="single" w:sz="4" w:space="0" w:color="CBCBCB"/>
+            </w:tcBorders>
+          </w:tcPr>
+          <w:p>
+            <w:r>
+              <w:rPr>
+                <w:sz w:val="20"/>
+              </w:rPr>
+              <w:t>_Layout.cshtml</w:t>
+            </w:r>
+          </w:p>
+        </w:tc>
+        <w:tc>
+          <w:tcPr>
+            <w:tcW w:type="dxa" w:w="1938"/>
+            <w:tcBorders>
+              <w:top w:val="single" w:sz="4" w:space="0" w:color="CBCBCB"/>
+              <w:left w:val="single" w:sz="4" w:space="0" w:color="CBCBCB"/>
+              <w:bottom w:val="single" w:sz="4" w:space="0" w:color="CBCBCB"/>
+              <w:right w:val="single" w:sz="4" w:space="0" w:color="CBCBCB"/>
+            </w:tcBorders>
+          </w:tcPr>
+          <w:p>
+            <w:r>
+              <w:rPr>
+                <w:sz w:val="20"/>
+              </w:rPr>
+              <w:t>CONFIRMED</w:t>
+            </w:r>
+          </w:p>
+        </w:tc>
+        <w:tc>
+          <w:tcPr>
+            <w:tcW w:type="dxa" w:w="1938"/>
+            <w:tcBorders>
+              <w:top w:val="single" w:sz="4" w:space="0" w:color="CBCBCB"/>
+              <w:left w:val="single" w:sz="4" w:space="0" w:color="CBCBCB"/>
+              <w:bottom w:val="single" w:sz="4" w:space="0" w:color="CBCBCB"/>
+              <w:right w:val="single" w:sz="4" w:space="0" w:color="CBCBCB"/>
+            </w:tcBorders>
+          </w:tcPr>
+          <w:p>
+            <w:r>
+              <w:rPr>
+                <w:sz w:val="20"/>
+              </w:rPr>
+              <w:t>2026-08-10</w:t>
             </w:r>
           </w:p>
         </w:tc>
@@ -2099,7 +3420,7 @@
           <w:color w:val="4A3F8C"/>
           <w:sz w:val="24"/>
         </w:rPr>
-        <w:t>2.3 API Endpoints (Phase 1 khung — Phase 2 sẽ bổ sung)</w:t>
+        <w:t>2.3 API Endpoints</w:t>
       </w:r>
     </w:p>
     <w:tbl>
@@ -2361,7 +3682,7 @@
               <w:rPr>
                 <w:sz w:val="20"/>
               </w:rPr>
-              <w:t>✅ Phase 1</w:t>
+              <w:t>✅</w:t>
             </w:r>
           </w:p>
         </w:tc>
@@ -2382,7 +3703,7 @@
               <w:rPr>
                 <w:sz w:val="20"/>
               </w:rPr>
-              <w:t>WS/GET</w:t>
+              <w:t>GET</w:t>
             </w:r>
           </w:p>
         </w:tc>
@@ -2403,7 +3724,7 @@
                 <w:color w:val="F05922"/>
                 <w:sz w:val="20"/>
               </w:rPr>
-              <w:t>/hubs/device/negotiate</w:t>
+              <w:t>/health</w:t>
             </w:r>
           </w:p>
         </w:tc>
@@ -2422,7 +3743,7 @@
               <w:rPr>
                 <w:sz w:val="20"/>
               </w:rPr>
-              <w:t>DeviceHub (SignalR)</w:t>
+              <w:t>HealthEndpoints</w:t>
             </w:r>
           </w:p>
         </w:tc>
@@ -2441,7 +3762,7 @@
               <w:rPr>
                 <w:sz w:val="20"/>
               </w:rPr>
-              <w:t>✅ Phase 1</w:t>
+              <w:t>✅</w:t>
             </w:r>
           </w:p>
         </w:tc>
@@ -2463,7 +3784,7 @@
               <w:rPr>
                 <w:sz w:val="20"/>
               </w:rPr>
-              <w:t>POST</w:t>
+              <w:t>WS/GET</w:t>
             </w:r>
           </w:p>
         </w:tc>
@@ -2485,7 +3806,7 @@
                 <w:color w:val="F05922"/>
                 <w:sz w:val="20"/>
               </w:rPr>
-              <w:t>/api/install</w:t>
+              <w:t>/hubs/device/negotiate</w:t>
             </w:r>
           </w:p>
         </w:tc>
@@ -2505,7 +3826,7 @@
               <w:rPr>
                 <w:sz w:val="20"/>
               </w:rPr>
-              <w:t>InstallCoordinator</w:t>
+              <w:t>DeviceHub (SignalR)</w:t>
             </w:r>
           </w:p>
         </w:tc>
@@ -2525,7 +3846,7 @@
               <w:rPr>
                 <w:sz w:val="20"/>
               </w:rPr>
-              <w:t>⬜ Phase 2 (STEP-2.2)</w:t>
+              <w:t>✅</w:t>
             </w:r>
           </w:p>
         </w:tc>
@@ -2567,7 +3888,7 @@
                 <w:color w:val="F05922"/>
                 <w:sz w:val="20"/>
               </w:rPr>
-              <w:t>/api/scan/start</w:t>
+              <w:t>/api/install</w:t>
             </w:r>
           </w:p>
         </w:tc>
@@ -2586,7 +3907,7 @@
               <w:rPr>
                 <w:sz w:val="20"/>
               </w:rPr>
-              <w:t>ScanCoordinator</w:t>
+              <w:t>InstallEndpoints → InstallCoordinator</w:t>
             </w:r>
           </w:p>
         </w:tc>
@@ -2605,7 +3926,7 @@
               <w:rPr>
                 <w:sz w:val="20"/>
               </w:rPr>
-              <w:t>⬜ Phase 2 (STEP-2.3)</w:t>
+              <w:t>✅</w:t>
             </w:r>
           </w:p>
         </w:tc>
@@ -2649,7 +3970,7 @@
                 <w:color w:val="F05922"/>
                 <w:sz w:val="20"/>
               </w:rPr>
-              <w:t>/api/scan/cancel</w:t>
+              <w:t>/api/scan/start</w:t>
             </w:r>
           </w:p>
         </w:tc>
@@ -2669,7 +3990,7 @@
               <w:rPr>
                 <w:sz w:val="20"/>
               </w:rPr>
-              <w:t>ScanCoordinator</w:t>
+              <w:t>ScanEndpoints → ScanCoordinator</w:t>
             </w:r>
           </w:p>
         </w:tc>
@@ -2689,7 +4010,7 @@
               <w:rPr>
                 <w:sz w:val="20"/>
               </w:rPr>
-              <w:t>⬜ Phase 2 (STEP-2.3)</w:t>
+              <w:t>✅</w:t>
             </w:r>
           </w:p>
         </w:tc>
@@ -2731,7 +4052,7 @@
                 <w:color w:val="F05922"/>
                 <w:sz w:val="20"/>
               </w:rPr>
-              <w:t>/api/apk/upload</w:t>
+              <w:t>/api/scan/cancel</w:t>
             </w:r>
           </w:p>
         </w:tc>
@@ -2750,7 +4071,7 @@
               <w:rPr>
                 <w:sz w:val="20"/>
               </w:rPr>
-              <w:t>APK handler</w:t>
+              <w:t>ScanEndpoints → ScanCoordinator</w:t>
             </w:r>
           </w:p>
         </w:tc>
@@ -2769,7 +4090,7 @@
               <w:rPr>
                 <w:sz w:val="20"/>
               </w:rPr>
-              <w:t>⬜ Phase 2 (STEP-2.4)</w:t>
+              <w:t>✅</w:t>
             </w:r>
           </w:p>
         </w:tc>
@@ -2791,7 +4112,7 @@
               <w:rPr>
                 <w:sz w:val="20"/>
               </w:rPr>
-              <w:t>DELETE</w:t>
+              <w:t>POST</w:t>
             </w:r>
           </w:p>
         </w:tc>
@@ -2813,7 +4134,7 @@
                 <w:color w:val="F05922"/>
                 <w:sz w:val="20"/>
               </w:rPr>
-              <w:t>/api/apk</w:t>
+              <w:t>/api/apk/upload</w:t>
             </w:r>
           </w:p>
         </w:tc>
@@ -2833,7 +4154,7 @@
               <w:rPr>
                 <w:sz w:val="20"/>
               </w:rPr>
-              <w:t>APK handler</w:t>
+              <w:t>ApkEndpoints</w:t>
             </w:r>
           </w:p>
         </w:tc>
@@ -2853,7 +4174,7 @@
               <w:rPr>
                 <w:sz w:val="20"/>
               </w:rPr>
-              <w:t>⬜ Phase 2 (STEP-2.4)</w:t>
+              <w:t>✅</w:t>
             </w:r>
           </w:p>
         </w:tc>
@@ -2874,7 +4195,7 @@
               <w:rPr>
                 <w:sz w:val="20"/>
               </w:rPr>
-              <w:t>POST</w:t>
+              <w:t>DELETE</w:t>
             </w:r>
           </w:p>
         </w:tc>
@@ -2895,7 +4216,7 @@
                 <w:color w:val="F05922"/>
                 <w:sz w:val="20"/>
               </w:rPr>
-              <w:t>/api/devices/connect</w:t>
+              <w:t>/api/apk</w:t>
             </w:r>
           </w:p>
         </w:tc>
@@ -2914,7 +4235,7 @@
               <w:rPr>
                 <w:sz w:val="20"/>
               </w:rPr>
-              <w:t>Device endpoint</w:t>
+              <w:t>ApkEndpoints</w:t>
             </w:r>
           </w:p>
         </w:tc>
@@ -2933,7 +4254,7 @@
               <w:rPr>
                 <w:sz w:val="20"/>
               </w:rPr>
-              <w:t>⬜ Phase 2 (STEP-2.5)</w:t>
+              <w:t>✅</w:t>
             </w:r>
           </w:p>
         </w:tc>
@@ -2977,7 +4298,7 @@
                 <w:color w:val="F05922"/>
                 <w:sz w:val="20"/>
               </w:rPr>
-              <w:t>/api/devices/connect-batch</w:t>
+              <w:t>/api/devices/connect</w:t>
             </w:r>
           </w:p>
         </w:tc>
@@ -2997,7 +4318,7 @@
               <w:rPr>
                 <w:sz w:val="20"/>
               </w:rPr>
-              <w:t>Device endpoint</w:t>
+              <w:t>DeviceEndpoints → AdbService + PollControlService</w:t>
             </w:r>
           </w:p>
         </w:tc>
@@ -3017,7 +4338,7 @@
               <w:rPr>
                 <w:sz w:val="20"/>
               </w:rPr>
-              <w:t>⬜ Phase 2 (STEP-2.5)</w:t>
+              <w:t>✅</w:t>
             </w:r>
           </w:p>
         </w:tc>
@@ -3059,7 +4380,7 @@
                 <w:color w:val="F05922"/>
                 <w:sz w:val="20"/>
               </w:rPr>
-              <w:t>/api/devices/remove</w:t>
+              <w:t>/api/devices/connect-batch</w:t>
             </w:r>
           </w:p>
         </w:tc>
@@ -3078,7 +4399,7 @@
               <w:rPr>
                 <w:sz w:val="20"/>
               </w:rPr>
-              <w:t>Device endpoint</w:t>
+              <w:t>DeviceEndpoints → AdbService + PollControlService</w:t>
             </w:r>
           </w:p>
         </w:tc>
@@ -3097,7 +4418,7 @@
               <w:rPr>
                 <w:sz w:val="20"/>
               </w:rPr>
-              <w:t>⬜ Phase 2 (STEP-2.5)</w:t>
+              <w:t>✅</w:t>
             </w:r>
           </w:p>
         </w:tc>
@@ -3119,7 +4440,7 @@
               <w:rPr>
                 <w:sz w:val="20"/>
               </w:rPr>
-              <w:t>GET</w:t>
+              <w:t>POST</w:t>
             </w:r>
           </w:p>
         </w:tc>
@@ -3141,7 +4462,7 @@
                 <w:color w:val="F05922"/>
                 <w:sz w:val="20"/>
               </w:rPr>
-              <w:t>/api/devices</w:t>
+              <w:t>/api/devices/remove</w:t>
             </w:r>
           </w:p>
         </w:tc>
@@ -3161,7 +4482,20 @@
               <w:rPr>
                 <w:sz w:val="20"/>
               </w:rPr>
-              <w:t>Device endpoint</w:t>
+              <w:t xml:space="preserve">DeviceEndpoints → </w:t>
+            </w:r>
+            <w:r>
+              <w:rPr>
+                <w:b/>
+                <w:sz w:val="20"/>
+              </w:rPr>
+              <w:t>DeviceState</w:t>
+            </w:r>
+            <w:r>
+              <w:rPr>
+                <w:sz w:val="20"/>
+              </w:rPr>
+              <w:t xml:space="preserve"> + DeviceRepository</w:t>
             </w:r>
           </w:p>
         </w:tc>
@@ -3181,7 +4515,7 @@
               <w:rPr>
                 <w:sz w:val="20"/>
               </w:rPr>
-              <w:t>⬜ Phase 2 (STEP-2.5)</w:t>
+              <w:t>✅ Bug R9 fixed 2026-08-10</w:t>
             </w:r>
           </w:p>
         </w:tc>
@@ -3202,7 +4536,7 @@
               <w:rPr>
                 <w:sz w:val="20"/>
               </w:rPr>
-              <w:t>POST</w:t>
+              <w:t>GET</w:t>
             </w:r>
           </w:p>
         </w:tc>
@@ -3223,7 +4557,7 @@
                 <w:color w:val="F05922"/>
                 <w:sz w:val="20"/>
               </w:rPr>
-              <w:t>/api/settings/package</w:t>
+              <w:t>/api/devices</w:t>
             </w:r>
           </w:p>
         </w:tc>
@@ -3242,7 +4576,7 @@
               <w:rPr>
                 <w:sz w:val="20"/>
               </w:rPr>
-              <w:t>Settings endpoint</w:t>
+              <w:t>DeviceEndpoints → DeviceRepository</w:t>
             </w:r>
           </w:p>
         </w:tc>
@@ -3261,7 +4595,7 @@
               <w:rPr>
                 <w:sz w:val="20"/>
               </w:rPr>
-              <w:t>⬜ Phase 2 (STEP-2.5)</w:t>
+              <w:t>✅</w:t>
             </w:r>
           </w:p>
         </w:tc>
@@ -3305,7 +4639,7 @@
                 <w:color w:val="F05922"/>
                 <w:sz w:val="20"/>
               </w:rPr>
-              <w:t>/api/polling/toggle</w:t>
+              <w:t>/api/settings/package</w:t>
             </w:r>
           </w:p>
         </w:tc>
@@ -3325,7 +4659,7 @@
               <w:rPr>
                 <w:sz w:val="20"/>
               </w:rPr>
-              <w:t>Polling endpoint</w:t>
+              <w:t>DeviceEndpoints → DeviceRepository</w:t>
             </w:r>
           </w:p>
         </w:tc>
@@ -3345,7 +4679,171 @@
               <w:rPr>
                 <w:sz w:val="20"/>
               </w:rPr>
-              <w:t>⬜ Phase 2 (STEP-2.5)</w:t>
+              <w:t>✅</w:t>
+            </w:r>
+          </w:p>
+        </w:tc>
+      </w:tr>
+      <w:tr>
+        <w:tc>
+          <w:tcPr>
+            <w:tcW w:type="dxa" w:w="2422"/>
+            <w:tcBorders>
+              <w:top w:val="single" w:sz="4" w:space="0" w:color="CBCBCB"/>
+              <w:left w:val="single" w:sz="4" w:space="0" w:color="CBCBCB"/>
+              <w:bottom w:val="single" w:sz="4" w:space="0" w:color="CBCBCB"/>
+              <w:right w:val="single" w:sz="4" w:space="0" w:color="CBCBCB"/>
+            </w:tcBorders>
+          </w:tcPr>
+          <w:p>
+            <w:r>
+              <w:rPr>
+                <w:sz w:val="20"/>
+              </w:rPr>
+              <w:t>POST</w:t>
+            </w:r>
+          </w:p>
+        </w:tc>
+        <w:tc>
+          <w:tcPr>
+            <w:tcW w:type="dxa" w:w="2422"/>
+            <w:tcBorders>
+              <w:top w:val="single" w:sz="4" w:space="0" w:color="CBCBCB"/>
+              <w:left w:val="single" w:sz="4" w:space="0" w:color="CBCBCB"/>
+              <w:bottom w:val="single" w:sz="4" w:space="0" w:color="CBCBCB"/>
+              <w:right w:val="single" w:sz="4" w:space="0" w:color="CBCBCB"/>
+            </w:tcBorders>
+          </w:tcPr>
+          <w:p>
+            <w:r>
+              <w:rPr>
+                <w:rFonts w:ascii="Courier New" w:hAnsi="Courier New"/>
+                <w:color w:val="F05922"/>
+                <w:sz w:val="20"/>
+              </w:rPr>
+              <w:t>/api/polling/toggle</w:t>
+            </w:r>
+          </w:p>
+        </w:tc>
+        <w:tc>
+          <w:tcPr>
+            <w:tcW w:type="dxa" w:w="2422"/>
+            <w:tcBorders>
+              <w:top w:val="single" w:sz="4" w:space="0" w:color="CBCBCB"/>
+              <w:left w:val="single" w:sz="4" w:space="0" w:color="CBCBCB"/>
+              <w:bottom w:val="single" w:sz="4" w:space="0" w:color="CBCBCB"/>
+              <w:right w:val="single" w:sz="4" w:space="0" w:color="CBCBCB"/>
+            </w:tcBorders>
+          </w:tcPr>
+          <w:p>
+            <w:r>
+              <w:rPr>
+                <w:sz w:val="20"/>
+              </w:rPr>
+              <w:t>DeviceEndpoints → PollControlService + DeviceRepository</w:t>
+            </w:r>
+          </w:p>
+        </w:tc>
+        <w:tc>
+          <w:tcPr>
+            <w:tcW w:type="dxa" w:w="2422"/>
+            <w:tcBorders>
+              <w:top w:val="single" w:sz="4" w:space="0" w:color="CBCBCB"/>
+              <w:left w:val="single" w:sz="4" w:space="0" w:color="CBCBCB"/>
+              <w:bottom w:val="single" w:sz="4" w:space="0" w:color="CBCBCB"/>
+              <w:right w:val="single" w:sz="4" w:space="0" w:color="CBCBCB"/>
+            </w:tcBorders>
+          </w:tcPr>
+          <w:p>
+            <w:r>
+              <w:rPr>
+                <w:sz w:val="20"/>
+              </w:rPr>
+              <w:t>✅</w:t>
+            </w:r>
+          </w:p>
+        </w:tc>
+      </w:tr>
+      <w:tr>
+        <w:tc>
+          <w:tcPr>
+            <w:tcW w:type="dxa" w:w="2422"/>
+            <w:shd w:val="clear" w:color="auto" w:fill="B8B3D6"/>
+            <w:tcBorders>
+              <w:top w:val="single" w:sz="4" w:space="0" w:color="CBCBCB"/>
+              <w:left w:val="single" w:sz="4" w:space="0" w:color="CBCBCB"/>
+              <w:bottom w:val="single" w:sz="4" w:space="0" w:color="CBCBCB"/>
+              <w:right w:val="single" w:sz="4" w:space="0" w:color="CBCBCB"/>
+            </w:tcBorders>
+          </w:tcPr>
+          <w:p>
+            <w:r>
+              <w:rPr>
+                <w:sz w:val="20"/>
+              </w:rPr>
+              <w:t>POST</w:t>
+            </w:r>
+          </w:p>
+        </w:tc>
+        <w:tc>
+          <w:tcPr>
+            <w:tcW w:type="dxa" w:w="2422"/>
+            <w:shd w:val="clear" w:color="auto" w:fill="B8B3D6"/>
+            <w:tcBorders>
+              <w:top w:val="single" w:sz="4" w:space="0" w:color="CBCBCB"/>
+              <w:left w:val="single" w:sz="4" w:space="0" w:color="CBCBCB"/>
+              <w:bottom w:val="single" w:sz="4" w:space="0" w:color="CBCBCB"/>
+              <w:right w:val="single" w:sz="4" w:space="0" w:color="CBCBCB"/>
+            </w:tcBorders>
+          </w:tcPr>
+          <w:p>
+            <w:r>
+              <w:rPr>
+                <w:rFonts w:ascii="Courier New" w:hAnsi="Courier New"/>
+                <w:color w:val="F05922"/>
+                <w:sz w:val="20"/>
+              </w:rPr>
+              <w:t>/api/devices/poll</w:t>
+            </w:r>
+          </w:p>
+        </w:tc>
+        <w:tc>
+          <w:tcPr>
+            <w:tcW w:type="dxa" w:w="2422"/>
+            <w:shd w:val="clear" w:color="auto" w:fill="B8B3D6"/>
+            <w:tcBorders>
+              <w:top w:val="single" w:sz="4" w:space="0" w:color="CBCBCB"/>
+              <w:left w:val="single" w:sz="4" w:space="0" w:color="CBCBCB"/>
+              <w:bottom w:val="single" w:sz="4" w:space="0" w:color="CBCBCB"/>
+              <w:right w:val="single" w:sz="4" w:space="0" w:color="CBCBCB"/>
+            </w:tcBorders>
+          </w:tcPr>
+          <w:p>
+            <w:r>
+              <w:rPr>
+                <w:sz w:val="20"/>
+              </w:rPr>
+              <w:t>DeviceEndpoints → PollControlService.TriggerAsync</w:t>
+            </w:r>
+          </w:p>
+        </w:tc>
+        <w:tc>
+          <w:tcPr>
+            <w:tcW w:type="dxa" w:w="2422"/>
+            <w:shd w:val="clear" w:color="auto" w:fill="B8B3D6"/>
+            <w:tcBorders>
+              <w:top w:val="single" w:sz="4" w:space="0" w:color="CBCBCB"/>
+              <w:left w:val="single" w:sz="4" w:space="0" w:color="CBCBCB"/>
+              <w:bottom w:val="single" w:sz="4" w:space="0" w:color="CBCBCB"/>
+              <w:right w:val="single" w:sz="4" w:space="0" w:color="CBCBCB"/>
+            </w:tcBorders>
+          </w:tcPr>
+          <w:p>
+            <w:r>
+              <w:rPr>
+                <w:sz w:val="20"/>
+              </w:rPr>
+              <w:t>✅</w:t>
             </w:r>
           </w:p>
         </w:tc>
@@ -3606,7 +5104,7 @@
               <w:rPr>
                 <w:sz w:val="20"/>
               </w:rPr>
-              <w:t>DevicePollWorker</w:t>
+              <w:t>DevicePollWorker (mỗi 3s)</w:t>
             </w:r>
           </w:p>
         </w:tc>
@@ -3626,7 +5124,7 @@
               <w:rPr>
                 <w:sz w:val="20"/>
               </w:rPr>
-              <w:t>⬜ Phase 2 (STEP-2.1)</w:t>
+              <w:t>✅</w:t>
             </w:r>
           </w:p>
         </w:tc>
@@ -3670,7 +5168,7 @@
                 <w:color w:val="F05922"/>
                 <w:sz w:val="20"/>
               </w:rPr>
-              <w:t>serial, percent, message</w:t>
+              <w:t>string serial, int percent, string message</w:t>
             </w:r>
           </w:p>
         </w:tc>
@@ -3708,7 +5206,7 @@
               <w:rPr>
                 <w:sz w:val="20"/>
               </w:rPr>
-              <w:t>⬜ Phase 2 (STEP-2.2)</w:t>
+              <w:t>✅</w:t>
             </w:r>
           </w:p>
         </w:tc>
@@ -3754,7 +5252,7 @@
                 <w:color w:val="F05922"/>
                 <w:sz w:val="20"/>
               </w:rPr>
-              <w:t>serial, success, version</w:t>
+              <w:t>string serial, bool success, string version</w:t>
             </w:r>
           </w:p>
         </w:tc>
@@ -3794,7 +5292,7 @@
               <w:rPr>
                 <w:sz w:val="20"/>
               </w:rPr>
-              <w:t>⬜ Phase 2 (STEP-2.2)</w:t>
+              <w:t>✅</w:t>
             </w:r>
           </w:p>
         </w:tc>
@@ -3838,7 +5336,7 @@
                 <w:color w:val="F05922"/>
                 <w:sz w:val="20"/>
               </w:rPr>
-              <w:t>found, scanned, total</w:t>
+              <w:t>int found, int scanned, int total</w:t>
             </w:r>
           </w:p>
         </w:tc>
@@ -3876,7 +5374,7 @@
               <w:rPr>
                 <w:sz w:val="20"/>
               </w:rPr>
-              <w:t>⬜ Phase 2 (STEP-2.3)</w:t>
+              <w:t>✅</w:t>
             </w:r>
           </w:p>
         </w:tc>
@@ -3922,7 +5420,7 @@
                 <w:color w:val="F05922"/>
                 <w:sz w:val="20"/>
               </w:rPr>
-              <w:t>ipPort</w:t>
+              <w:t>string ipPort</w:t>
             </w:r>
           </w:p>
         </w:tc>
@@ -3962,7 +5460,89 @@
               <w:rPr>
                 <w:sz w:val="20"/>
               </w:rPr>
-              <w:t>⬜ Phase 2 (STEP-2.3)</w:t>
+              <w:t>✅</w:t>
+            </w:r>
+          </w:p>
+        </w:tc>
+      </w:tr>
+      <w:tr>
+        <w:tc>
+          <w:tcPr>
+            <w:tcW w:type="dxa" w:w="2422"/>
+            <w:tcBorders>
+              <w:top w:val="single" w:sz="4" w:space="0" w:color="CBCBCB"/>
+              <w:left w:val="single" w:sz="4" w:space="0" w:color="CBCBCB"/>
+              <w:bottom w:val="single" w:sz="4" w:space="0" w:color="CBCBCB"/>
+              <w:right w:val="single" w:sz="4" w:space="0" w:color="CBCBCB"/>
+            </w:tcBorders>
+          </w:tcPr>
+          <w:p>
+            <w:r>
+              <w:rPr>
+                <w:rFonts w:ascii="Courier New" w:hAnsi="Courier New"/>
+                <w:color w:val="F05922"/>
+                <w:sz w:val="20"/>
+              </w:rPr>
+              <w:t>ScanCompleted</w:t>
+            </w:r>
+          </w:p>
+        </w:tc>
+        <w:tc>
+          <w:tcPr>
+            <w:tcW w:type="dxa" w:w="2422"/>
+            <w:tcBorders>
+              <w:top w:val="single" w:sz="4" w:space="0" w:color="CBCBCB"/>
+              <w:left w:val="single" w:sz="4" w:space="0" w:color="CBCBCB"/>
+              <w:bottom w:val="single" w:sz="4" w:space="0" w:color="CBCBCB"/>
+              <w:right w:val="single" w:sz="4" w:space="0" w:color="CBCBCB"/>
+            </w:tcBorders>
+          </w:tcPr>
+          <w:p>
+            <w:r>
+              <w:rPr>
+                <w:rFonts w:ascii="Courier New" w:hAnsi="Courier New"/>
+                <w:color w:val="F05922"/>
+                <w:sz w:val="20"/>
+              </w:rPr>
+              <w:t>int total, int found</w:t>
+            </w:r>
+          </w:p>
+        </w:tc>
+        <w:tc>
+          <w:tcPr>
+            <w:tcW w:type="dxa" w:w="2422"/>
+            <w:tcBorders>
+              <w:top w:val="single" w:sz="4" w:space="0" w:color="CBCBCB"/>
+              <w:left w:val="single" w:sz="4" w:space="0" w:color="CBCBCB"/>
+              <w:bottom w:val="single" w:sz="4" w:space="0" w:color="CBCBCB"/>
+              <w:right w:val="single" w:sz="4" w:space="0" w:color="CBCBCB"/>
+            </w:tcBorders>
+          </w:tcPr>
+          <w:p>
+            <w:r>
+              <w:rPr>
+                <w:sz w:val="20"/>
+              </w:rPr>
+              <w:t>ScanCoordinator</w:t>
+            </w:r>
+          </w:p>
+        </w:tc>
+        <w:tc>
+          <w:tcPr>
+            <w:tcW w:type="dxa" w:w="2422"/>
+            <w:tcBorders>
+              <w:top w:val="single" w:sz="4" w:space="0" w:color="CBCBCB"/>
+              <w:left w:val="single" w:sz="4" w:space="0" w:color="CBCBCB"/>
+              <w:bottom w:val="single" w:sz="4" w:space="0" w:color="CBCBCB"/>
+              <w:right w:val="single" w:sz="4" w:space="0" w:color="CBCBCB"/>
+            </w:tcBorders>
+          </w:tcPr>
+          <w:p>
+            <w:r>
+              <w:rPr>
+                <w:sz w:val="20"/>
+              </w:rPr>
+              <w:t>✅</w:t>
             </w:r>
           </w:p>
         </w:tc>
@@ -4938,7 +6518,7 @@
               <w:rPr>
                 <w:sz w:val="20"/>
               </w:rPr>
-              <w:t>Tạo mới toàn bộ project (Phase 1 — STEP 1.1–1.3)</w:t>
+              <w:t>Tạo mới toàn bộ project (Phase 1–3)</w:t>
             </w:r>
           </w:p>
         </w:tc>
@@ -5064,6 +6644,201 @@
                 <w:sz w:val="20"/>
               </w:rPr>
               <w:t>Thêm 2 project mới vào solution</w:t>
+            </w:r>
+          </w:p>
+        </w:tc>
+      </w:tr>
+      <w:tr>
+        <w:tc>
+          <w:tcPr>
+            <w:tcW w:type="dxa" w:w="3230"/>
+            <w:tcBorders>
+              <w:top w:val="single" w:sz="4" w:space="0" w:color="CBCBCB"/>
+              <w:left w:val="single" w:sz="4" w:space="0" w:color="CBCBCB"/>
+              <w:bottom w:val="single" w:sz="4" w:space="0" w:color="CBCBCB"/>
+              <w:right w:val="single" w:sz="4" w:space="0" w:color="CBCBCB"/>
+            </w:tcBorders>
+          </w:tcPr>
+          <w:p>
+            <w:r>
+              <w:rPr>
+                <w:sz w:val="20"/>
+              </w:rPr>
+              <w:t>2026-08-10</w:t>
+            </w:r>
+          </w:p>
+        </w:tc>
+        <w:tc>
+          <w:tcPr>
+            <w:tcW w:type="dxa" w:w="3230"/>
+            <w:tcBorders>
+              <w:top w:val="single" w:sz="4" w:space="0" w:color="CBCBCB"/>
+              <w:left w:val="single" w:sz="4" w:space="0" w:color="CBCBCB"/>
+              <w:bottom w:val="single" w:sz="4" w:space="0" w:color="CBCBCB"/>
+              <w:right w:val="single" w:sz="4" w:space="0" w:color="CBCBCB"/>
+            </w:tcBorders>
+          </w:tcPr>
+          <w:p>
+            <w:r>
+              <w:rPr>
+                <w:rFonts w:ascii="Courier New" w:hAnsi="Courier New"/>
+                <w:color w:val="F05922"/>
+                <w:sz w:val="20"/>
+              </w:rPr>
+              <w:t>State/DeviceState.cs</w:t>
+            </w:r>
+          </w:p>
+        </w:tc>
+        <w:tc>
+          <w:tcPr>
+            <w:tcW w:type="dxa" w:w="3230"/>
+            <w:tcBorders>
+              <w:top w:val="single" w:sz="4" w:space="0" w:color="CBCBCB"/>
+              <w:left w:val="single" w:sz="4" w:space="0" w:color="CBCBCB"/>
+              <w:bottom w:val="single" w:sz="4" w:space="0" w:color="CBCBCB"/>
+              <w:right w:val="single" w:sz="4" w:space="0" w:color="CBCBCB"/>
+            </w:tcBorders>
+          </w:tcPr>
+          <w:p>
+            <w:r>
+              <w:rPr>
+                <w:sz w:val="20"/>
+              </w:rPr>
+              <w:t xml:space="preserve">Thêm method </w:t>
+            </w:r>
+            <w:r>
+              <w:rPr>
+                <w:rFonts w:ascii="Courier New" w:hAnsi="Courier New"/>
+                <w:color w:val="F05922"/>
+                <w:sz w:val="20"/>
+              </w:rPr>
+              <w:t>Remove(string serial)</w:t>
+            </w:r>
+            <w:r>
+              <w:rPr>
+                <w:sz w:val="20"/>
+              </w:rPr>
+              <w:t xml:space="preserve"> — fix bug R9: thiết bị không biến mất sau khi xóa</w:t>
+            </w:r>
+          </w:p>
+        </w:tc>
+      </w:tr>
+      <w:tr>
+        <w:tc>
+          <w:tcPr>
+            <w:tcW w:type="dxa" w:w="3230"/>
+            <w:shd w:val="clear" w:color="auto" w:fill="B8B3D6"/>
+            <w:tcBorders>
+              <w:top w:val="single" w:sz="4" w:space="0" w:color="CBCBCB"/>
+              <w:left w:val="single" w:sz="4" w:space="0" w:color="CBCBCB"/>
+              <w:bottom w:val="single" w:sz="4" w:space="0" w:color="CBCBCB"/>
+              <w:right w:val="single" w:sz="4" w:space="0" w:color="CBCBCB"/>
+            </w:tcBorders>
+          </w:tcPr>
+          <w:p>
+            <w:r>
+              <w:rPr>
+                <w:sz w:val="20"/>
+              </w:rPr>
+              <w:t>2026-08-10</w:t>
+            </w:r>
+          </w:p>
+        </w:tc>
+        <w:tc>
+          <w:tcPr>
+            <w:tcW w:type="dxa" w:w="3230"/>
+            <w:shd w:val="clear" w:color="auto" w:fill="B8B3D6"/>
+            <w:tcBorders>
+              <w:top w:val="single" w:sz="4" w:space="0" w:color="CBCBCB"/>
+              <w:left w:val="single" w:sz="4" w:space="0" w:color="CBCBCB"/>
+              <w:bottom w:val="single" w:sz="4" w:space="0" w:color="CBCBCB"/>
+              <w:right w:val="single" w:sz="4" w:space="0" w:color="CBCBCB"/>
+            </w:tcBorders>
+          </w:tcPr>
+          <w:p>
+            <w:r>
+              <w:rPr>
+                <w:rFonts w:ascii="Courier New" w:hAnsi="Courier New"/>
+                <w:color w:val="F05922"/>
+                <w:sz w:val="20"/>
+              </w:rPr>
+              <w:t>Endpoints/DeviceEndpoints.cs</w:t>
+            </w:r>
+          </w:p>
+        </w:tc>
+        <w:tc>
+          <w:tcPr>
+            <w:tcW w:type="dxa" w:w="3230"/>
+            <w:shd w:val="clear" w:color="auto" w:fill="B8B3D6"/>
+            <w:tcBorders>
+              <w:top w:val="single" w:sz="4" w:space="0" w:color="CBCBCB"/>
+              <w:left w:val="single" w:sz="4" w:space="0" w:color="CBCBCB"/>
+              <w:bottom w:val="single" w:sz="4" w:space="0" w:color="CBCBCB"/>
+              <w:right w:val="single" w:sz="4" w:space="0" w:color="CBCBCB"/>
+            </w:tcBorders>
+          </w:tcPr>
+          <w:p>
+            <w:r>
+              <w:rPr>
+                <w:sz w:val="20"/>
+              </w:rPr>
+              <w:t xml:space="preserve">Handler </w:t>
+            </w:r>
+            <w:r>
+              <w:rPr>
+                <w:rFonts w:ascii="Courier New" w:hAnsi="Courier New"/>
+                <w:color w:val="F05922"/>
+                <w:sz w:val="20"/>
+              </w:rPr>
+              <w:t>/api/devices/remove</w:t>
+            </w:r>
+            <w:r>
+              <w:rPr>
+                <w:sz w:val="20"/>
+              </w:rPr>
+              <w:t xml:space="preserve"> nhận thêm </w:t>
+            </w:r>
+            <w:r>
+              <w:rPr>
+                <w:rFonts w:ascii="Courier New" w:hAnsi="Courier New"/>
+                <w:color w:val="F05922"/>
+                <w:sz w:val="20"/>
+              </w:rPr>
+              <w:t>DeviceState</w:t>
+            </w:r>
+            <w:r>
+              <w:rPr>
+                <w:sz w:val="20"/>
+              </w:rPr>
+              <w:t xml:space="preserve"> qua DI, gọi </w:t>
+            </w:r>
+            <w:r>
+              <w:rPr>
+                <w:rFonts w:ascii="Courier New" w:hAnsi="Courier New"/>
+                <w:color w:val="F05922"/>
+                <w:sz w:val="20"/>
+              </w:rPr>
+              <w:t>deviceState.Remove()</w:t>
+            </w:r>
+            <w:r>
+              <w:rPr>
+                <w:sz w:val="20"/>
+              </w:rPr>
+              <w:t xml:space="preserve"> trước </w:t>
+            </w:r>
+            <w:r>
+              <w:rPr>
+                <w:rFonts w:ascii="Courier New" w:hAnsi="Courier New"/>
+                <w:color w:val="F05922"/>
+                <w:sz w:val="20"/>
+              </w:rPr>
+              <w:t>repo.Remove()</w:t>
+            </w:r>
+            <w:r>
+              <w:rPr>
+                <w:sz w:val="20"/>
+              </w:rPr>
+              <w:t xml:space="preserve"> — parity WinForms MainForm.cs:572-577</w:t>
             </w:r>
           </w:p>
         </w:tc>

</xml_diff>

<commit_message>
[adb-add-device-api] Bước 3.1: Code 2 endpoint connect-by-ip + check-status
- Tạo DeviceConnectionEndpoints.cs: POST /api/devices/connect-by-ip (validate ip/port, gọi AdbService.ConnectAsync, trigger PollControlService, trả serial=ip:port) + GET /api/devices/{serial}/status (đọc DeviceState.TryGet, trả 404 nếu không tìm thấy)
- Cả 2 endpoint gắn ApiKeyEndpointFilter (tái dùng LaunchApp:ApiKey)
- Đăng ký MapDeviceConnectionEndpoints() trong Program.cs
- Tạo DeviceConnectionEndpointTests.cs: 22 unit test PASS (validate ip/port, CheckStatus logic, target build)
- Cập nhật CODE-GRAPH.md + CODE-GRAPH.docx: thêm DeviceConnectionEndpoints node + 2 route mới

Plan: docs/plans/PLAN-adb-add-device-api-2026-08-19/steps/STEP-3.1-senior-developer-code.md
</commit_message>
<xml_diff>
--- a/code-graph/CODE-GRAPH.docx
+++ b/code-graph/CODE-GRAPH.docx
@@ -29,7 +29,7 @@
         <w:rPr>
           <w:sz w:val="21"/>
         </w:rPr>
-        <w:t>last_updated: 2026-08-10</w:t>
+        <w:t>last_updated: 2026-08-19</w:t>
       </w:r>
     </w:p>
     <w:p>
@@ -351,6 +351,325 @@
           </w:p>
         </w:tc>
       </w:tr>
+      <w:tr>
+        <w:tc>
+          <w:tcPr>
+            <w:tcW w:type="dxa" w:w="3230"/>
+            <w:shd w:val="clear" w:color="auto" w:fill="B8B3D6"/>
+            <w:tcBorders>
+              <w:top w:val="single" w:sz="4" w:space="0" w:color="CBCBCB"/>
+              <w:left w:val="single" w:sz="4" w:space="0" w:color="CBCBCB"/>
+              <w:bottom w:val="single" w:sz="4" w:space="0" w:color="CBCBCB"/>
+              <w:right w:val="single" w:sz="4" w:space="0" w:color="CBCBCB"/>
+            </w:tcBorders>
+          </w:tcPr>
+          <w:p>
+            <w:r>
+              <w:rPr>
+                <w:sz w:val="20"/>
+              </w:rPr>
+              <w:t>2026-08-18</w:t>
+            </w:r>
+          </w:p>
+        </w:tc>
+        <w:tc>
+          <w:tcPr>
+            <w:tcW w:type="dxa" w:w="3230"/>
+            <w:shd w:val="clear" w:color="auto" w:fill="B8B3D6"/>
+            <w:tcBorders>
+              <w:top w:val="single" w:sz="4" w:space="0" w:color="CBCBCB"/>
+              <w:left w:val="single" w:sz="4" w:space="0" w:color="CBCBCB"/>
+              <w:bottom w:val="single" w:sz="4" w:space="0" w:color="CBCBCB"/>
+              <w:right w:val="single" w:sz="4" w:space="0" w:color="CBCBCB"/>
+            </w:tcBorders>
+          </w:tcPr>
+          <w:p>
+            <w:r>
+              <w:rPr>
+                <w:sz w:val="20"/>
+              </w:rPr>
+              <w:t>Senior Developer</w:t>
+            </w:r>
+          </w:p>
+        </w:tc>
+        <w:tc>
+          <w:tcPr>
+            <w:tcW w:type="dxa" w:w="3230"/>
+            <w:shd w:val="clear" w:color="auto" w:fill="B8B3D6"/>
+            <w:tcBorders>
+              <w:top w:val="single" w:sz="4" w:space="0" w:color="CBCBCB"/>
+              <w:left w:val="single" w:sz="4" w:space="0" w:color="CBCBCB"/>
+              <w:bottom w:val="single" w:sz="4" w:space="0" w:color="CBCBCB"/>
+              <w:right w:val="single" w:sz="4" w:space="0" w:color="CBCBCB"/>
+            </w:tcBorders>
+          </w:tcPr>
+          <w:p>
+            <w:r>
+              <w:rPr>
+                <w:sz w:val="20"/>
+              </w:rPr>
+              <w:t xml:space="preserve">STEP-3.1: Thêm </w:t>
+            </w:r>
+            <w:r>
+              <w:rPr>
+                <w:rFonts w:ascii="Courier New" w:hAnsi="Courier New"/>
+                <w:color w:val="F05922"/>
+                <w:sz w:val="20"/>
+              </w:rPr>
+              <w:t>POST /api/launch-app</w:t>
+            </w:r>
+            <w:r>
+              <w:rPr>
+                <w:sz w:val="20"/>
+              </w:rPr>
+              <w:t xml:space="preserve"> — </w:t>
+            </w:r>
+            <w:r>
+              <w:rPr>
+                <w:rFonts w:ascii="Courier New" w:hAnsi="Courier New"/>
+                <w:color w:val="F05922"/>
+                <w:sz w:val="20"/>
+              </w:rPr>
+              <w:t>LaunchAppSettings</w:t>
+            </w:r>
+            <w:r>
+              <w:rPr>
+                <w:sz w:val="20"/>
+              </w:rPr>
+              <w:t xml:space="preserve">, </w:t>
+            </w:r>
+            <w:r>
+              <w:rPr>
+                <w:rFonts w:ascii="Courier New" w:hAnsi="Courier New"/>
+                <w:color w:val="F05922"/>
+                <w:sz w:val="20"/>
+              </w:rPr>
+              <w:t>ApiKeyEndpointFilter</w:t>
+            </w:r>
+            <w:r>
+              <w:rPr>
+                <w:sz w:val="20"/>
+              </w:rPr>
+              <w:t xml:space="preserve">, </w:t>
+            </w:r>
+            <w:r>
+              <w:rPr>
+                <w:rFonts w:ascii="Courier New" w:hAnsi="Courier New"/>
+                <w:color w:val="F05922"/>
+                <w:sz w:val="20"/>
+              </w:rPr>
+              <w:t>LaunchAppEndpoints</w:t>
+            </w:r>
+            <w:r>
+              <w:rPr>
+                <w:sz w:val="20"/>
+              </w:rPr>
+              <w:t xml:space="preserve">; cập nhật callers của </w:t>
+            </w:r>
+            <w:r>
+              <w:rPr>
+                <w:rFonts w:ascii="Courier New" w:hAnsi="Courier New"/>
+                <w:color w:val="F05922"/>
+                <w:sz w:val="20"/>
+              </w:rPr>
+              <w:t>AdbService</w:t>
+            </w:r>
+            <w:r>
+              <w:rPr>
+                <w:sz w:val="20"/>
+              </w:rPr>
+              <w:t xml:space="preserve">, </w:t>
+            </w:r>
+            <w:r>
+              <w:rPr>
+                <w:rFonts w:ascii="Courier New" w:hAnsi="Courier New"/>
+                <w:color w:val="F05922"/>
+                <w:sz w:val="20"/>
+              </w:rPr>
+              <w:t>DeviceState</w:t>
+            </w:r>
+            <w:r>
+              <w:rPr>
+                <w:sz w:val="20"/>
+              </w:rPr>
+              <w:t xml:space="preserve">, </w:t>
+            </w:r>
+            <w:r>
+              <w:rPr>
+                <w:rFonts w:ascii="Courier New" w:hAnsi="Courier New"/>
+                <w:color w:val="F05922"/>
+                <w:sz w:val="20"/>
+              </w:rPr>
+              <w:t>Program.cs</w:t>
+            </w:r>
+          </w:p>
+        </w:tc>
+      </w:tr>
+      <w:tr>
+        <w:tc>
+          <w:tcPr>
+            <w:tcW w:type="dxa" w:w="3230"/>
+            <w:tcBorders>
+              <w:top w:val="single" w:sz="4" w:space="0" w:color="CBCBCB"/>
+              <w:left w:val="single" w:sz="4" w:space="0" w:color="CBCBCB"/>
+              <w:bottom w:val="single" w:sz="4" w:space="0" w:color="CBCBCB"/>
+              <w:right w:val="single" w:sz="4" w:space="0" w:color="CBCBCB"/>
+            </w:tcBorders>
+          </w:tcPr>
+          <w:p>
+            <w:r>
+              <w:rPr>
+                <w:sz w:val="20"/>
+              </w:rPr>
+              <w:t>2026-08-19</w:t>
+            </w:r>
+          </w:p>
+        </w:tc>
+        <w:tc>
+          <w:tcPr>
+            <w:tcW w:type="dxa" w:w="3230"/>
+            <w:tcBorders>
+              <w:top w:val="single" w:sz="4" w:space="0" w:color="CBCBCB"/>
+              <w:left w:val="single" w:sz="4" w:space="0" w:color="CBCBCB"/>
+              <w:bottom w:val="single" w:sz="4" w:space="0" w:color="CBCBCB"/>
+              <w:right w:val="single" w:sz="4" w:space="0" w:color="CBCBCB"/>
+            </w:tcBorders>
+          </w:tcPr>
+          <w:p>
+            <w:r>
+              <w:rPr>
+                <w:sz w:val="20"/>
+              </w:rPr>
+              <w:t>Senior Developer</w:t>
+            </w:r>
+          </w:p>
+        </w:tc>
+        <w:tc>
+          <w:tcPr>
+            <w:tcW w:type="dxa" w:w="3230"/>
+            <w:tcBorders>
+              <w:top w:val="single" w:sz="4" w:space="0" w:color="CBCBCB"/>
+              <w:left w:val="single" w:sz="4" w:space="0" w:color="CBCBCB"/>
+              <w:bottom w:val="single" w:sz="4" w:space="0" w:color="CBCBCB"/>
+              <w:right w:val="single" w:sz="4" w:space="0" w:color="CBCBCB"/>
+            </w:tcBorders>
+          </w:tcPr>
+          <w:p>
+            <w:r>
+              <w:rPr>
+                <w:sz w:val="20"/>
+              </w:rPr>
+              <w:t xml:space="preserve">STEP-3.1 [adb-add-device-api]: Thêm </w:t>
+            </w:r>
+            <w:r>
+              <w:rPr>
+                <w:rFonts w:ascii="Courier New" w:hAnsi="Courier New"/>
+                <w:color w:val="F05922"/>
+                <w:sz w:val="20"/>
+              </w:rPr>
+              <w:t>POST /api/devices/connect-by-ip</w:t>
+            </w:r>
+            <w:r>
+              <w:rPr>
+                <w:sz w:val="20"/>
+              </w:rPr>
+              <w:t xml:space="preserve"> + </w:t>
+            </w:r>
+            <w:r>
+              <w:rPr>
+                <w:rFonts w:ascii="Courier New" w:hAnsi="Courier New"/>
+                <w:color w:val="F05922"/>
+                <w:sz w:val="20"/>
+              </w:rPr>
+              <w:t>GET /api/devices/{serial}/status</w:t>
+            </w:r>
+            <w:r>
+              <w:rPr>
+                <w:sz w:val="20"/>
+              </w:rPr>
+              <w:t xml:space="preserve"> — </w:t>
+            </w:r>
+            <w:r>
+              <w:rPr>
+                <w:rFonts w:ascii="Courier New" w:hAnsi="Courier New"/>
+                <w:color w:val="F05922"/>
+                <w:sz w:val="20"/>
+              </w:rPr>
+              <w:t>DeviceConnectionEndpoints</w:t>
+            </w:r>
+            <w:r>
+              <w:rPr>
+                <w:sz w:val="20"/>
+              </w:rPr>
+              <w:t xml:space="preserve">; cập nhật callers của </w:t>
+            </w:r>
+            <w:r>
+              <w:rPr>
+                <w:rFonts w:ascii="Courier New" w:hAnsi="Courier New"/>
+                <w:color w:val="F05922"/>
+                <w:sz w:val="20"/>
+              </w:rPr>
+              <w:t>AdbService</w:t>
+            </w:r>
+            <w:r>
+              <w:rPr>
+                <w:sz w:val="20"/>
+              </w:rPr>
+              <w:t xml:space="preserve">, </w:t>
+            </w:r>
+            <w:r>
+              <w:rPr>
+                <w:rFonts w:ascii="Courier New" w:hAnsi="Courier New"/>
+                <w:color w:val="F05922"/>
+                <w:sz w:val="20"/>
+              </w:rPr>
+              <w:t>DeviceState</w:t>
+            </w:r>
+            <w:r>
+              <w:rPr>
+                <w:sz w:val="20"/>
+              </w:rPr>
+              <w:t xml:space="preserve">, </w:t>
+            </w:r>
+            <w:r>
+              <w:rPr>
+                <w:rFonts w:ascii="Courier New" w:hAnsi="Courier New"/>
+                <w:color w:val="F05922"/>
+                <w:sz w:val="20"/>
+              </w:rPr>
+              <w:t>PollControlService</w:t>
+            </w:r>
+            <w:r>
+              <w:rPr>
+                <w:sz w:val="20"/>
+              </w:rPr>
+              <w:t xml:space="preserve">, </w:t>
+            </w:r>
+            <w:r>
+              <w:rPr>
+                <w:rFonts w:ascii="Courier New" w:hAnsi="Courier New"/>
+                <w:color w:val="F05922"/>
+                <w:sz w:val="20"/>
+              </w:rPr>
+              <w:t>ApiKeyEndpointFilter</w:t>
+            </w:r>
+            <w:r>
+              <w:rPr>
+                <w:sz w:val="20"/>
+              </w:rPr>
+              <w:t xml:space="preserve">, </w:t>
+            </w:r>
+            <w:r>
+              <w:rPr>
+                <w:rFonts w:ascii="Courier New" w:hAnsi="Courier New"/>
+                <w:color w:val="F05922"/>
+                <w:sz w:val="20"/>
+              </w:rPr>
+              <w:t>Program.cs</w:t>
+            </w:r>
+          </w:p>
+        </w:tc>
+      </w:tr>
     </w:tbl>
     <w:p/>
     <w:p>
@@ -866,6 +1185,8 @@
         <w:t>├── Endpoints/</w:t>
         <w:br/>
         <w:t>│   ├── ApkEndpoints.cs             ← POST /api/apk/upload, DELETE /api/apk</w:t>
+        <w:br/>
+        <w:t>│   ├── DeviceConnectionEndpoints.cs← POST /api/devices/connect-by-ip, GET /api/devices/{serial}/status (auth: ApiKeyEndpointFilter) [adb-add-device-api]</w:t>
         <w:br/>
         <w:t>│   ├── DeviceEndpoints.cs          ← POST /api/devices/{connect,connect-batch,remove,poll}, GET /api/devices, POST /api/settings/package, /api/polling/toggle</w:t>
         <w:br/>
@@ -1214,7 +1535,7 @@
               <w:rPr>
                 <w:sz w:val="20"/>
               </w:rPr>
-              <w:t>AdbSettings, AdbService, DeviceRepository, ApkManifestReader, DevicePollWorker, DeviceHub, DeviceState, InstallCoordinator, ScanCoordinator, PollControlService</w:t>
+              <w:t>AdbSettings, LaunchAppSettings, AdbService, DeviceRepository, ApkManifestReader, DevicePollWorker, DeviceHub, DeviceState, InstallCoordinator, ScanCoordinator, PollControlService</w:t>
             </w:r>
           </w:p>
         </w:tc>
@@ -1274,7 +1595,7 @@
               <w:rPr>
                 <w:sz w:val="20"/>
               </w:rPr>
-              <w:t>2026-08-10</w:t>
+              <w:t>2026-08-18</w:t>
             </w:r>
           </w:p>
         </w:tc>
@@ -1397,7 +1718,7 @@
                 <w:color w:val="F05922"/>
                 <w:sz w:val="20"/>
               </w:rPr>
-              <w:t>Services/AdbService</w:t>
+              <w:t>Configuration/LaunchAppSettings</w:t>
             </w:r>
           </w:p>
         </w:tc>
@@ -1417,7 +1738,7 @@
               <w:rPr>
                 <w:sz w:val="20"/>
               </w:rPr>
-              <w:t>IOptions\&lt;AdbSettings\&gt;, System.Diagnostics.Process</w:t>
+              <w:t>—</w:t>
             </w:r>
           </w:p>
         </w:tc>
@@ -1437,7 +1758,7 @@
               <w:rPr>
                 <w:sz w:val="20"/>
               </w:rPr>
-              <w:t>DevicePollWorker, InstallCoordinator</w:t>
+              <w:t>Program.cs, ApiKeyEndpointFilter</w:t>
             </w:r>
           </w:p>
         </w:tc>
@@ -1477,7 +1798,7 @@
               <w:rPr>
                 <w:sz w:val="20"/>
               </w:rPr>
-              <w:t>2026-08-10</w:t>
+              <w:t>2026-08-18</w:t>
             </w:r>
           </w:p>
         </w:tc>
@@ -1500,7 +1821,7 @@
                 <w:color w:val="F05922"/>
                 <w:sz w:val="20"/>
               </w:rPr>
-              <w:t>Services/DeviceRepository</w:t>
+              <w:t>Services/AdbService</w:t>
             </w:r>
           </w:p>
         </w:tc>
@@ -1519,7 +1840,7 @@
               <w:rPr>
                 <w:sz w:val="20"/>
               </w:rPr>
-              <w:t>IOptions\&lt;AdbSettings\&gt;, Microsoft.Data.Sqlite, Models/DeviceRecord</w:t>
+              <w:t>IOptions\&lt;AdbSettings\&gt;, System.Diagnostics.Process</w:t>
             </w:r>
           </w:p>
         </w:tc>
@@ -1538,7 +1859,7 @@
               <w:rPr>
                 <w:sz w:val="20"/>
               </w:rPr>
-              <w:t>DevicePollWorker, DeviceEndpoints, InstallEndpoints, ApkEndpoints, InstallCoordinator</w:t>
+              <w:t>DevicePollWorker, InstallCoordinator, LaunchAppEndpoints, DeviceConnectionEndpoints</w:t>
             </w:r>
           </w:p>
         </w:tc>
@@ -1576,7 +1897,7 @@
               <w:rPr>
                 <w:sz w:val="20"/>
               </w:rPr>
-              <w:t>2026-08-10</w:t>
+              <w:t>2026-08-19</w:t>
             </w:r>
           </w:p>
         </w:tc>
@@ -1600,7 +1921,7 @@
                 <w:color w:val="F05922"/>
                 <w:sz w:val="20"/>
               </w:rPr>
-              <w:t>Services/ApkManifestReader</w:t>
+              <w:t>Services/DeviceRepository</w:t>
             </w:r>
           </w:p>
         </w:tc>
@@ -1620,7 +1941,7 @@
               <w:rPr>
                 <w:sz w:val="20"/>
               </w:rPr>
-              <w:t>System.IO.Compression</w:t>
+              <w:t>IOptions\&lt;AdbSettings\&gt;, Microsoft.Data.Sqlite, Models/DeviceRecord</w:t>
             </w:r>
           </w:p>
         </w:tc>
@@ -1640,7 +1961,7 @@
               <w:rPr>
                 <w:sz w:val="20"/>
               </w:rPr>
-              <w:t>ApkEndpoints</w:t>
+              <w:t>DevicePollWorker, DeviceEndpoints, InstallEndpoints, ApkEndpoints, InstallCoordinator</w:t>
             </w:r>
           </w:p>
         </w:tc>
@@ -1703,7 +2024,7 @@
                 <w:color w:val="F05922"/>
                 <w:sz w:val="20"/>
               </w:rPr>
-              <w:t>Services/InstallCoordinator</w:t>
+              <w:t>Services/ApkManifestReader</w:t>
             </w:r>
           </w:p>
         </w:tc>
@@ -1722,7 +2043,7 @@
               <w:rPr>
                 <w:sz w:val="20"/>
               </w:rPr>
-              <w:t>AdbService, DeviceRepository, DeviceState, IHubContext\&lt;DeviceHub\&gt;</w:t>
+              <w:t>System.IO.Compression</w:t>
             </w:r>
           </w:p>
         </w:tc>
@@ -1741,7 +2062,7 @@
               <w:rPr>
                 <w:sz w:val="20"/>
               </w:rPr>
-              <w:t>InstallEndpoints</w:t>
+              <w:t>ApkEndpoints</w:t>
             </w:r>
           </w:p>
         </w:tc>
@@ -1803,7 +2124,7 @@
                 <w:color w:val="F05922"/>
                 <w:sz w:val="20"/>
               </w:rPr>
-              <w:t>Services/PollControlService</w:t>
+              <w:t>Services/InstallCoordinator</w:t>
             </w:r>
           </w:p>
         </w:tc>
@@ -1823,7 +2144,7 @@
               <w:rPr>
                 <w:sz w:val="20"/>
               </w:rPr>
-              <w:t>—</w:t>
+              <w:t>AdbService, DeviceRepository, DeviceState, IHubContext\&lt;DeviceHub\&gt;</w:t>
             </w:r>
           </w:p>
         </w:tc>
@@ -1843,7 +2164,7 @@
               <w:rPr>
                 <w:sz w:val="20"/>
               </w:rPr>
-              <w:t>DevicePollWorker, DeviceEndpoints</w:t>
+              <w:t>InstallEndpoints</w:t>
             </w:r>
           </w:p>
         </w:tc>
@@ -1906,7 +2227,7 @@
                 <w:color w:val="F05922"/>
                 <w:sz w:val="20"/>
               </w:rPr>
-              <w:t>Services/ScanCoordinator</w:t>
+              <w:t>Services/PollControlService</w:t>
             </w:r>
           </w:p>
         </w:tc>
@@ -1925,7 +2246,7 @@
               <w:rPr>
                 <w:sz w:val="20"/>
               </w:rPr>
-              <w:t>IHubContext\&lt;DeviceHub\&gt;, ScanRangeParser</w:t>
+              <w:t>—</w:t>
             </w:r>
           </w:p>
         </w:tc>
@@ -1944,7 +2265,7 @@
               <w:rPr>
                 <w:sz w:val="20"/>
               </w:rPr>
-              <w:t>ScanEndpoints</w:t>
+              <w:t>DevicePollWorker, DeviceEndpoints, DeviceConnectionEndpoints</w:t>
             </w:r>
           </w:p>
         </w:tc>
@@ -1982,7 +2303,7 @@
               <w:rPr>
                 <w:sz w:val="20"/>
               </w:rPr>
-              <w:t>2026-08-10</w:t>
+              <w:t>2026-08-19</w:t>
             </w:r>
           </w:p>
         </w:tc>
@@ -2006,7 +2327,7 @@
                 <w:color w:val="F05922"/>
                 <w:sz w:val="20"/>
               </w:rPr>
-              <w:t>Services/ScanRangeParser</w:t>
+              <w:t>Services/ScanCoordinator</w:t>
             </w:r>
           </w:p>
         </w:tc>
@@ -2026,7 +2347,7 @@
               <w:rPr>
                 <w:sz w:val="20"/>
               </w:rPr>
-              <w:t>—</w:t>
+              <w:t>IHubContext\&lt;DeviceHub\&gt;, ScanRangeParser</w:t>
             </w:r>
           </w:p>
         </w:tc>
@@ -2046,7 +2367,7 @@
               <w:rPr>
                 <w:sz w:val="20"/>
               </w:rPr>
-              <w:t>ScanCoordinator</w:t>
+              <w:t>ScanEndpoints</w:t>
             </w:r>
           </w:p>
         </w:tc>
@@ -2109,7 +2430,7 @@
                 <w:color w:val="F05922"/>
                 <w:sz w:val="20"/>
               </w:rPr>
-              <w:t>State/DeviceState</w:t>
+              <w:t>Services/ScanRangeParser</w:t>
             </w:r>
           </w:p>
         </w:tc>
@@ -2128,7 +2449,7 @@
               <w:rPr>
                 <w:sz w:val="20"/>
               </w:rPr>
-              <w:t>System.Collections.Concurrent, Models/DeviceRecord</w:t>
+              <w:t>—</w:t>
             </w:r>
           </w:p>
         </w:tc>
@@ -2147,7 +2468,7 @@
               <w:rPr>
                 <w:sz w:val="20"/>
               </w:rPr>
-              <w:t>DevicePollWorker, DeviceEndpoints, InstallEndpoints, InstallCoordinator</w:t>
+              <w:t>ScanCoordinator</w:t>
             </w:r>
           </w:p>
         </w:tc>
@@ -2186,6 +2507,412 @@
                 <w:sz w:val="20"/>
               </w:rPr>
               <w:t>2026-08-10</w:t>
+            </w:r>
+          </w:p>
+        </w:tc>
+      </w:tr>
+      <w:tr>
+        <w:tc>
+          <w:tcPr>
+            <w:tcW w:type="dxa" w:w="1938"/>
+            <w:shd w:val="clear" w:color="auto" w:fill="B8B3D6"/>
+            <w:tcBorders>
+              <w:top w:val="single" w:sz="4" w:space="0" w:color="CBCBCB"/>
+              <w:left w:val="single" w:sz="4" w:space="0" w:color="CBCBCB"/>
+              <w:bottom w:val="single" w:sz="4" w:space="0" w:color="CBCBCB"/>
+              <w:right w:val="single" w:sz="4" w:space="0" w:color="CBCBCB"/>
+            </w:tcBorders>
+          </w:tcPr>
+          <w:p>
+            <w:r>
+              <w:rPr>
+                <w:rFonts w:ascii="Courier New" w:hAnsi="Courier New"/>
+                <w:color w:val="F05922"/>
+                <w:sz w:val="20"/>
+              </w:rPr>
+              <w:t>State/DeviceState</w:t>
+            </w:r>
+          </w:p>
+        </w:tc>
+        <w:tc>
+          <w:tcPr>
+            <w:tcW w:type="dxa" w:w="1938"/>
+            <w:shd w:val="clear" w:color="auto" w:fill="B8B3D6"/>
+            <w:tcBorders>
+              <w:top w:val="single" w:sz="4" w:space="0" w:color="CBCBCB"/>
+              <w:left w:val="single" w:sz="4" w:space="0" w:color="CBCBCB"/>
+              <w:bottom w:val="single" w:sz="4" w:space="0" w:color="CBCBCB"/>
+              <w:right w:val="single" w:sz="4" w:space="0" w:color="CBCBCB"/>
+            </w:tcBorders>
+          </w:tcPr>
+          <w:p>
+            <w:r>
+              <w:rPr>
+                <w:sz w:val="20"/>
+              </w:rPr>
+              <w:t>System.Collections.Concurrent, Models/DeviceRecord</w:t>
+            </w:r>
+          </w:p>
+        </w:tc>
+        <w:tc>
+          <w:tcPr>
+            <w:tcW w:type="dxa" w:w="1938"/>
+            <w:shd w:val="clear" w:color="auto" w:fill="B8B3D6"/>
+            <w:tcBorders>
+              <w:top w:val="single" w:sz="4" w:space="0" w:color="CBCBCB"/>
+              <w:left w:val="single" w:sz="4" w:space="0" w:color="CBCBCB"/>
+              <w:bottom w:val="single" w:sz="4" w:space="0" w:color="CBCBCB"/>
+              <w:right w:val="single" w:sz="4" w:space="0" w:color="CBCBCB"/>
+            </w:tcBorders>
+          </w:tcPr>
+          <w:p>
+            <w:r>
+              <w:rPr>
+                <w:sz w:val="20"/>
+              </w:rPr>
+              <w:t>DevicePollWorker, DeviceEndpoints, InstallEndpoints, InstallCoordinator, LaunchAppEndpoints, DeviceConnectionEndpoints</w:t>
+            </w:r>
+          </w:p>
+        </w:tc>
+        <w:tc>
+          <w:tcPr>
+            <w:tcW w:type="dxa" w:w="1938"/>
+            <w:shd w:val="clear" w:color="auto" w:fill="B8B3D6"/>
+            <w:tcBorders>
+              <w:top w:val="single" w:sz="4" w:space="0" w:color="CBCBCB"/>
+              <w:left w:val="single" w:sz="4" w:space="0" w:color="CBCBCB"/>
+              <w:bottom w:val="single" w:sz="4" w:space="0" w:color="CBCBCB"/>
+              <w:right w:val="single" w:sz="4" w:space="0" w:color="CBCBCB"/>
+            </w:tcBorders>
+          </w:tcPr>
+          <w:p>
+            <w:r>
+              <w:rPr>
+                <w:sz w:val="20"/>
+              </w:rPr>
+              <w:t>CONFIRMED</w:t>
+            </w:r>
+          </w:p>
+        </w:tc>
+        <w:tc>
+          <w:tcPr>
+            <w:tcW w:type="dxa" w:w="1938"/>
+            <w:shd w:val="clear" w:color="auto" w:fill="B8B3D6"/>
+            <w:tcBorders>
+              <w:top w:val="single" w:sz="4" w:space="0" w:color="CBCBCB"/>
+              <w:left w:val="single" w:sz="4" w:space="0" w:color="CBCBCB"/>
+              <w:bottom w:val="single" w:sz="4" w:space="0" w:color="CBCBCB"/>
+              <w:right w:val="single" w:sz="4" w:space="0" w:color="CBCBCB"/>
+            </w:tcBorders>
+          </w:tcPr>
+          <w:p>
+            <w:r>
+              <w:rPr>
+                <w:sz w:val="20"/>
+              </w:rPr>
+              <w:t>2026-08-19</w:t>
+            </w:r>
+          </w:p>
+        </w:tc>
+      </w:tr>
+      <w:tr>
+        <w:tc>
+          <w:tcPr>
+            <w:tcW w:type="dxa" w:w="1938"/>
+            <w:tcBorders>
+              <w:top w:val="single" w:sz="4" w:space="0" w:color="CBCBCB"/>
+              <w:left w:val="single" w:sz="4" w:space="0" w:color="CBCBCB"/>
+              <w:bottom w:val="single" w:sz="4" w:space="0" w:color="CBCBCB"/>
+              <w:right w:val="single" w:sz="4" w:space="0" w:color="CBCBCB"/>
+            </w:tcBorders>
+          </w:tcPr>
+          <w:p>
+            <w:r>
+              <w:rPr>
+                <w:rFonts w:ascii="Courier New" w:hAnsi="Courier New"/>
+                <w:color w:val="F05922"/>
+                <w:sz w:val="20"/>
+              </w:rPr>
+              <w:t>Endpoints/ApiKeyEndpointFilter</w:t>
+            </w:r>
+          </w:p>
+        </w:tc>
+        <w:tc>
+          <w:tcPr>
+            <w:tcW w:type="dxa" w:w="1938"/>
+            <w:tcBorders>
+              <w:top w:val="single" w:sz="4" w:space="0" w:color="CBCBCB"/>
+              <w:left w:val="single" w:sz="4" w:space="0" w:color="CBCBCB"/>
+              <w:bottom w:val="single" w:sz="4" w:space="0" w:color="CBCBCB"/>
+              <w:right w:val="single" w:sz="4" w:space="0" w:color="CBCBCB"/>
+            </w:tcBorders>
+          </w:tcPr>
+          <w:p>
+            <w:r>
+              <w:rPr>
+                <w:sz w:val="20"/>
+              </w:rPr>
+              <w:t>IOptions\&lt;LaunchAppSettings\&gt;, ILogger</w:t>
+            </w:r>
+          </w:p>
+        </w:tc>
+        <w:tc>
+          <w:tcPr>
+            <w:tcW w:type="dxa" w:w="1938"/>
+            <w:tcBorders>
+              <w:top w:val="single" w:sz="4" w:space="0" w:color="CBCBCB"/>
+              <w:left w:val="single" w:sz="4" w:space="0" w:color="CBCBCB"/>
+              <w:bottom w:val="single" w:sz="4" w:space="0" w:color="CBCBCB"/>
+              <w:right w:val="single" w:sz="4" w:space="0" w:color="CBCBCB"/>
+            </w:tcBorders>
+          </w:tcPr>
+          <w:p>
+            <w:r>
+              <w:rPr>
+                <w:sz w:val="20"/>
+              </w:rPr>
+              <w:t>LaunchAppEndpoints (.AddEndpointFilter), DeviceConnectionEndpoints (.AddEndpointFilter)</w:t>
+            </w:r>
+          </w:p>
+        </w:tc>
+        <w:tc>
+          <w:tcPr>
+            <w:tcW w:type="dxa" w:w="1938"/>
+            <w:tcBorders>
+              <w:top w:val="single" w:sz="4" w:space="0" w:color="CBCBCB"/>
+              <w:left w:val="single" w:sz="4" w:space="0" w:color="CBCBCB"/>
+              <w:bottom w:val="single" w:sz="4" w:space="0" w:color="CBCBCB"/>
+              <w:right w:val="single" w:sz="4" w:space="0" w:color="CBCBCB"/>
+            </w:tcBorders>
+          </w:tcPr>
+          <w:p>
+            <w:r>
+              <w:rPr>
+                <w:sz w:val="20"/>
+              </w:rPr>
+              <w:t>CONFIRMED</w:t>
+            </w:r>
+          </w:p>
+        </w:tc>
+        <w:tc>
+          <w:tcPr>
+            <w:tcW w:type="dxa" w:w="1938"/>
+            <w:tcBorders>
+              <w:top w:val="single" w:sz="4" w:space="0" w:color="CBCBCB"/>
+              <w:left w:val="single" w:sz="4" w:space="0" w:color="CBCBCB"/>
+              <w:bottom w:val="single" w:sz="4" w:space="0" w:color="CBCBCB"/>
+              <w:right w:val="single" w:sz="4" w:space="0" w:color="CBCBCB"/>
+            </w:tcBorders>
+          </w:tcPr>
+          <w:p>
+            <w:r>
+              <w:rPr>
+                <w:sz w:val="20"/>
+              </w:rPr>
+              <w:t>2026-08-19</w:t>
+            </w:r>
+          </w:p>
+        </w:tc>
+      </w:tr>
+      <w:tr>
+        <w:tc>
+          <w:tcPr>
+            <w:tcW w:type="dxa" w:w="1938"/>
+            <w:shd w:val="clear" w:color="auto" w:fill="B8B3D6"/>
+            <w:tcBorders>
+              <w:top w:val="single" w:sz="4" w:space="0" w:color="CBCBCB"/>
+              <w:left w:val="single" w:sz="4" w:space="0" w:color="CBCBCB"/>
+              <w:bottom w:val="single" w:sz="4" w:space="0" w:color="CBCBCB"/>
+              <w:right w:val="single" w:sz="4" w:space="0" w:color="CBCBCB"/>
+            </w:tcBorders>
+          </w:tcPr>
+          <w:p>
+            <w:r>
+              <w:rPr>
+                <w:rFonts w:ascii="Courier New" w:hAnsi="Courier New"/>
+                <w:color w:val="F05922"/>
+                <w:sz w:val="20"/>
+              </w:rPr>
+              <w:t>Endpoints/LaunchAppEndpoints</w:t>
+            </w:r>
+          </w:p>
+        </w:tc>
+        <w:tc>
+          <w:tcPr>
+            <w:tcW w:type="dxa" w:w="1938"/>
+            <w:shd w:val="clear" w:color="auto" w:fill="B8B3D6"/>
+            <w:tcBorders>
+              <w:top w:val="single" w:sz="4" w:space="0" w:color="CBCBCB"/>
+              <w:left w:val="single" w:sz="4" w:space="0" w:color="CBCBCB"/>
+              <w:bottom w:val="single" w:sz="4" w:space="0" w:color="CBCBCB"/>
+              <w:right w:val="single" w:sz="4" w:space="0" w:color="CBCBCB"/>
+            </w:tcBorders>
+          </w:tcPr>
+          <w:p>
+            <w:r>
+              <w:rPr>
+                <w:sz w:val="20"/>
+              </w:rPr>
+              <w:t>DeviceState, AdbService, ApiKeyEndpointFilter, ILoggerFactory</w:t>
+            </w:r>
+          </w:p>
+        </w:tc>
+        <w:tc>
+          <w:tcPr>
+            <w:tcW w:type="dxa" w:w="1938"/>
+            <w:shd w:val="clear" w:color="auto" w:fill="B8B3D6"/>
+            <w:tcBorders>
+              <w:top w:val="single" w:sz="4" w:space="0" w:color="CBCBCB"/>
+              <w:left w:val="single" w:sz="4" w:space="0" w:color="CBCBCB"/>
+              <w:bottom w:val="single" w:sz="4" w:space="0" w:color="CBCBCB"/>
+              <w:right w:val="single" w:sz="4" w:space="0" w:color="CBCBCB"/>
+            </w:tcBorders>
+          </w:tcPr>
+          <w:p>
+            <w:r>
+              <w:rPr>
+                <w:sz w:val="20"/>
+              </w:rPr>
+              <w:t>Program.cs (MapLaunchAppEndpoints)</w:t>
+            </w:r>
+          </w:p>
+        </w:tc>
+        <w:tc>
+          <w:tcPr>
+            <w:tcW w:type="dxa" w:w="1938"/>
+            <w:shd w:val="clear" w:color="auto" w:fill="B8B3D6"/>
+            <w:tcBorders>
+              <w:top w:val="single" w:sz="4" w:space="0" w:color="CBCBCB"/>
+              <w:left w:val="single" w:sz="4" w:space="0" w:color="CBCBCB"/>
+              <w:bottom w:val="single" w:sz="4" w:space="0" w:color="CBCBCB"/>
+              <w:right w:val="single" w:sz="4" w:space="0" w:color="CBCBCB"/>
+            </w:tcBorders>
+          </w:tcPr>
+          <w:p>
+            <w:r>
+              <w:rPr>
+                <w:sz w:val="20"/>
+              </w:rPr>
+              <w:t>CONFIRMED</w:t>
+            </w:r>
+          </w:p>
+        </w:tc>
+        <w:tc>
+          <w:tcPr>
+            <w:tcW w:type="dxa" w:w="1938"/>
+            <w:shd w:val="clear" w:color="auto" w:fill="B8B3D6"/>
+            <w:tcBorders>
+              <w:top w:val="single" w:sz="4" w:space="0" w:color="CBCBCB"/>
+              <w:left w:val="single" w:sz="4" w:space="0" w:color="CBCBCB"/>
+              <w:bottom w:val="single" w:sz="4" w:space="0" w:color="CBCBCB"/>
+              <w:right w:val="single" w:sz="4" w:space="0" w:color="CBCBCB"/>
+            </w:tcBorders>
+          </w:tcPr>
+          <w:p>
+            <w:r>
+              <w:rPr>
+                <w:sz w:val="20"/>
+              </w:rPr>
+              <w:t>2026-08-18</w:t>
+            </w:r>
+          </w:p>
+        </w:tc>
+      </w:tr>
+      <w:tr>
+        <w:tc>
+          <w:tcPr>
+            <w:tcW w:type="dxa" w:w="1938"/>
+            <w:tcBorders>
+              <w:top w:val="single" w:sz="4" w:space="0" w:color="CBCBCB"/>
+              <w:left w:val="single" w:sz="4" w:space="0" w:color="CBCBCB"/>
+              <w:bottom w:val="single" w:sz="4" w:space="0" w:color="CBCBCB"/>
+              <w:right w:val="single" w:sz="4" w:space="0" w:color="CBCBCB"/>
+            </w:tcBorders>
+          </w:tcPr>
+          <w:p>
+            <w:r>
+              <w:rPr>
+                <w:rFonts w:ascii="Courier New" w:hAnsi="Courier New"/>
+                <w:color w:val="F05922"/>
+                <w:sz w:val="20"/>
+              </w:rPr>
+              <w:t>Endpoints/DeviceConnectionEndpoints</w:t>
+            </w:r>
+          </w:p>
+        </w:tc>
+        <w:tc>
+          <w:tcPr>
+            <w:tcW w:type="dxa" w:w="1938"/>
+            <w:tcBorders>
+              <w:top w:val="single" w:sz="4" w:space="0" w:color="CBCBCB"/>
+              <w:left w:val="single" w:sz="4" w:space="0" w:color="CBCBCB"/>
+              <w:bottom w:val="single" w:sz="4" w:space="0" w:color="CBCBCB"/>
+              <w:right w:val="single" w:sz="4" w:space="0" w:color="CBCBCB"/>
+            </w:tcBorders>
+          </w:tcPr>
+          <w:p>
+            <w:r>
+              <w:rPr>
+                <w:sz w:val="20"/>
+              </w:rPr>
+              <w:t>AdbService, PollControlService, DeviceState, ApiKeyEndpointFilter, ILoggerFactory</w:t>
+            </w:r>
+          </w:p>
+        </w:tc>
+        <w:tc>
+          <w:tcPr>
+            <w:tcW w:type="dxa" w:w="1938"/>
+            <w:tcBorders>
+              <w:top w:val="single" w:sz="4" w:space="0" w:color="CBCBCB"/>
+              <w:left w:val="single" w:sz="4" w:space="0" w:color="CBCBCB"/>
+              <w:bottom w:val="single" w:sz="4" w:space="0" w:color="CBCBCB"/>
+              <w:right w:val="single" w:sz="4" w:space="0" w:color="CBCBCB"/>
+            </w:tcBorders>
+          </w:tcPr>
+          <w:p>
+            <w:r>
+              <w:rPr>
+                <w:sz w:val="20"/>
+              </w:rPr>
+              <w:t>Program.cs (MapDeviceConnectionEndpoints)</w:t>
+            </w:r>
+          </w:p>
+        </w:tc>
+        <w:tc>
+          <w:tcPr>
+            <w:tcW w:type="dxa" w:w="1938"/>
+            <w:tcBorders>
+              <w:top w:val="single" w:sz="4" w:space="0" w:color="CBCBCB"/>
+              <w:left w:val="single" w:sz="4" w:space="0" w:color="CBCBCB"/>
+              <w:bottom w:val="single" w:sz="4" w:space="0" w:color="CBCBCB"/>
+              <w:right w:val="single" w:sz="4" w:space="0" w:color="CBCBCB"/>
+            </w:tcBorders>
+          </w:tcPr>
+          <w:p>
+            <w:r>
+              <w:rPr>
+                <w:sz w:val="20"/>
+              </w:rPr>
+              <w:t>CONFIRMED</w:t>
+            </w:r>
+          </w:p>
+        </w:tc>
+        <w:tc>
+          <w:tcPr>
+            <w:tcW w:type="dxa" w:w="1938"/>
+            <w:tcBorders>
+              <w:top w:val="single" w:sz="4" w:space="0" w:color="CBCBCB"/>
+              <w:left w:val="single" w:sz="4" w:space="0" w:color="CBCBCB"/>
+              <w:bottom w:val="single" w:sz="4" w:space="0" w:color="CBCBCB"/>
+              <w:right w:val="single" w:sz="4" w:space="0" w:color="CBCBCB"/>
+            </w:tcBorders>
+          </w:tcPr>
+          <w:p>
+            <w:r>
+              <w:rPr>
+                <w:sz w:val="20"/>
+              </w:rPr>
+              <w:t>2026-08-19</w:t>
             </w:r>
           </w:p>
         </w:tc>
@@ -4848,6 +5575,250 @@
           </w:p>
         </w:tc>
       </w:tr>
+      <w:tr>
+        <w:tc>
+          <w:tcPr>
+            <w:tcW w:type="dxa" w:w="2422"/>
+            <w:tcBorders>
+              <w:top w:val="single" w:sz="4" w:space="0" w:color="CBCBCB"/>
+              <w:left w:val="single" w:sz="4" w:space="0" w:color="CBCBCB"/>
+              <w:bottom w:val="single" w:sz="4" w:space="0" w:color="CBCBCB"/>
+              <w:right w:val="single" w:sz="4" w:space="0" w:color="CBCBCB"/>
+            </w:tcBorders>
+          </w:tcPr>
+          <w:p>
+            <w:r>
+              <w:rPr>
+                <w:sz w:val="20"/>
+              </w:rPr>
+              <w:t>POST</w:t>
+            </w:r>
+          </w:p>
+        </w:tc>
+        <w:tc>
+          <w:tcPr>
+            <w:tcW w:type="dxa" w:w="2422"/>
+            <w:tcBorders>
+              <w:top w:val="single" w:sz="4" w:space="0" w:color="CBCBCB"/>
+              <w:left w:val="single" w:sz="4" w:space="0" w:color="CBCBCB"/>
+              <w:bottom w:val="single" w:sz="4" w:space="0" w:color="CBCBCB"/>
+              <w:right w:val="single" w:sz="4" w:space="0" w:color="CBCBCB"/>
+            </w:tcBorders>
+          </w:tcPr>
+          <w:p>
+            <w:r>
+              <w:rPr>
+                <w:rFonts w:ascii="Courier New" w:hAnsi="Courier New"/>
+                <w:color w:val="F05922"/>
+                <w:sz w:val="20"/>
+              </w:rPr>
+              <w:t>/api/launch-app</w:t>
+            </w:r>
+          </w:p>
+        </w:tc>
+        <w:tc>
+          <w:tcPr>
+            <w:tcW w:type="dxa" w:w="2422"/>
+            <w:tcBorders>
+              <w:top w:val="single" w:sz="4" w:space="0" w:color="CBCBCB"/>
+              <w:left w:val="single" w:sz="4" w:space="0" w:color="CBCBCB"/>
+              <w:bottom w:val="single" w:sz="4" w:space="0" w:color="CBCBCB"/>
+              <w:right w:val="single" w:sz="4" w:space="0" w:color="CBCBCB"/>
+            </w:tcBorders>
+          </w:tcPr>
+          <w:p>
+            <w:r>
+              <w:rPr>
+                <w:sz w:val="20"/>
+              </w:rPr>
+              <w:t>LaunchAppEndpoints → ApiKeyEndpointFilter → DeviceState → AdbService</w:t>
+            </w:r>
+          </w:p>
+        </w:tc>
+        <w:tc>
+          <w:tcPr>
+            <w:tcW w:type="dxa" w:w="2422"/>
+            <w:tcBorders>
+              <w:top w:val="single" w:sz="4" w:space="0" w:color="CBCBCB"/>
+              <w:left w:val="single" w:sz="4" w:space="0" w:color="CBCBCB"/>
+              <w:bottom w:val="single" w:sz="4" w:space="0" w:color="CBCBCB"/>
+              <w:right w:val="single" w:sz="4" w:space="0" w:color="CBCBCB"/>
+            </w:tcBorders>
+          </w:tcPr>
+          <w:p>
+            <w:r>
+              <w:rPr>
+                <w:sz w:val="20"/>
+              </w:rPr>
+              <w:t>✅ STEP-3.1 2026-08-18</w:t>
+            </w:r>
+          </w:p>
+        </w:tc>
+      </w:tr>
+      <w:tr>
+        <w:tc>
+          <w:tcPr>
+            <w:tcW w:type="dxa" w:w="2422"/>
+            <w:shd w:val="clear" w:color="auto" w:fill="B8B3D6"/>
+            <w:tcBorders>
+              <w:top w:val="single" w:sz="4" w:space="0" w:color="CBCBCB"/>
+              <w:left w:val="single" w:sz="4" w:space="0" w:color="CBCBCB"/>
+              <w:bottom w:val="single" w:sz="4" w:space="0" w:color="CBCBCB"/>
+              <w:right w:val="single" w:sz="4" w:space="0" w:color="CBCBCB"/>
+            </w:tcBorders>
+          </w:tcPr>
+          <w:p>
+            <w:r>
+              <w:rPr>
+                <w:sz w:val="20"/>
+              </w:rPr>
+              <w:t>POST</w:t>
+            </w:r>
+          </w:p>
+        </w:tc>
+        <w:tc>
+          <w:tcPr>
+            <w:tcW w:type="dxa" w:w="2422"/>
+            <w:shd w:val="clear" w:color="auto" w:fill="B8B3D6"/>
+            <w:tcBorders>
+              <w:top w:val="single" w:sz="4" w:space="0" w:color="CBCBCB"/>
+              <w:left w:val="single" w:sz="4" w:space="0" w:color="CBCBCB"/>
+              <w:bottom w:val="single" w:sz="4" w:space="0" w:color="CBCBCB"/>
+              <w:right w:val="single" w:sz="4" w:space="0" w:color="CBCBCB"/>
+            </w:tcBorders>
+          </w:tcPr>
+          <w:p>
+            <w:r>
+              <w:rPr>
+                <w:rFonts w:ascii="Courier New" w:hAnsi="Courier New"/>
+                <w:color w:val="F05922"/>
+                <w:sz w:val="20"/>
+              </w:rPr>
+              <w:t>/api/devices/connect-by-ip</w:t>
+            </w:r>
+          </w:p>
+        </w:tc>
+        <w:tc>
+          <w:tcPr>
+            <w:tcW w:type="dxa" w:w="2422"/>
+            <w:shd w:val="clear" w:color="auto" w:fill="B8B3D6"/>
+            <w:tcBorders>
+              <w:top w:val="single" w:sz="4" w:space="0" w:color="CBCBCB"/>
+              <w:left w:val="single" w:sz="4" w:space="0" w:color="CBCBCB"/>
+              <w:bottom w:val="single" w:sz="4" w:space="0" w:color="CBCBCB"/>
+              <w:right w:val="single" w:sz="4" w:space="0" w:color="CBCBCB"/>
+            </w:tcBorders>
+          </w:tcPr>
+          <w:p>
+            <w:r>
+              <w:rPr>
+                <w:sz w:val="20"/>
+              </w:rPr>
+              <w:t>DeviceConnectionEndpoints → ApiKeyEndpointFilter → AdbService → PollControlService</w:t>
+            </w:r>
+          </w:p>
+        </w:tc>
+        <w:tc>
+          <w:tcPr>
+            <w:tcW w:type="dxa" w:w="2422"/>
+            <w:shd w:val="clear" w:color="auto" w:fill="B8B3D6"/>
+            <w:tcBorders>
+              <w:top w:val="single" w:sz="4" w:space="0" w:color="CBCBCB"/>
+              <w:left w:val="single" w:sz="4" w:space="0" w:color="CBCBCB"/>
+              <w:bottom w:val="single" w:sz="4" w:space="0" w:color="CBCBCB"/>
+              <w:right w:val="single" w:sz="4" w:space="0" w:color="CBCBCB"/>
+            </w:tcBorders>
+          </w:tcPr>
+          <w:p>
+            <w:r>
+              <w:rPr>
+                <w:sz w:val="20"/>
+              </w:rPr>
+              <w:t>✅ STEP-3.1 [adb-add-device-api] 2026-08-19</w:t>
+            </w:r>
+          </w:p>
+        </w:tc>
+      </w:tr>
+      <w:tr>
+        <w:tc>
+          <w:tcPr>
+            <w:tcW w:type="dxa" w:w="2422"/>
+            <w:tcBorders>
+              <w:top w:val="single" w:sz="4" w:space="0" w:color="CBCBCB"/>
+              <w:left w:val="single" w:sz="4" w:space="0" w:color="CBCBCB"/>
+              <w:bottom w:val="single" w:sz="4" w:space="0" w:color="CBCBCB"/>
+              <w:right w:val="single" w:sz="4" w:space="0" w:color="CBCBCB"/>
+            </w:tcBorders>
+          </w:tcPr>
+          <w:p>
+            <w:r>
+              <w:rPr>
+                <w:sz w:val="20"/>
+              </w:rPr>
+              <w:t>GET</w:t>
+            </w:r>
+          </w:p>
+        </w:tc>
+        <w:tc>
+          <w:tcPr>
+            <w:tcW w:type="dxa" w:w="2422"/>
+            <w:tcBorders>
+              <w:top w:val="single" w:sz="4" w:space="0" w:color="CBCBCB"/>
+              <w:left w:val="single" w:sz="4" w:space="0" w:color="CBCBCB"/>
+              <w:bottom w:val="single" w:sz="4" w:space="0" w:color="CBCBCB"/>
+              <w:right w:val="single" w:sz="4" w:space="0" w:color="CBCBCB"/>
+            </w:tcBorders>
+          </w:tcPr>
+          <w:p>
+            <w:r>
+              <w:rPr>
+                <w:rFonts w:ascii="Courier New" w:hAnsi="Courier New"/>
+                <w:color w:val="F05922"/>
+                <w:sz w:val="20"/>
+              </w:rPr>
+              <w:t>/api/devices/{serial}/status</w:t>
+            </w:r>
+          </w:p>
+        </w:tc>
+        <w:tc>
+          <w:tcPr>
+            <w:tcW w:type="dxa" w:w="2422"/>
+            <w:tcBorders>
+              <w:top w:val="single" w:sz="4" w:space="0" w:color="CBCBCB"/>
+              <w:left w:val="single" w:sz="4" w:space="0" w:color="CBCBCB"/>
+              <w:bottom w:val="single" w:sz="4" w:space="0" w:color="CBCBCB"/>
+              <w:right w:val="single" w:sz="4" w:space="0" w:color="CBCBCB"/>
+            </w:tcBorders>
+          </w:tcPr>
+          <w:p>
+            <w:r>
+              <w:rPr>
+                <w:sz w:val="20"/>
+              </w:rPr>
+              <w:t>DeviceConnectionEndpoints → ApiKeyEndpointFilter → DeviceState</w:t>
+            </w:r>
+          </w:p>
+        </w:tc>
+        <w:tc>
+          <w:tcPr>
+            <w:tcW w:type="dxa" w:w="2422"/>
+            <w:tcBorders>
+              <w:top w:val="single" w:sz="4" w:space="0" w:color="CBCBCB"/>
+              <w:left w:val="single" w:sz="4" w:space="0" w:color="CBCBCB"/>
+              <w:bottom w:val="single" w:sz="4" w:space="0" w:color="CBCBCB"/>
+              <w:right w:val="single" w:sz="4" w:space="0" w:color="CBCBCB"/>
+            </w:tcBorders>
+          </w:tcPr>
+          <w:p>
+            <w:r>
+              <w:rPr>
+                <w:sz w:val="20"/>
+              </w:rPr>
+              <w:t>✅ STEP-3.1 [adb-add-device-api] 2026-08-19</w:t>
+            </w:r>
+          </w:p>
+        </w:tc>
+      </w:tr>
     </w:tbl>
     <w:p/>
     <w:p>
@@ -5559,7 +6530,7 @@
           <w:color w:val="4A3F8C"/>
           <w:sz w:val="24"/>
         </w:rPr>
-        <w:t>2.5 Configuration (appsettings.json — section "Adb")</w:t>
+        <w:t>2.5 Configuration (appsettings.json — section "Adb" và "LaunchApp")</w:t>
       </w:r>
     </w:p>
     <w:tbl>
@@ -6188,17 +7159,11 @@
           <w:p>
             <w:r>
               <w:rPr>
-                <w:sz w:val="20"/>
-              </w:rPr>
-              <w:t xml:space="preserve">Kestrel </w:t>
-            </w:r>
-            <w:r>
-              <w:rPr>
                 <w:rFonts w:ascii="Courier New" w:hAnsi="Courier New"/>
                 <w:color w:val="F05922"/>
                 <w:sz w:val="20"/>
               </w:rPr>
-              <w:t>MaxRequestBodySize</w:t>
+              <w:t>LaunchApp:ApiKey</w:t>
             </w:r>
           </w:p>
         </w:tc>
@@ -6219,7 +7184,13 @@
                 <w:color w:val="F05922"/>
                 <w:sz w:val="20"/>
               </w:rPr>
-              <w:t>500000000</w:t>
+              <w:t>""</w:t>
+            </w:r>
+            <w:r>
+              <w:rPr>
+                <w:sz w:val="20"/>
+              </w:rPr>
+              <w:t xml:space="preserve"> (fail-safe)</w:t>
             </w:r>
           </w:p>
         </w:tc>
@@ -6236,6 +7207,113 @@
           <w:p>
             <w:r>
               <w:rPr>
+                <w:rFonts w:ascii="Courier New" w:hAnsi="Courier New"/>
+                <w:color w:val="F05922"/>
+                <w:sz w:val="20"/>
+              </w:rPr>
+              <w:t>""</w:t>
+            </w:r>
+          </w:p>
+        </w:tc>
+        <w:tc>
+          <w:tcPr>
+            <w:tcW w:type="dxa" w:w="2422"/>
+            <w:tcBorders>
+              <w:top w:val="single" w:sz="4" w:space="0" w:color="CBCBCB"/>
+              <w:left w:val="single" w:sz="4" w:space="0" w:color="CBCBCB"/>
+              <w:bottom w:val="single" w:sz="4" w:space="0" w:color="CBCBCB"/>
+              <w:right w:val="single" w:sz="4" w:space="0" w:color="CBCBCB"/>
+            </w:tcBorders>
+          </w:tcPr>
+          <w:p>
+            <w:r>
+              <w:rPr>
+                <w:sz w:val="20"/>
+              </w:rPr>
+              <w:t xml:space="preserve">Override bằng env var </w:t>
+            </w:r>
+            <w:r>
+              <w:rPr>
+                <w:rFonts w:ascii="Courier New" w:hAnsi="Courier New"/>
+                <w:color w:val="F05922"/>
+                <w:sz w:val="20"/>
+              </w:rPr>
+              <w:t>LaunchApp__ApiKey</w:t>
+            </w:r>
+            <w:r>
+              <w:rPr>
+                <w:sz w:val="20"/>
+              </w:rPr>
+              <w:t>; rỗng = 401 mọi request (STEP-3.1)</w:t>
+            </w:r>
+          </w:p>
+        </w:tc>
+      </w:tr>
+      <w:tr>
+        <w:tc>
+          <w:tcPr>
+            <w:tcW w:type="dxa" w:w="2422"/>
+            <w:shd w:val="clear" w:color="auto" w:fill="B8B3D6"/>
+            <w:tcBorders>
+              <w:top w:val="single" w:sz="4" w:space="0" w:color="CBCBCB"/>
+              <w:left w:val="single" w:sz="4" w:space="0" w:color="CBCBCB"/>
+              <w:bottom w:val="single" w:sz="4" w:space="0" w:color="CBCBCB"/>
+              <w:right w:val="single" w:sz="4" w:space="0" w:color="CBCBCB"/>
+            </w:tcBorders>
+          </w:tcPr>
+          <w:p>
+            <w:r>
+              <w:rPr>
+                <w:sz w:val="20"/>
+              </w:rPr>
+              <w:t xml:space="preserve">Kestrel </w:t>
+            </w:r>
+            <w:r>
+              <w:rPr>
+                <w:rFonts w:ascii="Courier New" w:hAnsi="Courier New"/>
+                <w:color w:val="F05922"/>
+                <w:sz w:val="20"/>
+              </w:rPr>
+              <w:t>MaxRequestBodySize</w:t>
+            </w:r>
+          </w:p>
+        </w:tc>
+        <w:tc>
+          <w:tcPr>
+            <w:tcW w:type="dxa" w:w="2422"/>
+            <w:shd w:val="clear" w:color="auto" w:fill="B8B3D6"/>
+            <w:tcBorders>
+              <w:top w:val="single" w:sz="4" w:space="0" w:color="CBCBCB"/>
+              <w:left w:val="single" w:sz="4" w:space="0" w:color="CBCBCB"/>
+              <w:bottom w:val="single" w:sz="4" w:space="0" w:color="CBCBCB"/>
+              <w:right w:val="single" w:sz="4" w:space="0" w:color="CBCBCB"/>
+            </w:tcBorders>
+          </w:tcPr>
+          <w:p>
+            <w:r>
+              <w:rPr>
+                <w:rFonts w:ascii="Courier New" w:hAnsi="Courier New"/>
+                <w:color w:val="F05922"/>
+                <w:sz w:val="20"/>
+              </w:rPr>
+              <w:t>500000000</w:t>
+            </w:r>
+          </w:p>
+        </w:tc>
+        <w:tc>
+          <w:tcPr>
+            <w:tcW w:type="dxa" w:w="2422"/>
+            <w:shd w:val="clear" w:color="auto" w:fill="B8B3D6"/>
+            <w:tcBorders>
+              <w:top w:val="single" w:sz="4" w:space="0" w:color="CBCBCB"/>
+              <w:left w:val="single" w:sz="4" w:space="0" w:color="CBCBCB"/>
+              <w:bottom w:val="single" w:sz="4" w:space="0" w:color="CBCBCB"/>
+              <w:right w:val="single" w:sz="4" w:space="0" w:color="CBCBCB"/>
+            </w:tcBorders>
+          </w:tcPr>
+          <w:p>
+            <w:r>
+              <w:rPr>
                 <w:sz w:val="20"/>
               </w:rPr>
               <w:t>inherited</w:t>
@@ -6245,6 +7323,7 @@
         <w:tc>
           <w:tcPr>
             <w:tcW w:type="dxa" w:w="2422"/>
+            <w:shd w:val="clear" w:color="auto" w:fill="B8B3D6"/>
             <w:tcBorders>
               <w:top w:val="single" w:sz="4" w:space="0" w:color="CBCBCB"/>
               <w:left w:val="single" w:sz="4" w:space="0" w:color="CBCBCB"/>

</xml_diff>

<commit_message>
[adb-reconnect-after-restart] Bước 2.1: Fix WarmUpReconnectAsync — tự reconnect WiFi devices sau restart
- Thêm IAdbService interface (Services/IAdbService.cs) với 3 method dùng bởi DevicePollWorker
- AdbService : IAdbService; Program.cs đăng ký IAdbService → cùng AdbService singleton
- DevicePollWorker.ExecuteAsync(): gọi WarmUpReconnectAsync(ct) trước while loop
- WarmUpReconnectAsync: đọc DeviceRepository.GetAll(), filter WiFi serial (Contains(':'))
  gọi ConnectAsync(serial, timeoutMs:5000) cho từng device; best-effort (không throw khi fail)
- KztekAdbPublishTool.Web.csproj: InternalsVisibleTo cho test project
- Thêm 6 unit tests DevicePollWorkerWarmUpTests: WiFi call, USB filter, mixed, fail-continue,
  empty-db, pre-cancelled; 71/71 PASS
- Cập nhật TDD-adb-add-device-api.md (R7 bug fix note), CODE-GRAPH.md

Plan: docs/plans/PLAN-adb-reconnect-after-restart-2026-08-19/steps/STEP-2.1-fix-auto-reconnect.md
</commit_message>
<xml_diff>
--- a/code-graph/CODE-GRAPH.docx
+++ b/code-graph/CODE-GRAPH.docx
@@ -40,7 +40,7 @@
         <w:rPr>
           <w:sz w:val="21"/>
         </w:rPr>
-        <w:t>updated_by: Senior Developer</w:t>
+        <w:t>updated_by: Senior Developer (BUG-adb-reconnect-after-restart)</w:t>
       </w:r>
     </w:p>
     <w:p>
@@ -666,6 +666,174 @@
                 <w:sz w:val="20"/>
               </w:rPr>
               <w:t>Program.cs</w:t>
+            </w:r>
+          </w:p>
+        </w:tc>
+      </w:tr>
+      <w:tr>
+        <w:tc>
+          <w:tcPr>
+            <w:tcW w:type="dxa" w:w="3230"/>
+            <w:shd w:val="clear" w:color="auto" w:fill="B8B3D6"/>
+            <w:tcBorders>
+              <w:top w:val="single" w:sz="4" w:space="0" w:color="CBCBCB"/>
+              <w:left w:val="single" w:sz="4" w:space="0" w:color="CBCBCB"/>
+              <w:bottom w:val="single" w:sz="4" w:space="0" w:color="CBCBCB"/>
+              <w:right w:val="single" w:sz="4" w:space="0" w:color="CBCBCB"/>
+            </w:tcBorders>
+          </w:tcPr>
+          <w:p>
+            <w:r>
+              <w:rPr>
+                <w:sz w:val="20"/>
+              </w:rPr>
+              <w:t>2026-08-19</w:t>
+            </w:r>
+          </w:p>
+        </w:tc>
+        <w:tc>
+          <w:tcPr>
+            <w:tcW w:type="dxa" w:w="3230"/>
+            <w:shd w:val="clear" w:color="auto" w:fill="B8B3D6"/>
+            <w:tcBorders>
+              <w:top w:val="single" w:sz="4" w:space="0" w:color="CBCBCB"/>
+              <w:left w:val="single" w:sz="4" w:space="0" w:color="CBCBCB"/>
+              <w:bottom w:val="single" w:sz="4" w:space="0" w:color="CBCBCB"/>
+              <w:right w:val="single" w:sz="4" w:space="0" w:color="CBCBCB"/>
+            </w:tcBorders>
+          </w:tcPr>
+          <w:p>
+            <w:r>
+              <w:rPr>
+                <w:sz w:val="20"/>
+              </w:rPr>
+              <w:t>Senior Developer</w:t>
+            </w:r>
+          </w:p>
+        </w:tc>
+        <w:tc>
+          <w:tcPr>
+            <w:tcW w:type="dxa" w:w="3230"/>
+            <w:shd w:val="clear" w:color="auto" w:fill="B8B3D6"/>
+            <w:tcBorders>
+              <w:top w:val="single" w:sz="4" w:space="0" w:color="CBCBCB"/>
+              <w:left w:val="single" w:sz="4" w:space="0" w:color="CBCBCB"/>
+              <w:bottom w:val="single" w:sz="4" w:space="0" w:color="CBCBCB"/>
+              <w:right w:val="single" w:sz="4" w:space="0" w:color="CBCBCB"/>
+            </w:tcBorders>
+          </w:tcPr>
+          <w:p>
+            <w:r>
+              <w:rPr>
+                <w:sz w:val="20"/>
+              </w:rPr>
+              <w:t xml:space="preserve">BUG-adb-reconnect: Thêm </w:t>
+            </w:r>
+            <w:r>
+              <w:rPr>
+                <w:rFonts w:ascii="Courier New" w:hAnsi="Courier New"/>
+                <w:color w:val="F05922"/>
+                <w:sz w:val="20"/>
+              </w:rPr>
+              <w:t>IAdbService</w:t>
+            </w:r>
+            <w:r>
+              <w:rPr>
+                <w:sz w:val="20"/>
+              </w:rPr>
+              <w:t xml:space="preserve"> interface; </w:t>
+            </w:r>
+            <w:r>
+              <w:rPr>
+                <w:rFonts w:ascii="Courier New" w:hAnsi="Courier New"/>
+                <w:color w:val="F05922"/>
+                <w:sz w:val="20"/>
+              </w:rPr>
+              <w:t>AdbService : IAdbService</w:t>
+            </w:r>
+            <w:r>
+              <w:rPr>
+                <w:sz w:val="20"/>
+              </w:rPr>
+              <w:t xml:space="preserve">; </w:t>
+            </w:r>
+            <w:r>
+              <w:rPr>
+                <w:rFonts w:ascii="Courier New" w:hAnsi="Courier New"/>
+                <w:color w:val="F05922"/>
+                <w:sz w:val="20"/>
+              </w:rPr>
+              <w:t>DevicePollWorker</w:t>
+            </w:r>
+            <w:r>
+              <w:rPr>
+                <w:sz w:val="20"/>
+              </w:rPr>
+              <w:t xml:space="preserve"> dùng </w:t>
+            </w:r>
+            <w:r>
+              <w:rPr>
+                <w:rFonts w:ascii="Courier New" w:hAnsi="Courier New"/>
+                <w:color w:val="F05922"/>
+                <w:sz w:val="20"/>
+              </w:rPr>
+              <w:t>IAdbService</w:t>
+            </w:r>
+            <w:r>
+              <w:rPr>
+                <w:sz w:val="20"/>
+              </w:rPr>
+              <w:t xml:space="preserve"> + thêm </w:t>
+            </w:r>
+            <w:r>
+              <w:rPr>
+                <w:rFonts w:ascii="Courier New" w:hAnsi="Courier New"/>
+                <w:color w:val="F05922"/>
+                <w:sz w:val="20"/>
+              </w:rPr>
+              <w:t>WarmUpReconnectAsync()</w:t>
+            </w:r>
+            <w:r>
+              <w:rPr>
+                <w:sz w:val="20"/>
+              </w:rPr>
+              <w:t xml:space="preserve"> (internal); </w:t>
+            </w:r>
+            <w:r>
+              <w:rPr>
+                <w:rFonts w:ascii="Courier New" w:hAnsi="Courier New"/>
+                <w:color w:val="F05922"/>
+                <w:sz w:val="20"/>
+              </w:rPr>
+              <w:t>Program.cs</w:t>
+            </w:r>
+            <w:r>
+              <w:rPr>
+                <w:sz w:val="20"/>
+              </w:rPr>
+              <w:t xml:space="preserve"> đăng ký </w:t>
+            </w:r>
+            <w:r>
+              <w:rPr>
+                <w:rFonts w:ascii="Courier New" w:hAnsi="Courier New"/>
+                <w:color w:val="F05922"/>
+                <w:sz w:val="20"/>
+              </w:rPr>
+              <w:t>IAdbService</w:t>
+            </w:r>
+            <w:r>
+              <w:rPr>
+                <w:sz w:val="20"/>
+              </w:rPr>
+              <w:t xml:space="preserve">; thêm 6 unit tests </w:t>
+            </w:r>
+            <w:r>
+              <w:rPr>
+                <w:rFonts w:ascii="Courier New" w:hAnsi="Courier New"/>
+                <w:color w:val="F05922"/>
+                <w:sz w:val="20"/>
+              </w:rPr>
+              <w:t>DevicePollWorkerWarmUpTests</w:t>
             </w:r>
           </w:p>
         </w:tc>
@@ -1216,7 +1384,9 @@
         <w:br/>
         <w:t>├── Services/</w:t>
         <w:br/>
-        <w:t>│   ├── AdbService.cs               ← Singleton; wrap adb binary; GetDevices/Connect/Install/LaunchApp/GetVersion</w:t>
+        <w:t>│   ├── IAdbService.cs              ← Interface: GetDevicesAsync/ConnectAsync/GetPackageVersionAsync (testability)</w:t>
+        <w:br/>
+        <w:t>│   ├── AdbService.cs               ← Singleton; implement IAdbService; wrap adb binary; GetDevices/Connect/Install/LaunchApp/GetVersion</w:t>
         <w:br/>
         <w:t>│   ├── ApkManifestReader.cs        ← Singleton; parse AXML từ .apk; stateless</w:t>
         <w:br/>
@@ -1236,7 +1406,7 @@
         <w:br/>
         <w:t>├── Workers/</w:t>
         <w:br/>
-        <w:t>│   └── DevicePollWorker.cs         ← BackgroundService; poll 3s → Upsert → RefreshVersion → push SignalR DevicesUpdated</w:t>
+        <w:t>│   └── DevicePollWorker.cs         ← BackgroundService; WarmUpReconnectAsync (internal) → gọi ConnectAsync cho WiFi device persisted → poll 3s → Upsert → RefreshVersion → push SignalR DevicesUpdated</w:t>
         <w:br/>
         <w:t>├── wwwroot/</w:t>
         <w:br/>
@@ -1821,7 +1991,7 @@
                 <w:color w:val="F05922"/>
                 <w:sz w:val="20"/>
               </w:rPr>
-              <w:t>Services/AdbService</w:t>
+              <w:t>Services/IAdbService</w:t>
             </w:r>
           </w:p>
         </w:tc>
@@ -1840,7 +2010,7 @@
               <w:rPr>
                 <w:sz w:val="20"/>
               </w:rPr>
-              <w:t>IOptions\&lt;AdbSettings\&gt;, System.Diagnostics.Process</w:t>
+              <w:t>—</w:t>
             </w:r>
           </w:p>
         </w:tc>
@@ -1859,7 +2029,7 @@
               <w:rPr>
                 <w:sz w:val="20"/>
               </w:rPr>
-              <w:t>DevicePollWorker, InstallCoordinator, LaunchAppEndpoints, DeviceConnectionEndpoints</w:t>
+              <w:t>DevicePollWorker (interface dep), AdbService (implements)</w:t>
             </w:r>
           </w:p>
         </w:tc>
@@ -1921,7 +2091,7 @@
                 <w:color w:val="F05922"/>
                 <w:sz w:val="20"/>
               </w:rPr>
-              <w:t>Services/DeviceRepository</w:t>
+              <w:t>Services/AdbService</w:t>
             </w:r>
           </w:p>
         </w:tc>
@@ -1941,7 +2111,14 @@
               <w:rPr>
                 <w:sz w:val="20"/>
               </w:rPr>
-              <w:t>IOptions\&lt;AdbSettings\&gt;, Microsoft.Data.Sqlite, Models/DeviceRecord</w:t>
+              <w:t xml:space="preserve">IOptions\&lt;AdbSettings\&gt;, System.Diagnostics.Process, </w:t>
+            </w:r>
+            <w:r>
+              <w:rPr>
+                <w:b/>
+                <w:sz w:val="20"/>
+              </w:rPr>
+              <w:t>IAdbService</w:t>
             </w:r>
           </w:p>
         </w:tc>
@@ -1961,7 +2138,7 @@
               <w:rPr>
                 <w:sz w:val="20"/>
               </w:rPr>
-              <w:t>DevicePollWorker, DeviceEndpoints, InstallEndpoints, ApkEndpoints, InstallCoordinator</w:t>
+              <w:t>DevicePollWorker (via IAdbService), InstallCoordinator, LaunchAppEndpoints, DeviceConnectionEndpoints, HealthEndpoints</w:t>
             </w:r>
           </w:p>
         </w:tc>
@@ -2001,7 +2178,7 @@
               <w:rPr>
                 <w:sz w:val="20"/>
               </w:rPr>
-              <w:t>2026-08-10</w:t>
+              <w:t>2026-08-19</w:t>
             </w:r>
           </w:p>
         </w:tc>
@@ -2024,7 +2201,7 @@
                 <w:color w:val="F05922"/>
                 <w:sz w:val="20"/>
               </w:rPr>
-              <w:t>Services/ApkManifestReader</w:t>
+              <w:t>Services/DeviceRepository</w:t>
             </w:r>
           </w:p>
         </w:tc>
@@ -2043,7 +2220,7 @@
               <w:rPr>
                 <w:sz w:val="20"/>
               </w:rPr>
-              <w:t>System.IO.Compression</w:t>
+              <w:t>IOptions\&lt;AdbSettings\&gt;, Microsoft.Data.Sqlite, Models/DeviceRecord</w:t>
             </w:r>
           </w:p>
         </w:tc>
@@ -2062,7 +2239,7 @@
               <w:rPr>
                 <w:sz w:val="20"/>
               </w:rPr>
-              <w:t>ApkEndpoints</w:t>
+              <w:t>DevicePollWorker, DeviceEndpoints, InstallEndpoints, ApkEndpoints, InstallCoordinator</w:t>
             </w:r>
           </w:p>
         </w:tc>
@@ -2124,7 +2301,7 @@
                 <w:color w:val="F05922"/>
                 <w:sz w:val="20"/>
               </w:rPr>
-              <w:t>Services/InstallCoordinator</w:t>
+              <w:t>Services/ApkManifestReader</w:t>
             </w:r>
           </w:p>
         </w:tc>
@@ -2144,7 +2321,7 @@
               <w:rPr>
                 <w:sz w:val="20"/>
               </w:rPr>
-              <w:t>AdbService, DeviceRepository, DeviceState, IHubContext\&lt;DeviceHub\&gt;</w:t>
+              <w:t>System.IO.Compression</w:t>
             </w:r>
           </w:p>
         </w:tc>
@@ -2164,7 +2341,7 @@
               <w:rPr>
                 <w:sz w:val="20"/>
               </w:rPr>
-              <w:t>InstallEndpoints</w:t>
+              <w:t>ApkEndpoints</w:t>
             </w:r>
           </w:p>
         </w:tc>
@@ -2227,7 +2404,7 @@
                 <w:color w:val="F05922"/>
                 <w:sz w:val="20"/>
               </w:rPr>
-              <w:t>Services/PollControlService</w:t>
+              <w:t>Services/InstallCoordinator</w:t>
             </w:r>
           </w:p>
         </w:tc>
@@ -2246,7 +2423,7 @@
               <w:rPr>
                 <w:sz w:val="20"/>
               </w:rPr>
-              <w:t>—</w:t>
+              <w:t>AdbService, DeviceRepository, DeviceState, IHubContext\&lt;DeviceHub\&gt;</w:t>
             </w:r>
           </w:p>
         </w:tc>
@@ -2265,7 +2442,7 @@
               <w:rPr>
                 <w:sz w:val="20"/>
               </w:rPr>
-              <w:t>DevicePollWorker, DeviceEndpoints, DeviceConnectionEndpoints</w:t>
+              <w:t>InstallEndpoints</w:t>
             </w:r>
           </w:p>
         </w:tc>
@@ -2303,7 +2480,7 @@
               <w:rPr>
                 <w:sz w:val="20"/>
               </w:rPr>
-              <w:t>2026-08-19</w:t>
+              <w:t>2026-08-10</w:t>
             </w:r>
           </w:p>
         </w:tc>
@@ -2327,7 +2504,7 @@
                 <w:color w:val="F05922"/>
                 <w:sz w:val="20"/>
               </w:rPr>
-              <w:t>Services/ScanCoordinator</w:t>
+              <w:t>Services/PollControlService</w:t>
             </w:r>
           </w:p>
         </w:tc>
@@ -2347,7 +2524,7 @@
               <w:rPr>
                 <w:sz w:val="20"/>
               </w:rPr>
-              <w:t>IHubContext\&lt;DeviceHub\&gt;, ScanRangeParser</w:t>
+              <w:t>—</w:t>
             </w:r>
           </w:p>
         </w:tc>
@@ -2367,7 +2544,7 @@
               <w:rPr>
                 <w:sz w:val="20"/>
               </w:rPr>
-              <w:t>ScanEndpoints</w:t>
+              <w:t>DevicePollWorker, DeviceEndpoints, DeviceConnectionEndpoints</w:t>
             </w:r>
           </w:p>
         </w:tc>
@@ -2407,7 +2584,7 @@
               <w:rPr>
                 <w:sz w:val="20"/>
               </w:rPr>
-              <w:t>2026-08-10</w:t>
+              <w:t>2026-08-19</w:t>
             </w:r>
           </w:p>
         </w:tc>
@@ -2430,7 +2607,7 @@
                 <w:color w:val="F05922"/>
                 <w:sz w:val="20"/>
               </w:rPr>
-              <w:t>Services/ScanRangeParser</w:t>
+              <w:t>Services/ScanCoordinator</w:t>
             </w:r>
           </w:p>
         </w:tc>
@@ -2449,7 +2626,7 @@
               <w:rPr>
                 <w:sz w:val="20"/>
               </w:rPr>
-              <w:t>—</w:t>
+              <w:t>IHubContext\&lt;DeviceHub\&gt;, ScanRangeParser</w:t>
             </w:r>
           </w:p>
         </w:tc>
@@ -2468,7 +2645,7 @@
               <w:rPr>
                 <w:sz w:val="20"/>
               </w:rPr>
-              <w:t>ScanCoordinator</w:t>
+              <w:t>ScanEndpoints</w:t>
             </w:r>
           </w:p>
         </w:tc>
@@ -2530,7 +2707,7 @@
                 <w:color w:val="F05922"/>
                 <w:sz w:val="20"/>
               </w:rPr>
-              <w:t>State/DeviceState</w:t>
+              <w:t>Services/ScanRangeParser</w:t>
             </w:r>
           </w:p>
         </w:tc>
@@ -2550,7 +2727,7 @@
               <w:rPr>
                 <w:sz w:val="20"/>
               </w:rPr>
-              <w:t>System.Collections.Concurrent, Models/DeviceRecord</w:t>
+              <w:t>—</w:t>
             </w:r>
           </w:p>
         </w:tc>
@@ -2570,7 +2747,7 @@
               <w:rPr>
                 <w:sz w:val="20"/>
               </w:rPr>
-              <w:t>DevicePollWorker, DeviceEndpoints, InstallEndpoints, InstallCoordinator, LaunchAppEndpoints, DeviceConnectionEndpoints</w:t>
+              <w:t>ScanCoordinator</w:t>
             </w:r>
           </w:p>
         </w:tc>
@@ -2610,7 +2787,7 @@
               <w:rPr>
                 <w:sz w:val="20"/>
               </w:rPr>
-              <w:t>2026-08-19</w:t>
+              <w:t>2026-08-10</w:t>
             </w:r>
           </w:p>
         </w:tc>
@@ -2633,7 +2810,7 @@
                 <w:color w:val="F05922"/>
                 <w:sz w:val="20"/>
               </w:rPr>
-              <w:t>Endpoints/ApiKeyEndpointFilter</w:t>
+              <w:t>State/DeviceState</w:t>
             </w:r>
           </w:p>
         </w:tc>
@@ -2652,7 +2829,7 @@
               <w:rPr>
                 <w:sz w:val="20"/>
               </w:rPr>
-              <w:t>IOptions\&lt;LaunchAppSettings\&gt;, ILogger</w:t>
+              <w:t>System.Collections.Concurrent, Models/DeviceRecord</w:t>
             </w:r>
           </w:p>
         </w:tc>
@@ -2671,7 +2848,7 @@
               <w:rPr>
                 <w:sz w:val="20"/>
               </w:rPr>
-              <w:t>LaunchAppEndpoints (.AddEndpointFilter), DeviceConnectionEndpoints (.AddEndpointFilter)</w:t>
+              <w:t>DevicePollWorker, DeviceEndpoints, InstallEndpoints, InstallCoordinator, LaunchAppEndpoints, DeviceConnectionEndpoints</w:t>
             </w:r>
           </w:p>
         </w:tc>
@@ -2733,7 +2910,7 @@
                 <w:color w:val="F05922"/>
                 <w:sz w:val="20"/>
               </w:rPr>
-              <w:t>Endpoints/LaunchAppEndpoints</w:t>
+              <w:t>Endpoints/ApiKeyEndpointFilter</w:t>
             </w:r>
           </w:p>
         </w:tc>
@@ -2753,7 +2930,7 @@
               <w:rPr>
                 <w:sz w:val="20"/>
               </w:rPr>
-              <w:t>DeviceState, AdbService, ApiKeyEndpointFilter, ILoggerFactory</w:t>
+              <w:t>IOptions\&lt;LaunchAppSettings\&gt;, ILogger</w:t>
             </w:r>
           </w:p>
         </w:tc>
@@ -2773,7 +2950,7 @@
               <w:rPr>
                 <w:sz w:val="20"/>
               </w:rPr>
-              <w:t>Program.cs (MapLaunchAppEndpoints)</w:t>
+              <w:t>LaunchAppEndpoints (.AddEndpointFilter), DeviceConnectionEndpoints (.AddEndpointFilter)</w:t>
             </w:r>
           </w:p>
         </w:tc>
@@ -2813,7 +2990,7 @@
               <w:rPr>
                 <w:sz w:val="20"/>
               </w:rPr>
-              <w:t>2026-08-18</w:t>
+              <w:t>2026-08-19</w:t>
             </w:r>
           </w:p>
         </w:tc>
@@ -2836,7 +3013,7 @@
                 <w:color w:val="F05922"/>
                 <w:sz w:val="20"/>
               </w:rPr>
-              <w:t>Endpoints/DeviceConnectionEndpoints</w:t>
+              <w:t>Endpoints/LaunchAppEndpoints</w:t>
             </w:r>
           </w:p>
         </w:tc>
@@ -2855,7 +3032,7 @@
               <w:rPr>
                 <w:sz w:val="20"/>
               </w:rPr>
-              <w:t>AdbService, PollControlService, DeviceState, ApiKeyEndpointFilter, ILoggerFactory</w:t>
+              <w:t>DeviceState, AdbService, ApiKeyEndpointFilter, ILoggerFactory</w:t>
             </w:r>
           </w:p>
         </w:tc>
@@ -2874,7 +3051,7 @@
               <w:rPr>
                 <w:sz w:val="20"/>
               </w:rPr>
-              <w:t>Program.cs (MapDeviceConnectionEndpoints)</w:t>
+              <w:t>Program.cs (MapLaunchAppEndpoints)</w:t>
             </w:r>
           </w:p>
         </w:tc>
@@ -2912,7 +3089,7 @@
               <w:rPr>
                 <w:sz w:val="20"/>
               </w:rPr>
-              <w:t>2026-08-19</w:t>
+              <w:t>2026-08-18</w:t>
             </w:r>
           </w:p>
         </w:tc>
@@ -2936,7 +3113,7 @@
                 <w:color w:val="F05922"/>
                 <w:sz w:val="20"/>
               </w:rPr>
-              <w:t>Hubs/DeviceHub</w:t>
+              <w:t>Endpoints/DeviceConnectionEndpoints</w:t>
             </w:r>
           </w:p>
         </w:tc>
@@ -2956,7 +3133,7 @@
               <w:rPr>
                 <w:sz w:val="20"/>
               </w:rPr>
-              <w:t>Microsoft.AspNetCore.SignalR.Hub</w:t>
+              <w:t>AdbService, PollControlService, DeviceState, ApiKeyEndpointFilter, ILoggerFactory</w:t>
             </w:r>
           </w:p>
         </w:tc>
@@ -2976,7 +3153,7 @@
               <w:rPr>
                 <w:sz w:val="20"/>
               </w:rPr>
-              <w:t>Program.cs (MapHub), DevicePollWorker, InstallCoordinator, ScanCoordinator</w:t>
+              <w:t>Program.cs (MapDeviceConnectionEndpoints)</w:t>
             </w:r>
           </w:p>
         </w:tc>
@@ -3016,7 +3193,7 @@
               <w:rPr>
                 <w:sz w:val="20"/>
               </w:rPr>
-              <w:t>2026-08-10</w:t>
+              <w:t>2026-08-19</w:t>
             </w:r>
           </w:p>
         </w:tc>
@@ -3039,7 +3216,7 @@
                 <w:color w:val="F05922"/>
                 <w:sz w:val="20"/>
               </w:rPr>
-              <w:t>Workers/DevicePollWorker</w:t>
+              <w:t>Hubs/DeviceHub</w:t>
             </w:r>
           </w:p>
         </w:tc>
@@ -3058,7 +3235,7 @@
               <w:rPr>
                 <w:sz w:val="20"/>
               </w:rPr>
-              <w:t>IOptions\&lt;AdbSettings\&gt;, AdbService, DeviceRepository, DeviceState, PollControlService, IHubContext\&lt;DeviceHub\&gt;</w:t>
+              <w:t>Microsoft.AspNetCore.SignalR.Hub</w:t>
             </w:r>
           </w:p>
         </w:tc>
@@ -3077,7 +3254,7 @@
               <w:rPr>
                 <w:sz w:val="20"/>
               </w:rPr>
-              <w:t>Program.cs (AddHostedService)</w:t>
+              <w:t>Program.cs (MapHub), DevicePollWorker, InstallCoordinator, ScanCoordinator</w:t>
             </w:r>
           </w:p>
         </w:tc>
@@ -3139,7 +3316,7 @@
                 <w:color w:val="F05922"/>
                 <w:sz w:val="20"/>
               </w:rPr>
-              <w:t>Models/DeviceRecord</w:t>
+              <w:t>Workers/DevicePollWorker</w:t>
             </w:r>
           </w:p>
         </w:tc>
@@ -3159,7 +3336,20 @@
               <w:rPr>
                 <w:sz w:val="20"/>
               </w:rPr>
-              <w:t>—</w:t>
+              <w:t xml:space="preserve">IOptions\&lt;AdbSettings\&gt;, </w:t>
+            </w:r>
+            <w:r>
+              <w:rPr>
+                <w:b/>
+                <w:sz w:val="20"/>
+              </w:rPr>
+              <w:t>IAdbService</w:t>
+            </w:r>
+            <w:r>
+              <w:rPr>
+                <w:sz w:val="20"/>
+              </w:rPr>
+              <w:t xml:space="preserve"> (không còn phụ thuộc AdbService trực tiếp), DeviceRepository, DeviceState, PollControlService, IHubContext\&lt;DeviceHub\&gt;</w:t>
             </w:r>
           </w:p>
         </w:tc>
@@ -3179,7 +3369,7 @@
               <w:rPr>
                 <w:sz w:val="20"/>
               </w:rPr>
-              <w:t>DeviceRepository, DeviceState, DevicePollWorker, InstallCoordinator, API JSON response</w:t>
+              <w:t>Program.cs (AddHostedService)</w:t>
             </w:r>
           </w:p>
         </w:tc>
@@ -3219,7 +3409,7 @@
               <w:rPr>
                 <w:sz w:val="20"/>
               </w:rPr>
-              <w:t>2026-08-10</w:t>
+              <w:t>2026-08-19</w:t>
             </w:r>
           </w:p>
         </w:tc>
@@ -3242,7 +3432,7 @@
                 <w:color w:val="F05922"/>
                 <w:sz w:val="20"/>
               </w:rPr>
-              <w:t>Endpoints/DeviceEndpoints</w:t>
+              <w:t>Models/DeviceRecord</w:t>
             </w:r>
           </w:p>
         </w:tc>
@@ -3261,7 +3451,7 @@
               <w:rPr>
                 <w:sz w:val="20"/>
               </w:rPr>
-              <w:t>DeviceRepository, DeviceState, AdbService, PollControlService</w:t>
+              <w:t>—</w:t>
             </w:r>
           </w:p>
         </w:tc>
@@ -3280,7 +3470,7 @@
               <w:rPr>
                 <w:sz w:val="20"/>
               </w:rPr>
-              <w:t>Program.cs (MapDeviceEndpoints)</w:t>
+              <w:t>DeviceRepository, DeviceState, DevicePollWorker, InstallCoordinator, API JSON response</w:t>
             </w:r>
           </w:p>
         </w:tc>
@@ -3342,7 +3532,7 @@
                 <w:color w:val="F05922"/>
                 <w:sz w:val="20"/>
               </w:rPr>
-              <w:t>Endpoints/InstallEndpoints</w:t>
+              <w:t>Endpoints/DeviceEndpoints</w:t>
             </w:r>
           </w:p>
         </w:tc>
@@ -3362,7 +3552,7 @@
               <w:rPr>
                 <w:sz w:val="20"/>
               </w:rPr>
-              <w:t>DeviceState, DeviceRepository, InstallCoordinator</w:t>
+              <w:t>DeviceRepository, DeviceState, AdbService, PollControlService</w:t>
             </w:r>
           </w:p>
         </w:tc>
@@ -3382,7 +3572,7 @@
               <w:rPr>
                 <w:sz w:val="20"/>
               </w:rPr>
-              <w:t>Program.cs (MapInstallEndpoints)</w:t>
+              <w:t>Program.cs (MapDeviceEndpoints)</w:t>
             </w:r>
           </w:p>
         </w:tc>
@@ -3445,7 +3635,7 @@
                 <w:color w:val="F05922"/>
                 <w:sz w:val="20"/>
               </w:rPr>
-              <w:t>Endpoints/ScanEndpoints</w:t>
+              <w:t>Endpoints/InstallEndpoints</w:t>
             </w:r>
           </w:p>
         </w:tc>
@@ -3464,7 +3654,7 @@
               <w:rPr>
                 <w:sz w:val="20"/>
               </w:rPr>
-              <w:t>ScanCoordinator</w:t>
+              <w:t>DeviceState, DeviceRepository, InstallCoordinator</w:t>
             </w:r>
           </w:p>
         </w:tc>
@@ -3483,7 +3673,7 @@
               <w:rPr>
                 <w:sz w:val="20"/>
               </w:rPr>
-              <w:t>Program.cs (MapScanEndpoints)</w:t>
+              <w:t>Program.cs (MapInstallEndpoints)</w:t>
             </w:r>
           </w:p>
         </w:tc>
@@ -3545,7 +3735,7 @@
                 <w:color w:val="F05922"/>
                 <w:sz w:val="20"/>
               </w:rPr>
-              <w:t>Endpoints/ApkEndpoints</w:t>
+              <w:t>Endpoints/ScanEndpoints</w:t>
             </w:r>
           </w:p>
         </w:tc>
@@ -3565,7 +3755,7 @@
               <w:rPr>
                 <w:sz w:val="20"/>
               </w:rPr>
-              <w:t>IOptions\&lt;AdbSettings\&gt;, ApkManifestReader, DeviceRepository</w:t>
+              <w:t>ScanCoordinator</w:t>
             </w:r>
           </w:p>
         </w:tc>
@@ -3585,7 +3775,7 @@
               <w:rPr>
                 <w:sz w:val="20"/>
               </w:rPr>
-              <w:t>Program.cs (MapApkEndpoints)</w:t>
+              <w:t>Program.cs (MapScanEndpoints)</w:t>
             </w:r>
           </w:p>
         </w:tc>
@@ -3648,7 +3838,7 @@
                 <w:color w:val="F05922"/>
                 <w:sz w:val="20"/>
               </w:rPr>
-              <w:t>Endpoints/HealthEndpoints</w:t>
+              <w:t>Endpoints/ApkEndpoints</w:t>
             </w:r>
           </w:p>
         </w:tc>
@@ -3667,7 +3857,7 @@
               <w:rPr>
                 <w:sz w:val="20"/>
               </w:rPr>
-              <w:t>—</w:t>
+              <w:t>IOptions\&lt;AdbSettings\&gt;, ApkManifestReader, DeviceRepository</w:t>
             </w:r>
           </w:p>
         </w:tc>
@@ -3686,7 +3876,7 @@
               <w:rPr>
                 <w:sz w:val="20"/>
               </w:rPr>
-              <w:t>Program.cs (MapHealthEndpoints)</w:t>
+              <w:t>Program.cs (MapApkEndpoints)</w:t>
             </w:r>
           </w:p>
         </w:tc>
@@ -3748,7 +3938,7 @@
                 <w:color w:val="F05922"/>
                 <w:sz w:val="20"/>
               </w:rPr>
-              <w:t>Pages/Index</w:t>
+              <w:t>Endpoints/HealthEndpoints</w:t>
             </w:r>
           </w:p>
         </w:tc>
@@ -3768,7 +3958,7 @@
               <w:rPr>
                 <w:sz w:val="20"/>
               </w:rPr>
-              <w:t>IndexModel : PageModel</w:t>
+              <w:t>—</w:t>
             </w:r>
           </w:p>
         </w:tc>
@@ -3788,7 +3978,7 @@
               <w:rPr>
                 <w:sz w:val="20"/>
               </w:rPr>
-              <w:t>Router (/)</w:t>
+              <w:t>Program.cs (MapHealthEndpoints)</w:t>
             </w:r>
           </w:p>
         </w:tc>
@@ -3851,7 +4041,7 @@
                 <w:color w:val="F05922"/>
                 <w:sz w:val="20"/>
               </w:rPr>
-              <w:t>wwwroot/js/signalr-client.js</w:t>
+              <w:t>Pages/Index</w:t>
             </w:r>
           </w:p>
         </w:tc>
@@ -3870,7 +4060,7 @@
               <w:rPr>
                 <w:sz w:val="20"/>
               </w:rPr>
-              <w:t>signalr.min.js (local lib)</w:t>
+              <w:t>IndexModel : PageModel</w:t>
             </w:r>
           </w:p>
         </w:tc>
@@ -3889,7 +4079,7 @@
               <w:rPr>
                 <w:sz w:val="20"/>
               </w:rPr>
-              <w:t>_Layout.cshtml</w:t>
+              <w:t>Router (/)</w:t>
             </w:r>
           </w:p>
         </w:tc>
@@ -3951,7 +4141,7 @@
                 <w:color w:val="F05922"/>
                 <w:sz w:val="20"/>
               </w:rPr>
-              <w:t>wwwroot/js/dashboard.js</w:t>
+              <w:t>wwwroot/js/signalr-client.js</w:t>
             </w:r>
           </w:p>
         </w:tc>
@@ -3971,7 +4161,7 @@
               <w:rPr>
                 <w:sz w:val="20"/>
               </w:rPr>
-              <w:t>signalr-client.js, bootstrap.bundle.min.js (local)</w:t>
+              <w:t>signalr.min.js (local lib)</w:t>
             </w:r>
           </w:p>
         </w:tc>
@@ -4054,6 +4244,106 @@
                 <w:color w:val="F05922"/>
                 <w:sz w:val="20"/>
               </w:rPr>
+              <w:t>wwwroot/js/dashboard.js</w:t>
+            </w:r>
+          </w:p>
+        </w:tc>
+        <w:tc>
+          <w:tcPr>
+            <w:tcW w:type="dxa" w:w="1938"/>
+            <w:tcBorders>
+              <w:top w:val="single" w:sz="4" w:space="0" w:color="CBCBCB"/>
+              <w:left w:val="single" w:sz="4" w:space="0" w:color="CBCBCB"/>
+              <w:bottom w:val="single" w:sz="4" w:space="0" w:color="CBCBCB"/>
+              <w:right w:val="single" w:sz="4" w:space="0" w:color="CBCBCB"/>
+            </w:tcBorders>
+          </w:tcPr>
+          <w:p>
+            <w:r>
+              <w:rPr>
+                <w:sz w:val="20"/>
+              </w:rPr>
+              <w:t>signalr-client.js, bootstrap.bundle.min.js (local)</w:t>
+            </w:r>
+          </w:p>
+        </w:tc>
+        <w:tc>
+          <w:tcPr>
+            <w:tcW w:type="dxa" w:w="1938"/>
+            <w:tcBorders>
+              <w:top w:val="single" w:sz="4" w:space="0" w:color="CBCBCB"/>
+              <w:left w:val="single" w:sz="4" w:space="0" w:color="CBCBCB"/>
+              <w:bottom w:val="single" w:sz="4" w:space="0" w:color="CBCBCB"/>
+              <w:right w:val="single" w:sz="4" w:space="0" w:color="CBCBCB"/>
+            </w:tcBorders>
+          </w:tcPr>
+          <w:p>
+            <w:r>
+              <w:rPr>
+                <w:sz w:val="20"/>
+              </w:rPr>
+              <w:t>_Layout.cshtml</w:t>
+            </w:r>
+          </w:p>
+        </w:tc>
+        <w:tc>
+          <w:tcPr>
+            <w:tcW w:type="dxa" w:w="1938"/>
+            <w:tcBorders>
+              <w:top w:val="single" w:sz="4" w:space="0" w:color="CBCBCB"/>
+              <w:left w:val="single" w:sz="4" w:space="0" w:color="CBCBCB"/>
+              <w:bottom w:val="single" w:sz="4" w:space="0" w:color="CBCBCB"/>
+              <w:right w:val="single" w:sz="4" w:space="0" w:color="CBCBCB"/>
+            </w:tcBorders>
+          </w:tcPr>
+          <w:p>
+            <w:r>
+              <w:rPr>
+                <w:sz w:val="20"/>
+              </w:rPr>
+              <w:t>CONFIRMED</w:t>
+            </w:r>
+          </w:p>
+        </w:tc>
+        <w:tc>
+          <w:tcPr>
+            <w:tcW w:type="dxa" w:w="1938"/>
+            <w:tcBorders>
+              <w:top w:val="single" w:sz="4" w:space="0" w:color="CBCBCB"/>
+              <w:left w:val="single" w:sz="4" w:space="0" w:color="CBCBCB"/>
+              <w:bottom w:val="single" w:sz="4" w:space="0" w:color="CBCBCB"/>
+              <w:right w:val="single" w:sz="4" w:space="0" w:color="CBCBCB"/>
+            </w:tcBorders>
+          </w:tcPr>
+          <w:p>
+            <w:r>
+              <w:rPr>
+                <w:sz w:val="20"/>
+              </w:rPr>
+              <w:t>2026-08-10</w:t>
+            </w:r>
+          </w:p>
+        </w:tc>
+      </w:tr>
+      <w:tr>
+        <w:tc>
+          <w:tcPr>
+            <w:tcW w:type="dxa" w:w="1938"/>
+            <w:shd w:val="clear" w:color="auto" w:fill="B8B3D6"/>
+            <w:tcBorders>
+              <w:top w:val="single" w:sz="4" w:space="0" w:color="CBCBCB"/>
+              <w:left w:val="single" w:sz="4" w:space="0" w:color="CBCBCB"/>
+              <w:bottom w:val="single" w:sz="4" w:space="0" w:color="CBCBCB"/>
+              <w:right w:val="single" w:sz="4" w:space="0" w:color="CBCBCB"/>
+            </w:tcBorders>
+          </w:tcPr>
+          <w:p>
+            <w:r>
+              <w:rPr>
+                <w:rFonts w:ascii="Courier New" w:hAnsi="Courier New"/>
+                <w:color w:val="F05922"/>
+                <w:sz w:val="20"/>
+              </w:rPr>
               <w:t>wwwroot/js/scan-modal.js</w:t>
             </w:r>
           </w:p>
@@ -4061,6 +4351,7 @@
         <w:tc>
           <w:tcPr>
             <w:tcW w:type="dxa" w:w="1938"/>
+            <w:shd w:val="clear" w:color="auto" w:fill="B8B3D6"/>
             <w:tcBorders>
               <w:top w:val="single" w:sz="4" w:space="0" w:color="CBCBCB"/>
               <w:left w:val="single" w:sz="4" w:space="0" w:color="CBCBCB"/>
@@ -4080,6 +4371,7 @@
         <w:tc>
           <w:tcPr>
             <w:tcW w:type="dxa" w:w="1938"/>
+            <w:shd w:val="clear" w:color="auto" w:fill="B8B3D6"/>
             <w:tcBorders>
               <w:top w:val="single" w:sz="4" w:space="0" w:color="CBCBCB"/>
               <w:left w:val="single" w:sz="4" w:space="0" w:color="CBCBCB"/>
@@ -4099,6 +4391,7 @@
         <w:tc>
           <w:tcPr>
             <w:tcW w:type="dxa" w:w="1938"/>
+            <w:shd w:val="clear" w:color="auto" w:fill="B8B3D6"/>
             <w:tcBorders>
               <w:top w:val="single" w:sz="4" w:space="0" w:color="CBCBCB"/>
               <w:left w:val="single" w:sz="4" w:space="0" w:color="CBCBCB"/>
@@ -4118,6 +4411,7 @@
         <w:tc>
           <w:tcPr>
             <w:tcW w:type="dxa" w:w="1938"/>
+            <w:shd w:val="clear" w:color="auto" w:fill="B8B3D6"/>
             <w:tcBorders>
               <w:top w:val="single" w:sz="4" w:space="0" w:color="CBCBCB"/>
               <w:left w:val="single" w:sz="4" w:space="0" w:color="CBCBCB"/>
@@ -7918,6 +8212,556 @@
                 <w:sz w:val="20"/>
               </w:rPr>
               <w:t xml:space="preserve"> — parity WinForms MainForm.cs:572-577</w:t>
+            </w:r>
+          </w:p>
+        </w:tc>
+      </w:tr>
+      <w:tr>
+        <w:tc>
+          <w:tcPr>
+            <w:tcW w:type="dxa" w:w="3230"/>
+            <w:tcBorders>
+              <w:top w:val="single" w:sz="4" w:space="0" w:color="CBCBCB"/>
+              <w:left w:val="single" w:sz="4" w:space="0" w:color="CBCBCB"/>
+              <w:bottom w:val="single" w:sz="4" w:space="0" w:color="CBCBCB"/>
+              <w:right w:val="single" w:sz="4" w:space="0" w:color="CBCBCB"/>
+            </w:tcBorders>
+          </w:tcPr>
+          <w:p>
+            <w:r>
+              <w:rPr>
+                <w:sz w:val="20"/>
+              </w:rPr>
+              <w:t>2026-08-19</w:t>
+            </w:r>
+          </w:p>
+        </w:tc>
+        <w:tc>
+          <w:tcPr>
+            <w:tcW w:type="dxa" w:w="3230"/>
+            <w:tcBorders>
+              <w:top w:val="single" w:sz="4" w:space="0" w:color="CBCBCB"/>
+              <w:left w:val="single" w:sz="4" w:space="0" w:color="CBCBCB"/>
+              <w:bottom w:val="single" w:sz="4" w:space="0" w:color="CBCBCB"/>
+              <w:right w:val="single" w:sz="4" w:space="0" w:color="CBCBCB"/>
+            </w:tcBorders>
+          </w:tcPr>
+          <w:p>
+            <w:r>
+              <w:rPr>
+                <w:rFonts w:ascii="Courier New" w:hAnsi="Courier New"/>
+                <w:color w:val="F05922"/>
+                <w:sz w:val="20"/>
+              </w:rPr>
+              <w:t>Services/IAdbService.cs</w:t>
+            </w:r>
+          </w:p>
+        </w:tc>
+        <w:tc>
+          <w:tcPr>
+            <w:tcW w:type="dxa" w:w="3230"/>
+            <w:tcBorders>
+              <w:top w:val="single" w:sz="4" w:space="0" w:color="CBCBCB"/>
+              <w:left w:val="single" w:sz="4" w:space="0" w:color="CBCBCB"/>
+              <w:bottom w:val="single" w:sz="4" w:space="0" w:color="CBCBCB"/>
+              <w:right w:val="single" w:sz="4" w:space="0" w:color="CBCBCB"/>
+            </w:tcBorders>
+          </w:tcPr>
+          <w:p>
+            <w:r>
+              <w:rPr>
+                <w:b/>
+                <w:sz w:val="20"/>
+              </w:rPr>
+              <w:t>MỚI</w:t>
+            </w:r>
+            <w:r>
+              <w:rPr>
+                <w:sz w:val="20"/>
+              </w:rPr>
+              <w:t xml:space="preserve"> — interface cho AdbService (GetDevicesAsync, ConnectAsync, GetPackageVersionAsync) — phục vụ testability của DevicePollWorker</w:t>
+            </w:r>
+          </w:p>
+        </w:tc>
+      </w:tr>
+      <w:tr>
+        <w:tc>
+          <w:tcPr>
+            <w:tcW w:type="dxa" w:w="3230"/>
+            <w:shd w:val="clear" w:color="auto" w:fill="B8B3D6"/>
+            <w:tcBorders>
+              <w:top w:val="single" w:sz="4" w:space="0" w:color="CBCBCB"/>
+              <w:left w:val="single" w:sz="4" w:space="0" w:color="CBCBCB"/>
+              <w:bottom w:val="single" w:sz="4" w:space="0" w:color="CBCBCB"/>
+              <w:right w:val="single" w:sz="4" w:space="0" w:color="CBCBCB"/>
+            </w:tcBorders>
+          </w:tcPr>
+          <w:p>
+            <w:r>
+              <w:rPr>
+                <w:sz w:val="20"/>
+              </w:rPr>
+              <w:t>2026-08-19</w:t>
+            </w:r>
+          </w:p>
+        </w:tc>
+        <w:tc>
+          <w:tcPr>
+            <w:tcW w:type="dxa" w:w="3230"/>
+            <w:shd w:val="clear" w:color="auto" w:fill="B8B3D6"/>
+            <w:tcBorders>
+              <w:top w:val="single" w:sz="4" w:space="0" w:color="CBCBCB"/>
+              <w:left w:val="single" w:sz="4" w:space="0" w:color="CBCBCB"/>
+              <w:bottom w:val="single" w:sz="4" w:space="0" w:color="CBCBCB"/>
+              <w:right w:val="single" w:sz="4" w:space="0" w:color="CBCBCB"/>
+            </w:tcBorders>
+          </w:tcPr>
+          <w:p>
+            <w:r>
+              <w:rPr>
+                <w:rFonts w:ascii="Courier New" w:hAnsi="Courier New"/>
+                <w:color w:val="F05922"/>
+                <w:sz w:val="20"/>
+              </w:rPr>
+              <w:t>Services/AdbService.cs</w:t>
+            </w:r>
+          </w:p>
+        </w:tc>
+        <w:tc>
+          <w:tcPr>
+            <w:tcW w:type="dxa" w:w="3230"/>
+            <w:shd w:val="clear" w:color="auto" w:fill="B8B3D6"/>
+            <w:tcBorders>
+              <w:top w:val="single" w:sz="4" w:space="0" w:color="CBCBCB"/>
+              <w:left w:val="single" w:sz="4" w:space="0" w:color="CBCBCB"/>
+              <w:bottom w:val="single" w:sz="4" w:space="0" w:color="CBCBCB"/>
+              <w:right w:val="single" w:sz="4" w:space="0" w:color="CBCBCB"/>
+            </w:tcBorders>
+          </w:tcPr>
+          <w:p>
+            <w:r>
+              <w:rPr>
+                <w:sz w:val="20"/>
+              </w:rPr>
+              <w:t xml:space="preserve">Implement </w:t>
+            </w:r>
+            <w:r>
+              <w:rPr>
+                <w:rFonts w:ascii="Courier New" w:hAnsi="Courier New"/>
+                <w:color w:val="F05922"/>
+                <w:sz w:val="20"/>
+              </w:rPr>
+              <w:t>IAdbService</w:t>
+            </w:r>
+            <w:r>
+              <w:rPr>
+                <w:sz w:val="20"/>
+              </w:rPr>
+              <w:t xml:space="preserve"> (thêm </w:t>
+            </w:r>
+            <w:r>
+              <w:rPr>
+                <w:rFonts w:ascii="Courier New" w:hAnsi="Courier New"/>
+                <w:color w:val="F05922"/>
+                <w:sz w:val="20"/>
+              </w:rPr>
+              <w:t>: IAdbService</w:t>
+            </w:r>
+            <w:r>
+              <w:rPr>
+                <w:sz w:val="20"/>
+              </w:rPr>
+              <w:t xml:space="preserve"> vào class declaration)</w:t>
+            </w:r>
+          </w:p>
+        </w:tc>
+      </w:tr>
+      <w:tr>
+        <w:tc>
+          <w:tcPr>
+            <w:tcW w:type="dxa" w:w="3230"/>
+            <w:tcBorders>
+              <w:top w:val="single" w:sz="4" w:space="0" w:color="CBCBCB"/>
+              <w:left w:val="single" w:sz="4" w:space="0" w:color="CBCBCB"/>
+              <w:bottom w:val="single" w:sz="4" w:space="0" w:color="CBCBCB"/>
+              <w:right w:val="single" w:sz="4" w:space="0" w:color="CBCBCB"/>
+            </w:tcBorders>
+          </w:tcPr>
+          <w:p>
+            <w:r>
+              <w:rPr>
+                <w:sz w:val="20"/>
+              </w:rPr>
+              <w:t>2026-08-19</w:t>
+            </w:r>
+          </w:p>
+        </w:tc>
+        <w:tc>
+          <w:tcPr>
+            <w:tcW w:type="dxa" w:w="3230"/>
+            <w:tcBorders>
+              <w:top w:val="single" w:sz="4" w:space="0" w:color="CBCBCB"/>
+              <w:left w:val="single" w:sz="4" w:space="0" w:color="CBCBCB"/>
+              <w:bottom w:val="single" w:sz="4" w:space="0" w:color="CBCBCB"/>
+              <w:right w:val="single" w:sz="4" w:space="0" w:color="CBCBCB"/>
+            </w:tcBorders>
+          </w:tcPr>
+          <w:p>
+            <w:r>
+              <w:rPr>
+                <w:rFonts w:ascii="Courier New" w:hAnsi="Courier New"/>
+                <w:color w:val="F05922"/>
+                <w:sz w:val="20"/>
+              </w:rPr>
+              <w:t>Workers/DevicePollWorker.cs</w:t>
+            </w:r>
+          </w:p>
+        </w:tc>
+        <w:tc>
+          <w:tcPr>
+            <w:tcW w:type="dxa" w:w="3230"/>
+            <w:tcBorders>
+              <w:top w:val="single" w:sz="4" w:space="0" w:color="CBCBCB"/>
+              <w:left w:val="single" w:sz="4" w:space="0" w:color="CBCBCB"/>
+              <w:bottom w:val="single" w:sz="4" w:space="0" w:color="CBCBCB"/>
+              <w:right w:val="single" w:sz="4" w:space="0" w:color="CBCBCB"/>
+            </w:tcBorders>
+          </w:tcPr>
+          <w:p>
+            <w:r>
+              <w:rPr>
+                <w:b/>
+                <w:sz w:val="20"/>
+              </w:rPr>
+              <w:t>BUG FIX</w:t>
+            </w:r>
+            <w:r>
+              <w:rPr>
+                <w:sz w:val="20"/>
+              </w:rPr>
+              <w:t xml:space="preserve"> </w:t>
+            </w:r>
+            <w:r>
+              <w:rPr>
+                <w:rFonts w:ascii="Courier New" w:hAnsi="Courier New"/>
+                <w:color w:val="F05922"/>
+                <w:sz w:val="20"/>
+              </w:rPr>
+              <w:t>BUG-adb-reconnect-after-restart</w:t>
+            </w:r>
+            <w:r>
+              <w:rPr>
+                <w:sz w:val="20"/>
+              </w:rPr>
+              <w:t xml:space="preserve">: (1) Đổi dependency </w:t>
+            </w:r>
+            <w:r>
+              <w:rPr>
+                <w:rFonts w:ascii="Courier New" w:hAnsi="Courier New"/>
+                <w:color w:val="F05922"/>
+                <w:sz w:val="20"/>
+              </w:rPr>
+              <w:t>AdbService</w:t>
+            </w:r>
+            <w:r>
+              <w:rPr>
+                <w:sz w:val="20"/>
+              </w:rPr>
+              <w:t xml:space="preserve"> → </w:t>
+            </w:r>
+            <w:r>
+              <w:rPr>
+                <w:rFonts w:ascii="Courier New" w:hAnsi="Courier New"/>
+                <w:color w:val="F05922"/>
+                <w:sz w:val="20"/>
+              </w:rPr>
+              <w:t>IAdbService</w:t>
+            </w:r>
+            <w:r>
+              <w:rPr>
+                <w:sz w:val="20"/>
+              </w:rPr>
+              <w:t xml:space="preserve">; (2) Thêm </w:t>
+            </w:r>
+            <w:r>
+              <w:rPr>
+                <w:rFonts w:ascii="Courier New" w:hAnsi="Courier New"/>
+                <w:color w:val="F05922"/>
+                <w:sz w:val="20"/>
+              </w:rPr>
+              <w:t>WarmUpReconnectAsync(ct)</w:t>
+            </w:r>
+            <w:r>
+              <w:rPr>
+                <w:sz w:val="20"/>
+              </w:rPr>
+              <w:t xml:space="preserve"> (internal) — gọi </w:t>
+            </w:r>
+            <w:r>
+              <w:rPr>
+                <w:rFonts w:ascii="Courier New" w:hAnsi="Courier New"/>
+                <w:color w:val="F05922"/>
+                <w:sz w:val="20"/>
+              </w:rPr>
+              <w:t>ConnectAsync</w:t>
+            </w:r>
+            <w:r>
+              <w:rPr>
+                <w:sz w:val="20"/>
+              </w:rPr>
+              <w:t xml:space="preserve"> cho WiFi devices persist trước khi poll lần đầu</w:t>
+            </w:r>
+          </w:p>
+        </w:tc>
+      </w:tr>
+      <w:tr>
+        <w:tc>
+          <w:tcPr>
+            <w:tcW w:type="dxa" w:w="3230"/>
+            <w:shd w:val="clear" w:color="auto" w:fill="B8B3D6"/>
+            <w:tcBorders>
+              <w:top w:val="single" w:sz="4" w:space="0" w:color="CBCBCB"/>
+              <w:left w:val="single" w:sz="4" w:space="0" w:color="CBCBCB"/>
+              <w:bottom w:val="single" w:sz="4" w:space="0" w:color="CBCBCB"/>
+              <w:right w:val="single" w:sz="4" w:space="0" w:color="CBCBCB"/>
+            </w:tcBorders>
+          </w:tcPr>
+          <w:p>
+            <w:r>
+              <w:rPr>
+                <w:sz w:val="20"/>
+              </w:rPr>
+              <w:t>2026-08-19</w:t>
+            </w:r>
+          </w:p>
+        </w:tc>
+        <w:tc>
+          <w:tcPr>
+            <w:tcW w:type="dxa" w:w="3230"/>
+            <w:shd w:val="clear" w:color="auto" w:fill="B8B3D6"/>
+            <w:tcBorders>
+              <w:top w:val="single" w:sz="4" w:space="0" w:color="CBCBCB"/>
+              <w:left w:val="single" w:sz="4" w:space="0" w:color="CBCBCB"/>
+              <w:bottom w:val="single" w:sz="4" w:space="0" w:color="CBCBCB"/>
+              <w:right w:val="single" w:sz="4" w:space="0" w:color="CBCBCB"/>
+            </w:tcBorders>
+          </w:tcPr>
+          <w:p>
+            <w:r>
+              <w:rPr>
+                <w:rFonts w:ascii="Courier New" w:hAnsi="Courier New"/>
+                <w:color w:val="F05922"/>
+                <w:sz w:val="20"/>
+              </w:rPr>
+              <w:t>Program.cs</w:t>
+            </w:r>
+          </w:p>
+        </w:tc>
+        <w:tc>
+          <w:tcPr>
+            <w:tcW w:type="dxa" w:w="3230"/>
+            <w:shd w:val="clear" w:color="auto" w:fill="B8B3D6"/>
+            <w:tcBorders>
+              <w:top w:val="single" w:sz="4" w:space="0" w:color="CBCBCB"/>
+              <w:left w:val="single" w:sz="4" w:space="0" w:color="CBCBCB"/>
+              <w:bottom w:val="single" w:sz="4" w:space="0" w:color="CBCBCB"/>
+              <w:right w:val="single" w:sz="4" w:space="0" w:color="CBCBCB"/>
+            </w:tcBorders>
+          </w:tcPr>
+          <w:p>
+            <w:r>
+              <w:rPr>
+                <w:sz w:val="20"/>
+              </w:rPr>
+              <w:t xml:space="preserve">Thêm </w:t>
+            </w:r>
+            <w:r>
+              <w:rPr>
+                <w:rFonts w:ascii="Courier New" w:hAnsi="Courier New"/>
+                <w:color w:val="F05922"/>
+                <w:sz w:val="20"/>
+              </w:rPr>
+              <w:t>AddSingleton&lt;IAdbService&gt;</w:t>
+            </w:r>
+            <w:r>
+              <w:rPr>
+                <w:sz w:val="20"/>
+              </w:rPr>
+              <w:t xml:space="preserve"> → delegate sang </w:t>
+            </w:r>
+            <w:r>
+              <w:rPr>
+                <w:rFonts w:ascii="Courier New" w:hAnsi="Courier New"/>
+                <w:color w:val="F05922"/>
+                <w:sz w:val="20"/>
+              </w:rPr>
+              <w:t>AdbService</w:t>
+            </w:r>
+            <w:r>
+              <w:rPr>
+                <w:sz w:val="20"/>
+              </w:rPr>
+              <w:t xml:space="preserve"> singleton</w:t>
+            </w:r>
+          </w:p>
+        </w:tc>
+      </w:tr>
+      <w:tr>
+        <w:tc>
+          <w:tcPr>
+            <w:tcW w:type="dxa" w:w="3230"/>
+            <w:tcBorders>
+              <w:top w:val="single" w:sz="4" w:space="0" w:color="CBCBCB"/>
+              <w:left w:val="single" w:sz="4" w:space="0" w:color="CBCBCB"/>
+              <w:bottom w:val="single" w:sz="4" w:space="0" w:color="CBCBCB"/>
+              <w:right w:val="single" w:sz="4" w:space="0" w:color="CBCBCB"/>
+            </w:tcBorders>
+          </w:tcPr>
+          <w:p>
+            <w:r>
+              <w:rPr>
+                <w:sz w:val="20"/>
+              </w:rPr>
+              <w:t>2026-08-19</w:t>
+            </w:r>
+          </w:p>
+        </w:tc>
+        <w:tc>
+          <w:tcPr>
+            <w:tcW w:type="dxa" w:w="3230"/>
+            <w:tcBorders>
+              <w:top w:val="single" w:sz="4" w:space="0" w:color="CBCBCB"/>
+              <w:left w:val="single" w:sz="4" w:space="0" w:color="CBCBCB"/>
+              <w:bottom w:val="single" w:sz="4" w:space="0" w:color="CBCBCB"/>
+              <w:right w:val="single" w:sz="4" w:space="0" w:color="CBCBCB"/>
+            </w:tcBorders>
+          </w:tcPr>
+          <w:p>
+            <w:r>
+              <w:rPr>
+                <w:rFonts w:ascii="Courier New" w:hAnsi="Courier New"/>
+                <w:color w:val="F05922"/>
+                <w:sz w:val="20"/>
+              </w:rPr>
+              <w:t>KztekAdbPublishTool.Web.csproj</w:t>
+            </w:r>
+          </w:p>
+        </w:tc>
+        <w:tc>
+          <w:tcPr>
+            <w:tcW w:type="dxa" w:w="3230"/>
+            <w:tcBorders>
+              <w:top w:val="single" w:sz="4" w:space="0" w:color="CBCBCB"/>
+              <w:left w:val="single" w:sz="4" w:space="0" w:color="CBCBCB"/>
+              <w:bottom w:val="single" w:sz="4" w:space="0" w:color="CBCBCB"/>
+              <w:right w:val="single" w:sz="4" w:space="0" w:color="CBCBCB"/>
+            </w:tcBorders>
+          </w:tcPr>
+          <w:p>
+            <w:r>
+              <w:rPr>
+                <w:sz w:val="20"/>
+              </w:rPr>
+              <w:t xml:space="preserve">Thêm </w:t>
+            </w:r>
+            <w:r>
+              <w:rPr>
+                <w:rFonts w:ascii="Courier New" w:hAnsi="Courier New"/>
+                <w:color w:val="F05922"/>
+                <w:sz w:val="20"/>
+              </w:rPr>
+              <w:t>InternalsVisibleTo</w:t>
+            </w:r>
+            <w:r>
+              <w:rPr>
+                <w:sz w:val="20"/>
+              </w:rPr>
+              <w:t xml:space="preserve"> cho test project</w:t>
+            </w:r>
+          </w:p>
+        </w:tc>
+      </w:tr>
+      <w:tr>
+        <w:tc>
+          <w:tcPr>
+            <w:tcW w:type="dxa" w:w="3230"/>
+            <w:shd w:val="clear" w:color="auto" w:fill="B8B3D6"/>
+            <w:tcBorders>
+              <w:top w:val="single" w:sz="4" w:space="0" w:color="CBCBCB"/>
+              <w:left w:val="single" w:sz="4" w:space="0" w:color="CBCBCB"/>
+              <w:bottom w:val="single" w:sz="4" w:space="0" w:color="CBCBCB"/>
+              <w:right w:val="single" w:sz="4" w:space="0" w:color="CBCBCB"/>
+            </w:tcBorders>
+          </w:tcPr>
+          <w:p>
+            <w:r>
+              <w:rPr>
+                <w:sz w:val="20"/>
+              </w:rPr>
+              <w:t>2026-08-19</w:t>
+            </w:r>
+          </w:p>
+        </w:tc>
+        <w:tc>
+          <w:tcPr>
+            <w:tcW w:type="dxa" w:w="3230"/>
+            <w:shd w:val="clear" w:color="auto" w:fill="B8B3D6"/>
+            <w:tcBorders>
+              <w:top w:val="single" w:sz="4" w:space="0" w:color="CBCBCB"/>
+              <w:left w:val="single" w:sz="4" w:space="0" w:color="CBCBCB"/>
+              <w:bottom w:val="single" w:sz="4" w:space="0" w:color="CBCBCB"/>
+              <w:right w:val="single" w:sz="4" w:space="0" w:color="CBCBCB"/>
+            </w:tcBorders>
+          </w:tcPr>
+          <w:p>
+            <w:r>
+              <w:rPr>
+                <w:rFonts w:ascii="Courier New" w:hAnsi="Courier New"/>
+                <w:color w:val="F05922"/>
+                <w:sz w:val="20"/>
+              </w:rPr>
+              <w:t>tests/.../DevicePollWorkerWarmUpTests.cs</w:t>
+            </w:r>
+          </w:p>
+        </w:tc>
+        <w:tc>
+          <w:tcPr>
+            <w:tcW w:type="dxa" w:w="3230"/>
+            <w:shd w:val="clear" w:color="auto" w:fill="B8B3D6"/>
+            <w:tcBorders>
+              <w:top w:val="single" w:sz="4" w:space="0" w:color="CBCBCB"/>
+              <w:left w:val="single" w:sz="4" w:space="0" w:color="CBCBCB"/>
+              <w:bottom w:val="single" w:sz="4" w:space="0" w:color="CBCBCB"/>
+              <w:right w:val="single" w:sz="4" w:space="0" w:color="CBCBCB"/>
+            </w:tcBorders>
+          </w:tcPr>
+          <w:p>
+            <w:r>
+              <w:rPr>
+                <w:b/>
+                <w:sz w:val="20"/>
+              </w:rPr>
+              <w:t>MỚI</w:t>
+            </w:r>
+            <w:r>
+              <w:rPr>
+                <w:sz w:val="20"/>
+              </w:rPr>
+              <w:t xml:space="preserve"> — 6 unit tests cho </w:t>
+            </w:r>
+            <w:r>
+              <w:rPr>
+                <w:rFonts w:ascii="Courier New" w:hAnsi="Courier New"/>
+                <w:color w:val="F05922"/>
+                <w:sz w:val="20"/>
+              </w:rPr>
+              <w:t>WarmUpReconnectAsync</w:t>
+            </w:r>
+            <w:r>
+              <w:rPr>
+                <w:sz w:val="20"/>
+              </w:rPr>
+              <w:t xml:space="preserve"> (WiFi call, USB filter, mixed, continue-on-fail, empty DB, pre-cancelled)</w:t>
             </w:r>
           </w:p>
         </w:tc>

</xml_diff>

<commit_message>
[adb-app-status-reboot-api] Bước 3.1: Senior Developer code 2 API app-status + reboot + UI buttons
- AdbService: GetAppStatusAsync (pidof + dumpsys), RebootDeviceAsync, AppStatusResult/AppState
- Endpoints: AppStatusEndpoints.cs + RebootEndpoints.cs (OUTER logging + INNER auth filter)
- UI: 2 nút mới Index.cshtml + dashboard.js (Reboot có confirm dialog)
- Unit tests: 119 total (15 test mới) — AppStatusEndpointsTests x9, RebootEndpointsTests x6, AdbServiceAppStatusTests x5; 0 fail
- Cập nhật CODE-GRAPH (2 module mới, 2 API endpoints mới, Thay đổi gần đây)
- Kèm 1 dòng pending từ plan adb-reconnect (LaunchApp launcher intent) trong AdbService.cs

Plan: docs/plans/PLAN-adb-app-status-reboot-api-2026-08-24/steps/STEP-3.1-senior-developer-code.md

Co-Authored-By: Claude Fable 5 <noreply@anthropic.com>
</commit_message>
<xml_diff>
--- a/code-graph/CODE-GRAPH.docx
+++ b/code-graph/CODE-GRAPH.docx
@@ -29,7 +29,7 @@
         <w:rPr>
           <w:sz w:val="21"/>
         </w:rPr>
-        <w:t>last_updated: 2026-08-20</w:t>
+        <w:t>last_updated: 2026-08-24</w:t>
       </w:r>
     </w:p>
     <w:p>
@@ -40,7 +40,7 @@
         <w:rPr>
           <w:sz w:val="21"/>
         </w:rPr>
-        <w:t>updated_by: Senior Developer (adb-uninstall-before-install STEP-3.1)</w:t>
+        <w:t>updated_by: Senior Developer (adb-app-status-reboot-api STEP-3.1)</w:t>
       </w:r>
     </w:p>
     <w:p>
@@ -1378,6 +1378,320 @@
                 <w:sz w:val="20"/>
               </w:rPr>
               <w:t>).</w:t>
+            </w:r>
+          </w:p>
+        </w:tc>
+      </w:tr>
+      <w:tr>
+        <w:tc>
+          <w:tcPr>
+            <w:tcW w:type="dxa" w:w="3230"/>
+            <w:shd w:val="clear" w:color="auto" w:fill="B8B3D6"/>
+            <w:tcBorders>
+              <w:top w:val="single" w:sz="4" w:space="0" w:color="CBCBCB"/>
+              <w:left w:val="single" w:sz="4" w:space="0" w:color="CBCBCB"/>
+              <w:bottom w:val="single" w:sz="4" w:space="0" w:color="CBCBCB"/>
+              <w:right w:val="single" w:sz="4" w:space="0" w:color="CBCBCB"/>
+            </w:tcBorders>
+          </w:tcPr>
+          <w:p>
+            <w:r>
+              <w:rPr>
+                <w:sz w:val="20"/>
+              </w:rPr>
+              <w:t>2026-08-24</w:t>
+            </w:r>
+          </w:p>
+        </w:tc>
+        <w:tc>
+          <w:tcPr>
+            <w:tcW w:type="dxa" w:w="3230"/>
+            <w:shd w:val="clear" w:color="auto" w:fill="B8B3D6"/>
+            <w:tcBorders>
+              <w:top w:val="single" w:sz="4" w:space="0" w:color="CBCBCB"/>
+              <w:left w:val="single" w:sz="4" w:space="0" w:color="CBCBCB"/>
+              <w:bottom w:val="single" w:sz="4" w:space="0" w:color="CBCBCB"/>
+              <w:right w:val="single" w:sz="4" w:space="0" w:color="CBCBCB"/>
+            </w:tcBorders>
+          </w:tcPr>
+          <w:p>
+            <w:r>
+              <w:rPr>
+                <w:sz w:val="20"/>
+              </w:rPr>
+              <w:t>Senior Developer</w:t>
+            </w:r>
+          </w:p>
+        </w:tc>
+        <w:tc>
+          <w:tcPr>
+            <w:tcW w:type="dxa" w:w="3230"/>
+            <w:shd w:val="clear" w:color="auto" w:fill="B8B3D6"/>
+            <w:tcBorders>
+              <w:top w:val="single" w:sz="4" w:space="0" w:color="CBCBCB"/>
+              <w:left w:val="single" w:sz="4" w:space="0" w:color="CBCBCB"/>
+              <w:bottom w:val="single" w:sz="4" w:space="0" w:color="CBCBCB"/>
+              <w:right w:val="single" w:sz="4" w:space="0" w:color="CBCBCB"/>
+            </w:tcBorders>
+          </w:tcPr>
+          <w:p>
+            <w:r>
+              <w:rPr>
+                <w:sz w:val="20"/>
+              </w:rPr>
+              <w:t xml:space="preserve">adb-app-status-reboot-api STEP-3.1: Thêm </w:t>
+            </w:r>
+            <w:r>
+              <w:rPr>
+                <w:rFonts w:ascii="Courier New" w:hAnsi="Courier New"/>
+                <w:color w:val="F05922"/>
+                <w:sz w:val="20"/>
+              </w:rPr>
+              <w:t>AppState</w:t>
+            </w:r>
+            <w:r>
+              <w:rPr>
+                <w:sz w:val="20"/>
+              </w:rPr>
+              <w:t xml:space="preserve"> enum + </w:t>
+            </w:r>
+            <w:r>
+              <w:rPr>
+                <w:rFonts w:ascii="Courier New" w:hAnsi="Courier New"/>
+                <w:color w:val="F05922"/>
+                <w:sz w:val="20"/>
+              </w:rPr>
+              <w:t>AppStatusResult</w:t>
+            </w:r>
+            <w:r>
+              <w:rPr>
+                <w:sz w:val="20"/>
+              </w:rPr>
+              <w:t xml:space="preserve"> model + </w:t>
+            </w:r>
+            <w:r>
+              <w:rPr>
+                <w:rFonts w:ascii="Courier New" w:hAnsi="Courier New"/>
+                <w:color w:val="F05922"/>
+                <w:sz w:val="20"/>
+              </w:rPr>
+              <w:t>AdbService.GetAppStatusAsync</w:t>
+            </w:r>
+            <w:r>
+              <w:rPr>
+                <w:sz w:val="20"/>
+              </w:rPr>
+              <w:t xml:space="preserve"> (pidof + dumpsys) + </w:t>
+            </w:r>
+            <w:r>
+              <w:rPr>
+                <w:rFonts w:ascii="Courier New" w:hAnsi="Courier New"/>
+                <w:color w:val="F05922"/>
+                <w:sz w:val="20"/>
+              </w:rPr>
+              <w:t>AdbService.IsForegroundInDumpsys</w:t>
+            </w:r>
+            <w:r>
+              <w:rPr>
+                <w:sz w:val="20"/>
+              </w:rPr>
+              <w:t xml:space="preserve"> (static, testable) + </w:t>
+            </w:r>
+            <w:r>
+              <w:rPr>
+                <w:rFonts w:ascii="Courier New" w:hAnsi="Courier New"/>
+                <w:color w:val="F05922"/>
+                <w:sz w:val="20"/>
+              </w:rPr>
+              <w:t>AdbService.RebootDeviceAsync</w:t>
+            </w:r>
+            <w:r>
+              <w:rPr>
+                <w:sz w:val="20"/>
+              </w:rPr>
+              <w:t xml:space="preserve">; tạo </w:t>
+            </w:r>
+            <w:r>
+              <w:rPr>
+                <w:rFonts w:ascii="Courier New" w:hAnsi="Courier New"/>
+                <w:color w:val="F05922"/>
+                <w:sz w:val="20"/>
+              </w:rPr>
+              <w:t>Endpoints/AppStatusEndpoints.cs</w:t>
+            </w:r>
+            <w:r>
+              <w:rPr>
+                <w:sz w:val="20"/>
+              </w:rPr>
+              <w:t xml:space="preserve"> (GET /api/devices/{serial}/app-status) + </w:t>
+            </w:r>
+            <w:r>
+              <w:rPr>
+                <w:rFonts w:ascii="Courier New" w:hAnsi="Courier New"/>
+                <w:color w:val="F05922"/>
+                <w:sz w:val="20"/>
+              </w:rPr>
+              <w:t>Endpoints/RebootEndpoints.cs</w:t>
+            </w:r>
+            <w:r>
+              <w:rPr>
+                <w:sz w:val="20"/>
+              </w:rPr>
+              <w:t xml:space="preserve"> (POST /api/devices/{serial}/reboot); thêm 2 constants vào </w:t>
+            </w:r>
+            <w:r>
+              <w:rPr>
+                <w:rFonts w:ascii="Courier New" w:hAnsi="Courier New"/>
+                <w:color w:val="F05922"/>
+                <w:sz w:val="20"/>
+              </w:rPr>
+              <w:t>ApiRequestLogConstants</w:t>
+            </w:r>
+            <w:r>
+              <w:rPr>
+                <w:sz w:val="20"/>
+              </w:rPr>
+              <w:t xml:space="preserve">; cập nhật </w:t>
+            </w:r>
+            <w:r>
+              <w:rPr>
+                <w:rFonts w:ascii="Courier New" w:hAnsi="Courier New"/>
+                <w:color w:val="F05922"/>
+                <w:sz w:val="20"/>
+              </w:rPr>
+              <w:t>ResolveApiName</w:t>
+            </w:r>
+            <w:r>
+              <w:rPr>
+                <w:sz w:val="20"/>
+              </w:rPr>
+              <w:t xml:space="preserve"> trong </w:t>
+            </w:r>
+            <w:r>
+              <w:rPr>
+                <w:rFonts w:ascii="Courier New" w:hAnsi="Courier New"/>
+                <w:color w:val="F05922"/>
+                <w:sz w:val="20"/>
+              </w:rPr>
+              <w:t>ApiRequestLoggingEndpointFilter</w:t>
+            </w:r>
+            <w:r>
+              <w:rPr>
+                <w:sz w:val="20"/>
+              </w:rPr>
+              <w:t xml:space="preserve">; </w:t>
+            </w:r>
+            <w:r>
+              <w:rPr>
+                <w:rFonts w:ascii="Courier New" w:hAnsi="Courier New"/>
+                <w:color w:val="F05922"/>
+                <w:sz w:val="20"/>
+              </w:rPr>
+              <w:t>IndexModel</w:t>
+            </w:r>
+            <w:r>
+              <w:rPr>
+                <w:sz w:val="20"/>
+              </w:rPr>
+              <w:t xml:space="preserve"> thêm </w:t>
+            </w:r>
+            <w:r>
+              <w:rPr>
+                <w:rFonts w:ascii="Courier New" w:hAnsi="Courier New"/>
+                <w:color w:val="F05922"/>
+                <w:sz w:val="20"/>
+              </w:rPr>
+              <w:t>PublicApiKey</w:t>
+            </w:r>
+            <w:r>
+              <w:rPr>
+                <w:sz w:val="20"/>
+              </w:rPr>
+              <w:t xml:space="preserve"> (từ </w:t>
+            </w:r>
+            <w:r>
+              <w:rPr>
+                <w:rFonts w:ascii="Courier New" w:hAnsi="Courier New"/>
+                <w:color w:val="F05922"/>
+                <w:sz w:val="20"/>
+              </w:rPr>
+              <w:t>LaunchApp:ApiKey</w:t>
+            </w:r>
+            <w:r>
+              <w:rPr>
+                <w:sz w:val="20"/>
+              </w:rPr>
+              <w:t xml:space="preserve">); </w:t>
+            </w:r>
+            <w:r>
+              <w:rPr>
+                <w:rFonts w:ascii="Courier New" w:hAnsi="Courier New"/>
+                <w:color w:val="F05922"/>
+                <w:sz w:val="20"/>
+              </w:rPr>
+              <w:t>Index.cshtml</w:t>
+            </w:r>
+            <w:r>
+              <w:rPr>
+                <w:sz w:val="20"/>
+              </w:rPr>
+              <w:t xml:space="preserve"> thêm 2 nút + </w:t>
+            </w:r>
+            <w:r>
+              <w:rPr>
+                <w:rFonts w:ascii="Courier New" w:hAnsi="Courier New"/>
+                <w:color w:val="F05922"/>
+                <w:sz w:val="20"/>
+              </w:rPr>
+              <w:t>window.KZ_API_KEY</w:t>
+            </w:r>
+            <w:r>
+              <w:rPr>
+                <w:sz w:val="20"/>
+              </w:rPr>
+              <w:t xml:space="preserve"> script; </w:t>
+            </w:r>
+            <w:r>
+              <w:rPr>
+                <w:rFonts w:ascii="Courier New" w:hAnsi="Courier New"/>
+                <w:color w:val="F05922"/>
+                <w:sz w:val="20"/>
+              </w:rPr>
+              <w:t>dashboard.js</w:t>
+            </w:r>
+            <w:r>
+              <w:rPr>
+                <w:sz w:val="20"/>
+              </w:rPr>
+              <w:t xml:space="preserve"> thêm </w:t>
+            </w:r>
+            <w:r>
+              <w:rPr>
+                <w:rFonts w:ascii="Courier New" w:hAnsi="Courier New"/>
+                <w:color w:val="F05922"/>
+                <w:sz w:val="20"/>
+              </w:rPr>
+              <w:t>apiHeaders()</w:t>
+            </w:r>
+            <w:r>
+              <w:rPr>
+                <w:sz w:val="20"/>
+              </w:rPr>
+              <w:t xml:space="preserve"> + 2 event handler + cập nhật </w:t>
+            </w:r>
+            <w:r>
+              <w:rPr>
+                <w:rFonts w:ascii="Courier New" w:hAnsi="Courier New"/>
+                <w:color w:val="F05922"/>
+                <w:sz w:val="20"/>
+              </w:rPr>
+              <w:t>summarizeParams</w:t>
+            </w:r>
+            <w:r>
+              <w:rPr>
+                <w:sz w:val="20"/>
+              </w:rPr>
+              <w:t>; thêm 16 unit tests (AppStatusEndpointsTests x9 + RebootEndpointsTests x6 + AdbServiceAppStatusTests x5 → thực tế 15 test mới + bộ cũ = 119 total).</w:t>
             </w:r>
           </w:p>
         </w:tc>
@@ -1898,6 +2212,8 @@
         <w:br/>
         <w:t>│   ├── ApkEndpoints.cs             ← POST /api/apk/upload, DELETE /api/apk</w:t>
         <w:br/>
+        <w:t>│   ├── AppStatusEndpoints.cs       ← GET /api/devices/{serial}/app-status (filter: ApiRequestLoggingEndpointFilter OUTER + ApiKeyEndpointFilter) [adb-app-status-reboot-api STEP-3.1]</w:t>
+        <w:br/>
         <w:t>│   ├── DeviceConnectionEndpoints.cs← POST /api/devices/connect-by-ip (filter: ApiRequestLoggingEndpointFilter OUTER + ApiKeyEndpointFilter), GET /api/devices/{serial}/status [adb-add-device-api; STEP-2.1]</w:t>
         <w:br/>
         <w:t>│   ├── DeviceEndpoints.cs          ← POST /api/devices/{connect,connect-batch,remove,poll}, GET /api/devices, POST /api/settings/package, /api/settings/uninstall-before-install, /api/polling/toggle [+endpoint STEP-3.1 adb-uninstall-before-install]</w:t>
@@ -1908,9 +2224,11 @@
         <w:br/>
         <w:t>│   ├── LaunchAppEndpoints.cs       ← POST /api/launch-app (filter: ApiRequestLoggingEndpointFilter OUTER + ApiKeyEndpointFilter) [STEP-2.1]</w:t>
         <w:br/>
+        <w:t>│   ├── RebootEndpoints.cs          ← POST /api/devices/{serial}/reboot (filter: ApiRequestLoggingEndpointFilter OUTER + ApiKeyEndpointFilter) [adb-app-status-reboot-api STEP-3.1]</w:t>
+        <w:br/>
         <w:t>│   ├── ApiKeyEndpointFilter.cs     ← INNER auth filter; BẤT KHẢ XÂM PHẠM</w:t>
         <w:br/>
-        <w:t>│   ├── ApiRequestLoggingEndpointFilter.cs ← OUTER logging filter; capture body + callerIp + result → gọi IApiRequestLogService.LogAsync [STEP-2.1]</w:t>
+        <w:t>│   ├── ApiRequestLoggingEndpointFilter.cs ← OUTER logging filter; capture body + callerIp + result → gọi IApiRequestLogService.LogAsync [STEP-2.1]; ResolveApiName cập nhật nhận AppStatus/RebootDevice route [adb-app-status-reboot-api]</w:t>
         <w:br/>
         <w:t>│   └── ScanEndpoints.cs            ← POST /api/scan/start, /api/scan/cancel</w:t>
         <w:br/>
@@ -1938,7 +2256,7 @@
         <w:br/>
         <w:t>│   ├── IAdbService.cs              ← Interface: GetDevicesAsync/ConnectAsync/GetPackageVersionAsync (testability)</w:t>
         <w:br/>
-        <w:t>│   ├── AdbService.cs               ← Singleton; implement IAdbService; wrap adb binary; GetDevices/Connect/Install/LaunchApp/GetVersion/UninstallApkAsync [STEP-3.1 adb-uninstall-before-install]</w:t>
+        <w:t>│   ├── AdbService.cs               ← Singleton; implement IAdbService; wrap adb binary; GetDevices/Connect/Install/LaunchApp/GetVersion/UninstallApkAsync/GetAppStatusAsync/IsForegroundInDumpsys(static)/RebootDeviceAsync [+adb-app-status-reboot-api STEP-3.1]</w:t>
         <w:br/>
         <w:t>│   ├── ApkManifestReader.cs        ← Singleton; parse AXML từ .apk; stateless</w:t>
         <w:br/>
@@ -2265,7 +2583,7 @@
               <w:rPr>
                 <w:sz w:val="20"/>
               </w:rPr>
-              <w:t>AdbSettings, LaunchAppSettings, AdbService, DeviceRepository, ApkManifestReader, DevicePollWorker, DeviceHub, DeviceState, InstallCoordinator, ScanCoordinator, PollControlService, ApiRequestLogRepository, IApiRequestLogService, ApiRequestLoggingEndpointFilter</w:t>
+              <w:t>AdbSettings, LaunchAppSettings, AdbService, DeviceRepository, ApkManifestReader, DevicePollWorker, DeviceHub, DeviceState, InstallCoordinator, ScanCoordinator, PollControlService, ApiRequestLogRepository, IApiRequestLogService, ApiRequestLoggingEndpointFilter, AppStatusEndpoints, RebootEndpoints</w:t>
             </w:r>
           </w:p>
         </w:tc>
@@ -2325,7 +2643,7 @@
               <w:rPr>
                 <w:sz w:val="20"/>
               </w:rPr>
-              <w:t>2026-08-19</w:t>
+              <w:t>2026-08-24</w:t>
             </w:r>
           </w:p>
         </w:tc>
@@ -2698,7 +3016,7 @@
               <w:rPr>
                 <w:sz w:val="20"/>
               </w:rPr>
-              <w:t>DevicePollWorker (via IAdbService), InstallCoordinator, LaunchAppEndpoints, DeviceConnectionEndpoints, HealthEndpoints</w:t>
+              <w:t>DevicePollWorker (via IAdbService), InstallCoordinator, LaunchAppEndpoints, DeviceConnectionEndpoints, HealthEndpoints, AppStatusEndpoints, RebootEndpoints</w:t>
             </w:r>
           </w:p>
         </w:tc>
@@ -2738,7 +3056,7 @@
               <w:rPr>
                 <w:sz w:val="20"/>
               </w:rPr>
-              <w:t>2026-08-20</w:t>
+              <w:t>2026-08-24</w:t>
             </w:r>
           </w:p>
         </w:tc>
@@ -3611,7 +3929,7 @@
               <w:rPr>
                 <w:sz w:val="20"/>
               </w:rPr>
-              <w:t>LaunchAppEndpoints (.AddEndpointFilter OUTER), DeviceConnectionEndpoints (.AddEndpointFilter OUTER, POST route only)</w:t>
+              <w:t>LaunchAppEndpoints (.AddEndpointFilter OUTER), DeviceConnectionEndpoints (.AddEndpointFilter OUTER, POST route only), AppStatusEndpoints (.AddEndpointFilter OUTER), RebootEndpoints (.AddEndpointFilter OUTER)</w:t>
             </w:r>
           </w:p>
         </w:tc>
@@ -3649,7 +3967,7 @@
               <w:rPr>
                 <w:sz w:val="20"/>
               </w:rPr>
-              <w:t>2026-08-19</w:t>
+              <w:t>2026-08-24</w:t>
             </w:r>
           </w:p>
         </w:tc>
@@ -3673,7 +3991,7 @@
                 <w:color w:val="F05922"/>
                 <w:sz w:val="20"/>
               </w:rPr>
-              <w:t>Endpoints/LaunchAppEndpoints</w:t>
+              <w:t>Endpoints/AppStatusEndpoints</w:t>
             </w:r>
           </w:p>
         </w:tc>
@@ -3713,7 +4031,7 @@
               <w:rPr>
                 <w:sz w:val="20"/>
               </w:rPr>
-              <w:t>Program.cs (MapLaunchAppEndpoints)</w:t>
+              <w:t>Program.cs (MapAppStatusEndpoints)</w:t>
             </w:r>
           </w:p>
         </w:tc>
@@ -3753,7 +4071,7 @@
               <w:rPr>
                 <w:sz w:val="20"/>
               </w:rPr>
-              <w:t>2026-08-19</w:t>
+              <w:t>2026-08-24</w:t>
             </w:r>
           </w:p>
         </w:tc>
@@ -3776,7 +4094,7 @@
                 <w:color w:val="F05922"/>
                 <w:sz w:val="20"/>
               </w:rPr>
-              <w:t>Endpoints/DeviceConnectionEndpoints</w:t>
+              <w:t>Endpoints/RebootEndpoints</w:t>
             </w:r>
           </w:p>
         </w:tc>
@@ -3795,7 +4113,7 @@
               <w:rPr>
                 <w:sz w:val="20"/>
               </w:rPr>
-              <w:t>AdbService, PollControlService, DeviceState, ApiKeyEndpointFilter, ApiRequestLoggingEndpointFilter, ILoggerFactory</w:t>
+              <w:t>DeviceState, AdbService, ApiKeyEndpointFilter, ApiRequestLoggingEndpointFilter, ILoggerFactory</w:t>
             </w:r>
           </w:p>
         </w:tc>
@@ -3814,7 +4132,7 @@
               <w:rPr>
                 <w:sz w:val="20"/>
               </w:rPr>
-              <w:t>Program.cs (MapDeviceConnectionEndpoints)</w:t>
+              <w:t>Program.cs (MapRebootEndpoints)</w:t>
             </w:r>
           </w:p>
         </w:tc>
@@ -3852,7 +4170,7 @@
               <w:rPr>
                 <w:sz w:val="20"/>
               </w:rPr>
-              <w:t>2026-08-19</w:t>
+              <w:t>2026-08-24</w:t>
             </w:r>
           </w:p>
         </w:tc>
@@ -3876,7 +4194,7 @@
                 <w:color w:val="F05922"/>
                 <w:sz w:val="20"/>
               </w:rPr>
-              <w:t>Hubs/DeviceHub</w:t>
+              <w:t>Endpoints/LaunchAppEndpoints</w:t>
             </w:r>
           </w:p>
         </w:tc>
@@ -3896,7 +4214,7 @@
               <w:rPr>
                 <w:sz w:val="20"/>
               </w:rPr>
-              <w:t>Microsoft.AspNetCore.SignalR.Hub</w:t>
+              <w:t>DeviceState, AdbService, ApiKeyEndpointFilter, ApiRequestLoggingEndpointFilter, ILoggerFactory</w:t>
             </w:r>
           </w:p>
         </w:tc>
@@ -3916,7 +4234,7 @@
               <w:rPr>
                 <w:sz w:val="20"/>
               </w:rPr>
-              <w:t>Program.cs (MapHub), DevicePollWorker, InstallCoordinator, ScanCoordinator</w:t>
+              <w:t>Program.cs (MapLaunchAppEndpoints)</w:t>
             </w:r>
           </w:p>
         </w:tc>
@@ -3956,7 +4274,7 @@
               <w:rPr>
                 <w:sz w:val="20"/>
               </w:rPr>
-              <w:t>2026-08-10</w:t>
+              <w:t>2026-08-19</w:t>
             </w:r>
           </w:p>
         </w:tc>
@@ -3979,7 +4297,7 @@
                 <w:color w:val="F05922"/>
                 <w:sz w:val="20"/>
               </w:rPr>
-              <w:t>Workers/DevicePollWorker</w:t>
+              <w:t>Endpoints/DeviceConnectionEndpoints</w:t>
             </w:r>
           </w:p>
         </w:tc>
@@ -3998,20 +4316,7 @@
               <w:rPr>
                 <w:sz w:val="20"/>
               </w:rPr>
-              <w:t xml:space="preserve">IOptions\&lt;AdbSettings\&gt;, </w:t>
-            </w:r>
-            <w:r>
-              <w:rPr>
-                <w:b/>
-                <w:sz w:val="20"/>
-              </w:rPr>
-              <w:t>IAdbService</w:t>
-            </w:r>
-            <w:r>
-              <w:rPr>
-                <w:sz w:val="20"/>
-              </w:rPr>
-              <w:t xml:space="preserve"> (không còn phụ thuộc AdbService trực tiếp), DeviceRepository, DeviceState, PollControlService, IHubContext\&lt;DeviceHub\&gt;</w:t>
+              <w:t>AdbService, PollControlService, DeviceState, ApiKeyEndpointFilter, ApiRequestLoggingEndpointFilter, ILoggerFactory</w:t>
             </w:r>
           </w:p>
         </w:tc>
@@ -4030,7 +4335,7 @@
               <w:rPr>
                 <w:sz w:val="20"/>
               </w:rPr>
-              <w:t>Program.cs (AddHostedService)</w:t>
+              <w:t>Program.cs (MapDeviceConnectionEndpoints)</w:t>
             </w:r>
           </w:p>
         </w:tc>
@@ -4092,7 +4397,7 @@
                 <w:color w:val="F05922"/>
                 <w:sz w:val="20"/>
               </w:rPr>
-              <w:t>Models/DeviceRecord</w:t>
+              <w:t>Hubs/DeviceHub</w:t>
             </w:r>
           </w:p>
         </w:tc>
@@ -4112,7 +4417,7 @@
               <w:rPr>
                 <w:sz w:val="20"/>
               </w:rPr>
-              <w:t>—</w:t>
+              <w:t>Microsoft.AspNetCore.SignalR.Hub</w:t>
             </w:r>
           </w:p>
         </w:tc>
@@ -4132,7 +4437,7 @@
               <w:rPr>
                 <w:sz w:val="20"/>
               </w:rPr>
-              <w:t>DeviceRepository, DeviceState, DevicePollWorker, InstallCoordinator, API JSON response</w:t>
+              <w:t>Program.cs (MapHub), DevicePollWorker, InstallCoordinator, ScanCoordinator</w:t>
             </w:r>
           </w:p>
         </w:tc>
@@ -4195,7 +4500,7 @@
                 <w:color w:val="F05922"/>
                 <w:sz w:val="20"/>
               </w:rPr>
-              <w:t>Models/ApiRequestLogEntry</w:t>
+              <w:t>Workers/DevicePollWorker</w:t>
             </w:r>
           </w:p>
         </w:tc>
@@ -4214,7 +4519,20 @@
               <w:rPr>
                 <w:sz w:val="20"/>
               </w:rPr>
-              <w:t>—</w:t>
+              <w:t xml:space="preserve">IOptions\&lt;AdbSettings\&gt;, </w:t>
+            </w:r>
+            <w:r>
+              <w:rPr>
+                <w:b/>
+                <w:sz w:val="20"/>
+              </w:rPr>
+              <w:t>IAdbService</w:t>
+            </w:r>
+            <w:r>
+              <w:rPr>
+                <w:sz w:val="20"/>
+              </w:rPr>
+              <w:t xml:space="preserve"> (không còn phụ thuộc AdbService trực tiếp), DeviceRepository, DeviceState, PollControlService, IHubContext\&lt;DeviceHub\&gt;</w:t>
             </w:r>
           </w:p>
         </w:tc>
@@ -4233,7 +4551,7 @@
               <w:rPr>
                 <w:sz w:val="20"/>
               </w:rPr>
-              <w:t>ApiRequestLogRepository, ApiRequestLogService, ApiRequestLoggingEndpointFilter, SignalR broadcast payload</w:t>
+              <w:t>Program.cs (AddHostedService)</w:t>
             </w:r>
           </w:p>
         </w:tc>
@@ -4295,7 +4613,7 @@
                 <w:color w:val="F05922"/>
                 <w:sz w:val="20"/>
               </w:rPr>
-              <w:t>Services/ApiRequestLogConstants</w:t>
+              <w:t>Models/DeviceRecord</w:t>
             </w:r>
           </w:p>
         </w:tc>
@@ -4335,7 +4653,7 @@
               <w:rPr>
                 <w:sz w:val="20"/>
               </w:rPr>
-              <w:t>ApiRequestLogService, ApiRequestLoggingEndpointFilter, tests</w:t>
+              <w:t>DeviceRepository, DeviceState, DevicePollWorker, InstallCoordinator, API JSON response</w:t>
             </w:r>
           </w:p>
         </w:tc>
@@ -4375,7 +4693,7 @@
               <w:rPr>
                 <w:sz w:val="20"/>
               </w:rPr>
-              <w:t>2026-08-19</w:t>
+              <w:t>2026-08-10</w:t>
             </w:r>
           </w:p>
         </w:tc>
@@ -4398,7 +4716,7 @@
                 <w:color w:val="F05922"/>
                 <w:sz w:val="20"/>
               </w:rPr>
-              <w:t>Services/ApiRequestLogRepository</w:t>
+              <w:t>Models/ApiRequestLogEntry</w:t>
             </w:r>
           </w:p>
         </w:tc>
@@ -4417,7 +4735,7 @@
               <w:rPr>
                 <w:sz w:val="20"/>
               </w:rPr>
-              <w:t>IOptions\&lt;AdbSettings\&gt;, Microsoft.Data.Sqlite, Models/ApiRequestLogEntry</w:t>
+              <w:t>—</w:t>
             </w:r>
           </w:p>
         </w:tc>
@@ -4436,7 +4754,7 @@
               <w:rPr>
                 <w:sz w:val="20"/>
               </w:rPr>
-              <w:t>ApiRequestLogService</w:t>
+              <w:t>ApiRequestLogRepository, ApiRequestLogService, ApiRequestLoggingEndpointFilter, SignalR broadcast payload</w:t>
             </w:r>
           </w:p>
         </w:tc>
@@ -4498,7 +4816,7 @@
                 <w:color w:val="F05922"/>
                 <w:sz w:val="20"/>
               </w:rPr>
-              <w:t>Services/IApiRequestLogService</w:t>
+              <w:t>Services/ApiRequestLogConstants</w:t>
             </w:r>
           </w:p>
         </w:tc>
@@ -4538,7 +4856,7 @@
               <w:rPr>
                 <w:sz w:val="20"/>
               </w:rPr>
-              <w:t>ApiRequestLoggingEndpointFilter (dep), ApiRequestLogService (implements)</w:t>
+              <w:t>ApiRequestLogService, ApiRequestLoggingEndpointFilter, tests</w:t>
             </w:r>
           </w:p>
         </w:tc>
@@ -4601,7 +4919,7 @@
                 <w:color w:val="F05922"/>
                 <w:sz w:val="20"/>
               </w:rPr>
-              <w:t>Services/ApiRequestLogService</w:t>
+              <w:t>Services/ApiRequestLogRepository</w:t>
             </w:r>
           </w:p>
         </w:tc>
@@ -4620,7 +4938,7 @@
               <w:rPr>
                 <w:sz w:val="20"/>
               </w:rPr>
-              <w:t>ApiRequestLogRepository, IHubContext\&lt;DeviceHub\&gt;, IApiRequestLogService, ILogger</w:t>
+              <w:t>IOptions\&lt;AdbSettings\&gt;, Microsoft.Data.Sqlite, Models/ApiRequestLogEntry</w:t>
             </w:r>
           </w:p>
         </w:tc>
@@ -4639,7 +4957,7 @@
               <w:rPr>
                 <w:sz w:val="20"/>
               </w:rPr>
-              <w:t>ApiRequestLoggingEndpointFilter (via IApiRequestLogService)</w:t>
+              <w:t>ApiRequestLogService</w:t>
             </w:r>
           </w:p>
         </w:tc>
@@ -4701,7 +5019,7 @@
                 <w:color w:val="F05922"/>
                 <w:sz w:val="20"/>
               </w:rPr>
-              <w:t>Endpoints/DeviceEndpoints</w:t>
+              <w:t>Services/IApiRequestLogService</w:t>
             </w:r>
           </w:p>
         </w:tc>
@@ -4721,7 +5039,7 @@
               <w:rPr>
                 <w:sz w:val="20"/>
               </w:rPr>
-              <w:t>DeviceRepository, DeviceState, AdbService, PollControlService</w:t>
+              <w:t>—</w:t>
             </w:r>
           </w:p>
         </w:tc>
@@ -4741,7 +5059,7 @@
               <w:rPr>
                 <w:sz w:val="20"/>
               </w:rPr>
-              <w:t>Program.cs (MapDeviceEndpoints)</w:t>
+              <w:t>ApiRequestLoggingEndpointFilter (dep), ApiRequestLogService (implements)</w:t>
             </w:r>
           </w:p>
         </w:tc>
@@ -4781,7 +5099,7 @@
               <w:rPr>
                 <w:sz w:val="20"/>
               </w:rPr>
-              <w:t>2026-08-20</w:t>
+              <w:t>2026-08-19</w:t>
             </w:r>
           </w:p>
         </w:tc>
@@ -4804,7 +5122,7 @@
                 <w:color w:val="F05922"/>
                 <w:sz w:val="20"/>
               </w:rPr>
-              <w:t>Endpoints/InstallEndpoints</w:t>
+              <w:t>Services/ApiRequestLogService</w:t>
             </w:r>
           </w:p>
         </w:tc>
@@ -4823,7 +5141,7 @@
               <w:rPr>
                 <w:sz w:val="20"/>
               </w:rPr>
-              <w:t>DeviceState, DeviceRepository, InstallCoordinator</w:t>
+              <w:t>ApiRequestLogRepository, IHubContext\&lt;DeviceHub\&gt;, IApiRequestLogService, ILogger</w:t>
             </w:r>
           </w:p>
         </w:tc>
@@ -4842,7 +5160,7 @@
               <w:rPr>
                 <w:sz w:val="20"/>
               </w:rPr>
-              <w:t>Program.cs (MapInstallEndpoints)</w:t>
+              <w:t>ApiRequestLoggingEndpointFilter (via IApiRequestLogService)</w:t>
             </w:r>
           </w:p>
         </w:tc>
@@ -4880,7 +5198,7 @@
               <w:rPr>
                 <w:sz w:val="20"/>
               </w:rPr>
-              <w:t>2026-08-20</w:t>
+              <w:t>2026-08-19</w:t>
             </w:r>
           </w:p>
         </w:tc>
@@ -4904,7 +5222,7 @@
                 <w:color w:val="F05922"/>
                 <w:sz w:val="20"/>
               </w:rPr>
-              <w:t>Endpoints/ScanEndpoints</w:t>
+              <w:t>Endpoints/DeviceEndpoints</w:t>
             </w:r>
           </w:p>
         </w:tc>
@@ -4924,7 +5242,7 @@
               <w:rPr>
                 <w:sz w:val="20"/>
               </w:rPr>
-              <w:t>ScanCoordinator</w:t>
+              <w:t>DeviceRepository, DeviceState, AdbService, PollControlService</w:t>
             </w:r>
           </w:p>
         </w:tc>
@@ -4944,7 +5262,7 @@
               <w:rPr>
                 <w:sz w:val="20"/>
               </w:rPr>
-              <w:t>Program.cs (MapScanEndpoints)</w:t>
+              <w:t>Program.cs (MapDeviceEndpoints)</w:t>
             </w:r>
           </w:p>
         </w:tc>
@@ -4984,7 +5302,7 @@
               <w:rPr>
                 <w:sz w:val="20"/>
               </w:rPr>
-              <w:t>2026-08-10</w:t>
+              <w:t>2026-08-20</w:t>
             </w:r>
           </w:p>
         </w:tc>
@@ -5007,7 +5325,7 @@
                 <w:color w:val="F05922"/>
                 <w:sz w:val="20"/>
               </w:rPr>
-              <w:t>Endpoints/ApkEndpoints</w:t>
+              <w:t>Endpoints/InstallEndpoints</w:t>
             </w:r>
           </w:p>
         </w:tc>
@@ -5026,7 +5344,7 @@
               <w:rPr>
                 <w:sz w:val="20"/>
               </w:rPr>
-              <w:t>IOptions\&lt;AdbSettings\&gt;, ApkManifestReader, DeviceRepository</w:t>
+              <w:t>DeviceState, DeviceRepository, InstallCoordinator</w:t>
             </w:r>
           </w:p>
         </w:tc>
@@ -5045,7 +5363,7 @@
               <w:rPr>
                 <w:sz w:val="20"/>
               </w:rPr>
-              <w:t>Program.cs (MapApkEndpoints)</w:t>
+              <w:t>Program.cs (MapInstallEndpoints)</w:t>
             </w:r>
           </w:p>
         </w:tc>
@@ -5083,7 +5401,7 @@
               <w:rPr>
                 <w:sz w:val="20"/>
               </w:rPr>
-              <w:t>2026-08-10</w:t>
+              <w:t>2026-08-20</w:t>
             </w:r>
           </w:p>
         </w:tc>
@@ -5107,7 +5425,7 @@
                 <w:color w:val="F05922"/>
                 <w:sz w:val="20"/>
               </w:rPr>
-              <w:t>Endpoints/HealthEndpoints</w:t>
+              <w:t>Endpoints/ScanEndpoints</w:t>
             </w:r>
           </w:p>
         </w:tc>
@@ -5127,7 +5445,7 @@
               <w:rPr>
                 <w:sz w:val="20"/>
               </w:rPr>
-              <w:t>—</w:t>
+              <w:t>ScanCoordinator</w:t>
             </w:r>
           </w:p>
         </w:tc>
@@ -5147,7 +5465,7 @@
               <w:rPr>
                 <w:sz w:val="20"/>
               </w:rPr>
-              <w:t>Program.cs (MapHealthEndpoints)</w:t>
+              <w:t>Program.cs (MapScanEndpoints)</w:t>
             </w:r>
           </w:p>
         </w:tc>
@@ -5210,6 +5528,209 @@
                 <w:color w:val="F05922"/>
                 <w:sz w:val="20"/>
               </w:rPr>
+              <w:t>Endpoints/ApkEndpoints</w:t>
+            </w:r>
+          </w:p>
+        </w:tc>
+        <w:tc>
+          <w:tcPr>
+            <w:tcW w:type="dxa" w:w="1938"/>
+            <w:tcBorders>
+              <w:top w:val="single" w:sz="4" w:space="0" w:color="CBCBCB"/>
+              <w:left w:val="single" w:sz="4" w:space="0" w:color="CBCBCB"/>
+              <w:bottom w:val="single" w:sz="4" w:space="0" w:color="CBCBCB"/>
+              <w:right w:val="single" w:sz="4" w:space="0" w:color="CBCBCB"/>
+            </w:tcBorders>
+          </w:tcPr>
+          <w:p>
+            <w:r>
+              <w:rPr>
+                <w:sz w:val="20"/>
+              </w:rPr>
+              <w:t>IOptions\&lt;AdbSettings\&gt;, ApkManifestReader, DeviceRepository</w:t>
+            </w:r>
+          </w:p>
+        </w:tc>
+        <w:tc>
+          <w:tcPr>
+            <w:tcW w:type="dxa" w:w="1938"/>
+            <w:tcBorders>
+              <w:top w:val="single" w:sz="4" w:space="0" w:color="CBCBCB"/>
+              <w:left w:val="single" w:sz="4" w:space="0" w:color="CBCBCB"/>
+              <w:bottom w:val="single" w:sz="4" w:space="0" w:color="CBCBCB"/>
+              <w:right w:val="single" w:sz="4" w:space="0" w:color="CBCBCB"/>
+            </w:tcBorders>
+          </w:tcPr>
+          <w:p>
+            <w:r>
+              <w:rPr>
+                <w:sz w:val="20"/>
+              </w:rPr>
+              <w:t>Program.cs (MapApkEndpoints)</w:t>
+            </w:r>
+          </w:p>
+        </w:tc>
+        <w:tc>
+          <w:tcPr>
+            <w:tcW w:type="dxa" w:w="1938"/>
+            <w:tcBorders>
+              <w:top w:val="single" w:sz="4" w:space="0" w:color="CBCBCB"/>
+              <w:left w:val="single" w:sz="4" w:space="0" w:color="CBCBCB"/>
+              <w:bottom w:val="single" w:sz="4" w:space="0" w:color="CBCBCB"/>
+              <w:right w:val="single" w:sz="4" w:space="0" w:color="CBCBCB"/>
+            </w:tcBorders>
+          </w:tcPr>
+          <w:p>
+            <w:r>
+              <w:rPr>
+                <w:sz w:val="20"/>
+              </w:rPr>
+              <w:t>CONFIRMED</w:t>
+            </w:r>
+          </w:p>
+        </w:tc>
+        <w:tc>
+          <w:tcPr>
+            <w:tcW w:type="dxa" w:w="1938"/>
+            <w:tcBorders>
+              <w:top w:val="single" w:sz="4" w:space="0" w:color="CBCBCB"/>
+              <w:left w:val="single" w:sz="4" w:space="0" w:color="CBCBCB"/>
+              <w:bottom w:val="single" w:sz="4" w:space="0" w:color="CBCBCB"/>
+              <w:right w:val="single" w:sz="4" w:space="0" w:color="CBCBCB"/>
+            </w:tcBorders>
+          </w:tcPr>
+          <w:p>
+            <w:r>
+              <w:rPr>
+                <w:sz w:val="20"/>
+              </w:rPr>
+              <w:t>2026-08-10</w:t>
+            </w:r>
+          </w:p>
+        </w:tc>
+      </w:tr>
+      <w:tr>
+        <w:tc>
+          <w:tcPr>
+            <w:tcW w:type="dxa" w:w="1938"/>
+            <w:shd w:val="clear" w:color="auto" w:fill="B8B3D6"/>
+            <w:tcBorders>
+              <w:top w:val="single" w:sz="4" w:space="0" w:color="CBCBCB"/>
+              <w:left w:val="single" w:sz="4" w:space="0" w:color="CBCBCB"/>
+              <w:bottom w:val="single" w:sz="4" w:space="0" w:color="CBCBCB"/>
+              <w:right w:val="single" w:sz="4" w:space="0" w:color="CBCBCB"/>
+            </w:tcBorders>
+          </w:tcPr>
+          <w:p>
+            <w:r>
+              <w:rPr>
+                <w:rFonts w:ascii="Courier New" w:hAnsi="Courier New"/>
+                <w:color w:val="F05922"/>
+                <w:sz w:val="20"/>
+              </w:rPr>
+              <w:t>Endpoints/HealthEndpoints</w:t>
+            </w:r>
+          </w:p>
+        </w:tc>
+        <w:tc>
+          <w:tcPr>
+            <w:tcW w:type="dxa" w:w="1938"/>
+            <w:shd w:val="clear" w:color="auto" w:fill="B8B3D6"/>
+            <w:tcBorders>
+              <w:top w:val="single" w:sz="4" w:space="0" w:color="CBCBCB"/>
+              <w:left w:val="single" w:sz="4" w:space="0" w:color="CBCBCB"/>
+              <w:bottom w:val="single" w:sz="4" w:space="0" w:color="CBCBCB"/>
+              <w:right w:val="single" w:sz="4" w:space="0" w:color="CBCBCB"/>
+            </w:tcBorders>
+          </w:tcPr>
+          <w:p>
+            <w:r>
+              <w:rPr>
+                <w:sz w:val="20"/>
+              </w:rPr>
+              <w:t>—</w:t>
+            </w:r>
+          </w:p>
+        </w:tc>
+        <w:tc>
+          <w:tcPr>
+            <w:tcW w:type="dxa" w:w="1938"/>
+            <w:shd w:val="clear" w:color="auto" w:fill="B8B3D6"/>
+            <w:tcBorders>
+              <w:top w:val="single" w:sz="4" w:space="0" w:color="CBCBCB"/>
+              <w:left w:val="single" w:sz="4" w:space="0" w:color="CBCBCB"/>
+              <w:bottom w:val="single" w:sz="4" w:space="0" w:color="CBCBCB"/>
+              <w:right w:val="single" w:sz="4" w:space="0" w:color="CBCBCB"/>
+            </w:tcBorders>
+          </w:tcPr>
+          <w:p>
+            <w:r>
+              <w:rPr>
+                <w:sz w:val="20"/>
+              </w:rPr>
+              <w:t>Program.cs (MapHealthEndpoints)</w:t>
+            </w:r>
+          </w:p>
+        </w:tc>
+        <w:tc>
+          <w:tcPr>
+            <w:tcW w:type="dxa" w:w="1938"/>
+            <w:shd w:val="clear" w:color="auto" w:fill="B8B3D6"/>
+            <w:tcBorders>
+              <w:top w:val="single" w:sz="4" w:space="0" w:color="CBCBCB"/>
+              <w:left w:val="single" w:sz="4" w:space="0" w:color="CBCBCB"/>
+              <w:bottom w:val="single" w:sz="4" w:space="0" w:color="CBCBCB"/>
+              <w:right w:val="single" w:sz="4" w:space="0" w:color="CBCBCB"/>
+            </w:tcBorders>
+          </w:tcPr>
+          <w:p>
+            <w:r>
+              <w:rPr>
+                <w:sz w:val="20"/>
+              </w:rPr>
+              <w:t>CONFIRMED</w:t>
+            </w:r>
+          </w:p>
+        </w:tc>
+        <w:tc>
+          <w:tcPr>
+            <w:tcW w:type="dxa" w:w="1938"/>
+            <w:shd w:val="clear" w:color="auto" w:fill="B8B3D6"/>
+            <w:tcBorders>
+              <w:top w:val="single" w:sz="4" w:space="0" w:color="CBCBCB"/>
+              <w:left w:val="single" w:sz="4" w:space="0" w:color="CBCBCB"/>
+              <w:bottom w:val="single" w:sz="4" w:space="0" w:color="CBCBCB"/>
+              <w:right w:val="single" w:sz="4" w:space="0" w:color="CBCBCB"/>
+            </w:tcBorders>
+          </w:tcPr>
+          <w:p>
+            <w:r>
+              <w:rPr>
+                <w:sz w:val="20"/>
+              </w:rPr>
+              <w:t>2026-08-10</w:t>
+            </w:r>
+          </w:p>
+        </w:tc>
+      </w:tr>
+      <w:tr>
+        <w:tc>
+          <w:tcPr>
+            <w:tcW w:type="dxa" w:w="1938"/>
+            <w:tcBorders>
+              <w:top w:val="single" w:sz="4" w:space="0" w:color="CBCBCB"/>
+              <w:left w:val="single" w:sz="4" w:space="0" w:color="CBCBCB"/>
+              <w:bottom w:val="single" w:sz="4" w:space="0" w:color="CBCBCB"/>
+              <w:right w:val="single" w:sz="4" w:space="0" w:color="CBCBCB"/>
+            </w:tcBorders>
+          </w:tcPr>
+          <w:p>
+            <w:r>
+              <w:rPr>
+                <w:rFonts w:ascii="Courier New" w:hAnsi="Courier New"/>
+                <w:color w:val="F05922"/>
+                <w:sz w:val="20"/>
+              </w:rPr>
               <w:t>Pages/Index</w:t>
             </w:r>
           </w:p>
@@ -5229,7 +5750,7 @@
               <w:rPr>
                 <w:sz w:val="20"/>
               </w:rPr>
-              <w:t>IndexModel : PageModel</w:t>
+              <w:t>IndexModel : PageModel, IOptions\&lt;LaunchAppSettings\&gt; (PublicApiKey)</w:t>
             </w:r>
           </w:p>
         </w:tc>
@@ -5286,7 +5807,7 @@
               <w:rPr>
                 <w:sz w:val="20"/>
               </w:rPr>
-              <w:t>2026-08-20</w:t>
+              <w:t>2026-08-24</w:t>
             </w:r>
           </w:p>
         </w:tc>
@@ -7362,6 +7883,170 @@
                 <w:sz w:val="20"/>
               </w:rPr>
               <w:t>✅ STEP-3.1 [adb-add-device-api] 2026-08-19</w:t>
+            </w:r>
+          </w:p>
+        </w:tc>
+      </w:tr>
+      <w:tr>
+        <w:tc>
+          <w:tcPr>
+            <w:tcW w:type="dxa" w:w="2422"/>
+            <w:tcBorders>
+              <w:top w:val="single" w:sz="4" w:space="0" w:color="CBCBCB"/>
+              <w:left w:val="single" w:sz="4" w:space="0" w:color="CBCBCB"/>
+              <w:bottom w:val="single" w:sz="4" w:space="0" w:color="CBCBCB"/>
+              <w:right w:val="single" w:sz="4" w:space="0" w:color="CBCBCB"/>
+            </w:tcBorders>
+          </w:tcPr>
+          <w:p>
+            <w:r>
+              <w:rPr>
+                <w:sz w:val="20"/>
+              </w:rPr>
+              <w:t>GET</w:t>
+            </w:r>
+          </w:p>
+        </w:tc>
+        <w:tc>
+          <w:tcPr>
+            <w:tcW w:type="dxa" w:w="2422"/>
+            <w:tcBorders>
+              <w:top w:val="single" w:sz="4" w:space="0" w:color="CBCBCB"/>
+              <w:left w:val="single" w:sz="4" w:space="0" w:color="CBCBCB"/>
+              <w:bottom w:val="single" w:sz="4" w:space="0" w:color="CBCBCB"/>
+              <w:right w:val="single" w:sz="4" w:space="0" w:color="CBCBCB"/>
+            </w:tcBorders>
+          </w:tcPr>
+          <w:p>
+            <w:r>
+              <w:rPr>
+                <w:rFonts w:ascii="Courier New" w:hAnsi="Courier New"/>
+                <w:color w:val="F05922"/>
+                <w:sz w:val="20"/>
+              </w:rPr>
+              <w:t>/api/devices/{serial}/app-status</w:t>
+            </w:r>
+          </w:p>
+        </w:tc>
+        <w:tc>
+          <w:tcPr>
+            <w:tcW w:type="dxa" w:w="2422"/>
+            <w:tcBorders>
+              <w:top w:val="single" w:sz="4" w:space="0" w:color="CBCBCB"/>
+              <w:left w:val="single" w:sz="4" w:space="0" w:color="CBCBCB"/>
+              <w:bottom w:val="single" w:sz="4" w:space="0" w:color="CBCBCB"/>
+              <w:right w:val="single" w:sz="4" w:space="0" w:color="CBCBCB"/>
+            </w:tcBorders>
+          </w:tcPr>
+          <w:p>
+            <w:r>
+              <w:rPr>
+                <w:sz w:val="20"/>
+              </w:rPr>
+              <w:t>AppStatusEndpoints → ApiRequestLoggingEndpointFilter → ApiKeyEndpointFilter → DeviceState → AdbService.GetAppStatusAsync</w:t>
+            </w:r>
+          </w:p>
+        </w:tc>
+        <w:tc>
+          <w:tcPr>
+            <w:tcW w:type="dxa" w:w="2422"/>
+            <w:tcBorders>
+              <w:top w:val="single" w:sz="4" w:space="0" w:color="CBCBCB"/>
+              <w:left w:val="single" w:sz="4" w:space="0" w:color="CBCBCB"/>
+              <w:bottom w:val="single" w:sz="4" w:space="0" w:color="CBCBCB"/>
+              <w:right w:val="single" w:sz="4" w:space="0" w:color="CBCBCB"/>
+            </w:tcBorders>
+          </w:tcPr>
+          <w:p>
+            <w:r>
+              <w:rPr>
+                <w:sz w:val="20"/>
+              </w:rPr>
+              <w:t>✅ STEP-3.1 [adb-app-status-reboot-api] 2026-08-24</w:t>
+            </w:r>
+          </w:p>
+        </w:tc>
+      </w:tr>
+      <w:tr>
+        <w:tc>
+          <w:tcPr>
+            <w:tcW w:type="dxa" w:w="2422"/>
+            <w:shd w:val="clear" w:color="auto" w:fill="B8B3D6"/>
+            <w:tcBorders>
+              <w:top w:val="single" w:sz="4" w:space="0" w:color="CBCBCB"/>
+              <w:left w:val="single" w:sz="4" w:space="0" w:color="CBCBCB"/>
+              <w:bottom w:val="single" w:sz="4" w:space="0" w:color="CBCBCB"/>
+              <w:right w:val="single" w:sz="4" w:space="0" w:color="CBCBCB"/>
+            </w:tcBorders>
+          </w:tcPr>
+          <w:p>
+            <w:r>
+              <w:rPr>
+                <w:sz w:val="20"/>
+              </w:rPr>
+              <w:t>POST</w:t>
+            </w:r>
+          </w:p>
+        </w:tc>
+        <w:tc>
+          <w:tcPr>
+            <w:tcW w:type="dxa" w:w="2422"/>
+            <w:shd w:val="clear" w:color="auto" w:fill="B8B3D6"/>
+            <w:tcBorders>
+              <w:top w:val="single" w:sz="4" w:space="0" w:color="CBCBCB"/>
+              <w:left w:val="single" w:sz="4" w:space="0" w:color="CBCBCB"/>
+              <w:bottom w:val="single" w:sz="4" w:space="0" w:color="CBCBCB"/>
+              <w:right w:val="single" w:sz="4" w:space="0" w:color="CBCBCB"/>
+            </w:tcBorders>
+          </w:tcPr>
+          <w:p>
+            <w:r>
+              <w:rPr>
+                <w:rFonts w:ascii="Courier New" w:hAnsi="Courier New"/>
+                <w:color w:val="F05922"/>
+                <w:sz w:val="20"/>
+              </w:rPr>
+              <w:t>/api/devices/{serial}/reboot</w:t>
+            </w:r>
+          </w:p>
+        </w:tc>
+        <w:tc>
+          <w:tcPr>
+            <w:tcW w:type="dxa" w:w="2422"/>
+            <w:shd w:val="clear" w:color="auto" w:fill="B8B3D6"/>
+            <w:tcBorders>
+              <w:top w:val="single" w:sz="4" w:space="0" w:color="CBCBCB"/>
+              <w:left w:val="single" w:sz="4" w:space="0" w:color="CBCBCB"/>
+              <w:bottom w:val="single" w:sz="4" w:space="0" w:color="CBCBCB"/>
+              <w:right w:val="single" w:sz="4" w:space="0" w:color="CBCBCB"/>
+            </w:tcBorders>
+          </w:tcPr>
+          <w:p>
+            <w:r>
+              <w:rPr>
+                <w:sz w:val="20"/>
+              </w:rPr>
+              <w:t>RebootEndpoints → ApiRequestLoggingEndpointFilter → ApiKeyEndpointFilter → DeviceState → AdbService.RebootDeviceAsync</w:t>
+            </w:r>
+          </w:p>
+        </w:tc>
+        <w:tc>
+          <w:tcPr>
+            <w:tcW w:type="dxa" w:w="2422"/>
+            <w:shd w:val="clear" w:color="auto" w:fill="B8B3D6"/>
+            <w:tcBorders>
+              <w:top w:val="single" w:sz="4" w:space="0" w:color="CBCBCB"/>
+              <w:left w:val="single" w:sz="4" w:space="0" w:color="CBCBCB"/>
+              <w:bottom w:val="single" w:sz="4" w:space="0" w:color="CBCBCB"/>
+              <w:right w:val="single" w:sz="4" w:space="0" w:color="CBCBCB"/>
+            </w:tcBorders>
+          </w:tcPr>
+          <w:p>
+            <w:r>
+              <w:rPr>
+                <w:sz w:val="20"/>
+              </w:rPr>
+              <w:t>✅ STEP-3.1 [adb-app-status-reboot-api] 2026-08-24</w:t>
             </w:r>
           </w:p>
         </w:tc>
@@ -10877,6 +11562,1066 @@
                 <w:sz w:val="20"/>
               </w:rPr>
               <w:t xml:space="preserve"> — 7 unit tests: 200/401/422, body buffering, handler throw, XFF, durationMs</w:t>
+            </w:r>
+          </w:p>
+        </w:tc>
+      </w:tr>
+      <w:tr>
+        <w:tc>
+          <w:tcPr>
+            <w:tcW w:type="dxa" w:w="3230"/>
+            <w:shd w:val="clear" w:color="auto" w:fill="B8B3D6"/>
+            <w:tcBorders>
+              <w:top w:val="single" w:sz="4" w:space="0" w:color="CBCBCB"/>
+              <w:left w:val="single" w:sz="4" w:space="0" w:color="CBCBCB"/>
+              <w:bottom w:val="single" w:sz="4" w:space="0" w:color="CBCBCB"/>
+              <w:right w:val="single" w:sz="4" w:space="0" w:color="CBCBCB"/>
+            </w:tcBorders>
+          </w:tcPr>
+          <w:p>
+            <w:r>
+              <w:rPr>
+                <w:sz w:val="20"/>
+              </w:rPr>
+              <w:t>2026-08-24</w:t>
+            </w:r>
+          </w:p>
+        </w:tc>
+        <w:tc>
+          <w:tcPr>
+            <w:tcW w:type="dxa" w:w="3230"/>
+            <w:shd w:val="clear" w:color="auto" w:fill="B8B3D6"/>
+            <w:tcBorders>
+              <w:top w:val="single" w:sz="4" w:space="0" w:color="CBCBCB"/>
+              <w:left w:val="single" w:sz="4" w:space="0" w:color="CBCBCB"/>
+              <w:bottom w:val="single" w:sz="4" w:space="0" w:color="CBCBCB"/>
+              <w:right w:val="single" w:sz="4" w:space="0" w:color="CBCBCB"/>
+            </w:tcBorders>
+          </w:tcPr>
+          <w:p>
+            <w:r>
+              <w:rPr>
+                <w:rFonts w:ascii="Courier New" w:hAnsi="Courier New"/>
+                <w:color w:val="F05922"/>
+                <w:sz w:val="20"/>
+              </w:rPr>
+              <w:t>src/.../Services/AdbService.cs</w:t>
+            </w:r>
+          </w:p>
+        </w:tc>
+        <w:tc>
+          <w:tcPr>
+            <w:tcW w:type="dxa" w:w="3230"/>
+            <w:shd w:val="clear" w:color="auto" w:fill="B8B3D6"/>
+            <w:tcBorders>
+              <w:top w:val="single" w:sz="4" w:space="0" w:color="CBCBCB"/>
+              <w:left w:val="single" w:sz="4" w:space="0" w:color="CBCBCB"/>
+              <w:bottom w:val="single" w:sz="4" w:space="0" w:color="CBCBCB"/>
+              <w:right w:val="single" w:sz="4" w:space="0" w:color="CBCBCB"/>
+            </w:tcBorders>
+          </w:tcPr>
+          <w:p>
+            <w:r>
+              <w:rPr>
+                <w:b/>
+                <w:sz w:val="20"/>
+              </w:rPr>
+              <w:t>THÊM</w:t>
+            </w:r>
+            <w:r>
+              <w:rPr>
+                <w:sz w:val="20"/>
+              </w:rPr>
+              <w:t xml:space="preserve"> — </w:t>
+            </w:r>
+            <w:r>
+              <w:rPr>
+                <w:rFonts w:ascii="Courier New" w:hAnsi="Courier New"/>
+                <w:color w:val="F05922"/>
+                <w:sz w:val="20"/>
+              </w:rPr>
+              <w:t>AppState</w:t>
+            </w:r>
+            <w:r>
+              <w:rPr>
+                <w:sz w:val="20"/>
+              </w:rPr>
+              <w:t xml:space="preserve"> enum, </w:t>
+            </w:r>
+            <w:r>
+              <w:rPr>
+                <w:rFonts w:ascii="Courier New" w:hAnsi="Courier New"/>
+                <w:color w:val="F05922"/>
+                <w:sz w:val="20"/>
+              </w:rPr>
+              <w:t>AppStatusResult</w:t>
+            </w:r>
+            <w:r>
+              <w:rPr>
+                <w:sz w:val="20"/>
+              </w:rPr>
+              <w:t xml:space="preserve"> model, </w:t>
+            </w:r>
+            <w:r>
+              <w:rPr>
+                <w:rFonts w:ascii="Courier New" w:hAnsi="Courier New"/>
+                <w:color w:val="F05922"/>
+                <w:sz w:val="20"/>
+              </w:rPr>
+              <w:t>GetAppStatusAsync</w:t>
+            </w:r>
+            <w:r>
+              <w:rPr>
+                <w:sz w:val="20"/>
+              </w:rPr>
+              <w:t xml:space="preserve"> (pidof+dumpsys), </w:t>
+            </w:r>
+            <w:r>
+              <w:rPr>
+                <w:rFonts w:ascii="Courier New" w:hAnsi="Courier New"/>
+                <w:color w:val="F05922"/>
+                <w:sz w:val="20"/>
+              </w:rPr>
+              <w:t>IsForegroundInDumpsys</w:t>
+            </w:r>
+            <w:r>
+              <w:rPr>
+                <w:sz w:val="20"/>
+              </w:rPr>
+              <w:t xml:space="preserve"> (public static), </w:t>
+            </w:r>
+            <w:r>
+              <w:rPr>
+                <w:rFonts w:ascii="Courier New" w:hAnsi="Courier New"/>
+                <w:color w:val="F05922"/>
+                <w:sz w:val="20"/>
+              </w:rPr>
+              <w:t>RebootDeviceAsync</w:t>
+            </w:r>
+            <w:r>
+              <w:rPr>
+                <w:sz w:val="20"/>
+              </w:rPr>
+              <w:t xml:space="preserve"> [adb-app-status-reboot-api]</w:t>
+            </w:r>
+          </w:p>
+        </w:tc>
+      </w:tr>
+      <w:tr>
+        <w:tc>
+          <w:tcPr>
+            <w:tcW w:type="dxa" w:w="3230"/>
+            <w:tcBorders>
+              <w:top w:val="single" w:sz="4" w:space="0" w:color="CBCBCB"/>
+              <w:left w:val="single" w:sz="4" w:space="0" w:color="CBCBCB"/>
+              <w:bottom w:val="single" w:sz="4" w:space="0" w:color="CBCBCB"/>
+              <w:right w:val="single" w:sz="4" w:space="0" w:color="CBCBCB"/>
+            </w:tcBorders>
+          </w:tcPr>
+          <w:p>
+            <w:r>
+              <w:rPr>
+                <w:sz w:val="20"/>
+              </w:rPr>
+              <w:t>2026-08-24</w:t>
+            </w:r>
+          </w:p>
+        </w:tc>
+        <w:tc>
+          <w:tcPr>
+            <w:tcW w:type="dxa" w:w="3230"/>
+            <w:tcBorders>
+              <w:top w:val="single" w:sz="4" w:space="0" w:color="CBCBCB"/>
+              <w:left w:val="single" w:sz="4" w:space="0" w:color="CBCBCB"/>
+              <w:bottom w:val="single" w:sz="4" w:space="0" w:color="CBCBCB"/>
+              <w:right w:val="single" w:sz="4" w:space="0" w:color="CBCBCB"/>
+            </w:tcBorders>
+          </w:tcPr>
+          <w:p>
+            <w:r>
+              <w:rPr>
+                <w:rFonts w:ascii="Courier New" w:hAnsi="Courier New"/>
+                <w:color w:val="F05922"/>
+                <w:sz w:val="20"/>
+              </w:rPr>
+              <w:t>src/.../Endpoints/AppStatusEndpoints.cs</w:t>
+            </w:r>
+          </w:p>
+        </w:tc>
+        <w:tc>
+          <w:tcPr>
+            <w:tcW w:type="dxa" w:w="3230"/>
+            <w:tcBorders>
+              <w:top w:val="single" w:sz="4" w:space="0" w:color="CBCBCB"/>
+              <w:left w:val="single" w:sz="4" w:space="0" w:color="CBCBCB"/>
+              <w:bottom w:val="single" w:sz="4" w:space="0" w:color="CBCBCB"/>
+              <w:right w:val="single" w:sz="4" w:space="0" w:color="CBCBCB"/>
+            </w:tcBorders>
+          </w:tcPr>
+          <w:p>
+            <w:r>
+              <w:rPr>
+                <w:b/>
+                <w:sz w:val="20"/>
+              </w:rPr>
+              <w:t>MỚI</w:t>
+            </w:r>
+            <w:r>
+              <w:rPr>
+                <w:sz w:val="20"/>
+              </w:rPr>
+              <w:t xml:space="preserve"> — GET /api/devices/{serial}/app-status; Validate/CheckDeviceState/MapAppStatusResult public static [adb-app-status-reboot-api]</w:t>
+            </w:r>
+          </w:p>
+        </w:tc>
+      </w:tr>
+      <w:tr>
+        <w:tc>
+          <w:tcPr>
+            <w:tcW w:type="dxa" w:w="3230"/>
+            <w:shd w:val="clear" w:color="auto" w:fill="B8B3D6"/>
+            <w:tcBorders>
+              <w:top w:val="single" w:sz="4" w:space="0" w:color="CBCBCB"/>
+              <w:left w:val="single" w:sz="4" w:space="0" w:color="CBCBCB"/>
+              <w:bottom w:val="single" w:sz="4" w:space="0" w:color="CBCBCB"/>
+              <w:right w:val="single" w:sz="4" w:space="0" w:color="CBCBCB"/>
+            </w:tcBorders>
+          </w:tcPr>
+          <w:p>
+            <w:r>
+              <w:rPr>
+                <w:sz w:val="20"/>
+              </w:rPr>
+              <w:t>2026-08-24</w:t>
+            </w:r>
+          </w:p>
+        </w:tc>
+        <w:tc>
+          <w:tcPr>
+            <w:tcW w:type="dxa" w:w="3230"/>
+            <w:shd w:val="clear" w:color="auto" w:fill="B8B3D6"/>
+            <w:tcBorders>
+              <w:top w:val="single" w:sz="4" w:space="0" w:color="CBCBCB"/>
+              <w:left w:val="single" w:sz="4" w:space="0" w:color="CBCBCB"/>
+              <w:bottom w:val="single" w:sz="4" w:space="0" w:color="CBCBCB"/>
+              <w:right w:val="single" w:sz="4" w:space="0" w:color="CBCBCB"/>
+            </w:tcBorders>
+          </w:tcPr>
+          <w:p>
+            <w:r>
+              <w:rPr>
+                <w:rFonts w:ascii="Courier New" w:hAnsi="Courier New"/>
+                <w:color w:val="F05922"/>
+                <w:sz w:val="20"/>
+              </w:rPr>
+              <w:t>src/.../Endpoints/RebootEndpoints.cs</w:t>
+            </w:r>
+          </w:p>
+        </w:tc>
+        <w:tc>
+          <w:tcPr>
+            <w:tcW w:type="dxa" w:w="3230"/>
+            <w:shd w:val="clear" w:color="auto" w:fill="B8B3D6"/>
+            <w:tcBorders>
+              <w:top w:val="single" w:sz="4" w:space="0" w:color="CBCBCB"/>
+              <w:left w:val="single" w:sz="4" w:space="0" w:color="CBCBCB"/>
+              <w:bottom w:val="single" w:sz="4" w:space="0" w:color="CBCBCB"/>
+              <w:right w:val="single" w:sz="4" w:space="0" w:color="CBCBCB"/>
+            </w:tcBorders>
+          </w:tcPr>
+          <w:p>
+            <w:r>
+              <w:rPr>
+                <w:b/>
+                <w:sz w:val="20"/>
+              </w:rPr>
+              <w:t>MỚI</w:t>
+            </w:r>
+            <w:r>
+              <w:rPr>
+                <w:sz w:val="20"/>
+              </w:rPr>
+              <w:t xml:space="preserve"> — POST /api/devices/{serial}/reboot; CheckDeviceState/MapRebootResult public static [adb-app-status-reboot-api]</w:t>
+            </w:r>
+          </w:p>
+        </w:tc>
+      </w:tr>
+      <w:tr>
+        <w:tc>
+          <w:tcPr>
+            <w:tcW w:type="dxa" w:w="3230"/>
+            <w:tcBorders>
+              <w:top w:val="single" w:sz="4" w:space="0" w:color="CBCBCB"/>
+              <w:left w:val="single" w:sz="4" w:space="0" w:color="CBCBCB"/>
+              <w:bottom w:val="single" w:sz="4" w:space="0" w:color="CBCBCB"/>
+              <w:right w:val="single" w:sz="4" w:space="0" w:color="CBCBCB"/>
+            </w:tcBorders>
+          </w:tcPr>
+          <w:p>
+            <w:r>
+              <w:rPr>
+                <w:sz w:val="20"/>
+              </w:rPr>
+              <w:t>2026-08-24</w:t>
+            </w:r>
+          </w:p>
+        </w:tc>
+        <w:tc>
+          <w:tcPr>
+            <w:tcW w:type="dxa" w:w="3230"/>
+            <w:tcBorders>
+              <w:top w:val="single" w:sz="4" w:space="0" w:color="CBCBCB"/>
+              <w:left w:val="single" w:sz="4" w:space="0" w:color="CBCBCB"/>
+              <w:bottom w:val="single" w:sz="4" w:space="0" w:color="CBCBCB"/>
+              <w:right w:val="single" w:sz="4" w:space="0" w:color="CBCBCB"/>
+            </w:tcBorders>
+          </w:tcPr>
+          <w:p>
+            <w:r>
+              <w:rPr>
+                <w:rFonts w:ascii="Courier New" w:hAnsi="Courier New"/>
+                <w:color w:val="F05922"/>
+                <w:sz w:val="20"/>
+              </w:rPr>
+              <w:t>src/.../Services/ApiRequestLogConstants.cs</w:t>
+            </w:r>
+          </w:p>
+        </w:tc>
+        <w:tc>
+          <w:tcPr>
+            <w:tcW w:type="dxa" w:w="3230"/>
+            <w:tcBorders>
+              <w:top w:val="single" w:sz="4" w:space="0" w:color="CBCBCB"/>
+              <w:left w:val="single" w:sz="4" w:space="0" w:color="CBCBCB"/>
+              <w:bottom w:val="single" w:sz="4" w:space="0" w:color="CBCBCB"/>
+              <w:right w:val="single" w:sz="4" w:space="0" w:color="CBCBCB"/>
+            </w:tcBorders>
+          </w:tcPr>
+          <w:p>
+            <w:r>
+              <w:rPr>
+                <w:sz w:val="20"/>
+              </w:rPr>
+              <w:t xml:space="preserve">Thêm </w:t>
+            </w:r>
+            <w:r>
+              <w:rPr>
+                <w:rFonts w:ascii="Courier New" w:hAnsi="Courier New"/>
+                <w:color w:val="F05922"/>
+                <w:sz w:val="20"/>
+              </w:rPr>
+              <w:t>ApiAppStatus</w:t>
+            </w:r>
+            <w:r>
+              <w:rPr>
+                <w:sz w:val="20"/>
+              </w:rPr>
+              <w:t xml:space="preserve"> + </w:t>
+            </w:r>
+            <w:r>
+              <w:rPr>
+                <w:rFonts w:ascii="Courier New" w:hAnsi="Courier New"/>
+                <w:color w:val="F05922"/>
+                <w:sz w:val="20"/>
+              </w:rPr>
+              <w:t>ApiRebootDevice</w:t>
+            </w:r>
+            <w:r>
+              <w:rPr>
+                <w:sz w:val="20"/>
+              </w:rPr>
+              <w:t xml:space="preserve"> constants [adb-app-status-reboot-api]</w:t>
+            </w:r>
+          </w:p>
+        </w:tc>
+      </w:tr>
+      <w:tr>
+        <w:tc>
+          <w:tcPr>
+            <w:tcW w:type="dxa" w:w="3230"/>
+            <w:shd w:val="clear" w:color="auto" w:fill="B8B3D6"/>
+            <w:tcBorders>
+              <w:top w:val="single" w:sz="4" w:space="0" w:color="CBCBCB"/>
+              <w:left w:val="single" w:sz="4" w:space="0" w:color="CBCBCB"/>
+              <w:bottom w:val="single" w:sz="4" w:space="0" w:color="CBCBCB"/>
+              <w:right w:val="single" w:sz="4" w:space="0" w:color="CBCBCB"/>
+            </w:tcBorders>
+          </w:tcPr>
+          <w:p>
+            <w:r>
+              <w:rPr>
+                <w:sz w:val="20"/>
+              </w:rPr>
+              <w:t>2026-08-24</w:t>
+            </w:r>
+          </w:p>
+        </w:tc>
+        <w:tc>
+          <w:tcPr>
+            <w:tcW w:type="dxa" w:w="3230"/>
+            <w:shd w:val="clear" w:color="auto" w:fill="B8B3D6"/>
+            <w:tcBorders>
+              <w:top w:val="single" w:sz="4" w:space="0" w:color="CBCBCB"/>
+              <w:left w:val="single" w:sz="4" w:space="0" w:color="CBCBCB"/>
+              <w:bottom w:val="single" w:sz="4" w:space="0" w:color="CBCBCB"/>
+              <w:right w:val="single" w:sz="4" w:space="0" w:color="CBCBCB"/>
+            </w:tcBorders>
+          </w:tcPr>
+          <w:p>
+            <w:r>
+              <w:rPr>
+                <w:rFonts w:ascii="Courier New" w:hAnsi="Courier New"/>
+                <w:color w:val="F05922"/>
+                <w:sz w:val="20"/>
+              </w:rPr>
+              <w:t>src/.../Endpoints/ApiRequestLoggingEndpointFilter.cs</w:t>
+            </w:r>
+          </w:p>
+        </w:tc>
+        <w:tc>
+          <w:tcPr>
+            <w:tcW w:type="dxa" w:w="3230"/>
+            <w:shd w:val="clear" w:color="auto" w:fill="B8B3D6"/>
+            <w:tcBorders>
+              <w:top w:val="single" w:sz="4" w:space="0" w:color="CBCBCB"/>
+              <w:left w:val="single" w:sz="4" w:space="0" w:color="CBCBCB"/>
+              <w:bottom w:val="single" w:sz="4" w:space="0" w:color="CBCBCB"/>
+              <w:right w:val="single" w:sz="4" w:space="0" w:color="CBCBCB"/>
+            </w:tcBorders>
+          </w:tcPr>
+          <w:p>
+            <w:r>
+              <w:rPr>
+                <w:rFonts w:ascii="Courier New" w:hAnsi="Courier New"/>
+                <w:color w:val="F05922"/>
+                <w:sz w:val="20"/>
+              </w:rPr>
+              <w:t>ResolveApiName</w:t>
+            </w:r>
+            <w:r>
+              <w:rPr>
+                <w:sz w:val="20"/>
+              </w:rPr>
+              <w:t xml:space="preserve"> nhận diện 2 route mới dùng EndsWith (có {serial} placeholder) [adb-app-status-reboot-api]</w:t>
+            </w:r>
+          </w:p>
+        </w:tc>
+      </w:tr>
+      <w:tr>
+        <w:tc>
+          <w:tcPr>
+            <w:tcW w:type="dxa" w:w="3230"/>
+            <w:tcBorders>
+              <w:top w:val="single" w:sz="4" w:space="0" w:color="CBCBCB"/>
+              <w:left w:val="single" w:sz="4" w:space="0" w:color="CBCBCB"/>
+              <w:bottom w:val="single" w:sz="4" w:space="0" w:color="CBCBCB"/>
+              <w:right w:val="single" w:sz="4" w:space="0" w:color="CBCBCB"/>
+            </w:tcBorders>
+          </w:tcPr>
+          <w:p>
+            <w:r>
+              <w:rPr>
+                <w:sz w:val="20"/>
+              </w:rPr>
+              <w:t>2026-08-24</w:t>
+            </w:r>
+          </w:p>
+        </w:tc>
+        <w:tc>
+          <w:tcPr>
+            <w:tcW w:type="dxa" w:w="3230"/>
+            <w:tcBorders>
+              <w:top w:val="single" w:sz="4" w:space="0" w:color="CBCBCB"/>
+              <w:left w:val="single" w:sz="4" w:space="0" w:color="CBCBCB"/>
+              <w:bottom w:val="single" w:sz="4" w:space="0" w:color="CBCBCB"/>
+              <w:right w:val="single" w:sz="4" w:space="0" w:color="CBCBCB"/>
+            </w:tcBorders>
+          </w:tcPr>
+          <w:p>
+            <w:r>
+              <w:rPr>
+                <w:rFonts w:ascii="Courier New" w:hAnsi="Courier New"/>
+                <w:color w:val="F05922"/>
+                <w:sz w:val="20"/>
+              </w:rPr>
+              <w:t>src/.../Pages/Index.cshtml.cs</w:t>
+            </w:r>
+          </w:p>
+        </w:tc>
+        <w:tc>
+          <w:tcPr>
+            <w:tcW w:type="dxa" w:w="3230"/>
+            <w:tcBorders>
+              <w:top w:val="single" w:sz="4" w:space="0" w:color="CBCBCB"/>
+              <w:left w:val="single" w:sz="4" w:space="0" w:color="CBCBCB"/>
+              <w:bottom w:val="single" w:sz="4" w:space="0" w:color="CBCBCB"/>
+              <w:right w:val="single" w:sz="4" w:space="0" w:color="CBCBCB"/>
+            </w:tcBorders>
+          </w:tcPr>
+          <w:p>
+            <w:r>
+              <w:rPr>
+                <w:rFonts w:ascii="Courier New" w:hAnsi="Courier New"/>
+                <w:color w:val="F05922"/>
+                <w:sz w:val="20"/>
+              </w:rPr>
+              <w:t>IndexModel</w:t>
+            </w:r>
+            <w:r>
+              <w:rPr>
+                <w:sz w:val="20"/>
+              </w:rPr>
+              <w:t xml:space="preserve"> thêm </w:t>
+            </w:r>
+            <w:r>
+              <w:rPr>
+                <w:rFonts w:ascii="Courier New" w:hAnsi="Courier New"/>
+                <w:color w:val="F05922"/>
+                <w:sz w:val="20"/>
+              </w:rPr>
+              <w:t>PublicApiKey</w:t>
+            </w:r>
+            <w:r>
+              <w:rPr>
+                <w:sz w:val="20"/>
+              </w:rPr>
+              <w:t xml:space="preserve"> từ </w:t>
+            </w:r>
+            <w:r>
+              <w:rPr>
+                <w:rFonts w:ascii="Courier New" w:hAnsi="Courier New"/>
+                <w:color w:val="F05922"/>
+                <w:sz w:val="20"/>
+              </w:rPr>
+              <w:t>LaunchApp:ApiKey</w:t>
+            </w:r>
+            <w:r>
+              <w:rPr>
+                <w:sz w:val="20"/>
+              </w:rPr>
+              <w:t xml:space="preserve"> (inject </w:t>
+            </w:r>
+            <w:r>
+              <w:rPr>
+                <w:rFonts w:ascii="Courier New" w:hAnsi="Courier New"/>
+                <w:color w:val="F05922"/>
+                <w:sz w:val="20"/>
+              </w:rPr>
+              <w:t>IOptions&lt;LaunchAppSettings&gt;</w:t>
+            </w:r>
+            <w:r>
+              <w:rPr>
+                <w:sz w:val="20"/>
+              </w:rPr>
+              <w:t>) [adb-app-status-reboot-api]</w:t>
+            </w:r>
+          </w:p>
+        </w:tc>
+      </w:tr>
+      <w:tr>
+        <w:tc>
+          <w:tcPr>
+            <w:tcW w:type="dxa" w:w="3230"/>
+            <w:shd w:val="clear" w:color="auto" w:fill="B8B3D6"/>
+            <w:tcBorders>
+              <w:top w:val="single" w:sz="4" w:space="0" w:color="CBCBCB"/>
+              <w:left w:val="single" w:sz="4" w:space="0" w:color="CBCBCB"/>
+              <w:bottom w:val="single" w:sz="4" w:space="0" w:color="CBCBCB"/>
+              <w:right w:val="single" w:sz="4" w:space="0" w:color="CBCBCB"/>
+            </w:tcBorders>
+          </w:tcPr>
+          <w:p>
+            <w:r>
+              <w:rPr>
+                <w:sz w:val="20"/>
+              </w:rPr>
+              <w:t>2026-08-24</w:t>
+            </w:r>
+          </w:p>
+        </w:tc>
+        <w:tc>
+          <w:tcPr>
+            <w:tcW w:type="dxa" w:w="3230"/>
+            <w:shd w:val="clear" w:color="auto" w:fill="B8B3D6"/>
+            <w:tcBorders>
+              <w:top w:val="single" w:sz="4" w:space="0" w:color="CBCBCB"/>
+              <w:left w:val="single" w:sz="4" w:space="0" w:color="CBCBCB"/>
+              <w:bottom w:val="single" w:sz="4" w:space="0" w:color="CBCBCB"/>
+              <w:right w:val="single" w:sz="4" w:space="0" w:color="CBCBCB"/>
+            </w:tcBorders>
+          </w:tcPr>
+          <w:p>
+            <w:r>
+              <w:rPr>
+                <w:rFonts w:ascii="Courier New" w:hAnsi="Courier New"/>
+                <w:color w:val="F05922"/>
+                <w:sz w:val="20"/>
+              </w:rPr>
+              <w:t>src/.../Pages/Index.cshtml</w:t>
+            </w:r>
+          </w:p>
+        </w:tc>
+        <w:tc>
+          <w:tcPr>
+            <w:tcW w:type="dxa" w:w="3230"/>
+            <w:shd w:val="clear" w:color="auto" w:fill="B8B3D6"/>
+            <w:tcBorders>
+              <w:top w:val="single" w:sz="4" w:space="0" w:color="CBCBCB"/>
+              <w:left w:val="single" w:sz="4" w:space="0" w:color="CBCBCB"/>
+              <w:bottom w:val="single" w:sz="4" w:space="0" w:color="CBCBCB"/>
+              <w:right w:val="single" w:sz="4" w:space="0" w:color="CBCBCB"/>
+            </w:tcBorders>
+          </w:tcPr>
+          <w:p>
+            <w:r>
+              <w:rPr>
+                <w:sz w:val="20"/>
+              </w:rPr>
+              <w:t xml:space="preserve">Thêm 2 nút </w:t>
+            </w:r>
+            <w:r>
+              <w:rPr>
+                <w:rFonts w:ascii="Courier New" w:hAnsi="Courier New"/>
+                <w:color w:val="F05922"/>
+                <w:sz w:val="20"/>
+              </w:rPr>
+              <w:t>btn-check-app-status</w:t>
+            </w:r>
+            <w:r>
+              <w:rPr>
+                <w:sz w:val="20"/>
+              </w:rPr>
+              <w:t xml:space="preserve"> + </w:t>
+            </w:r>
+            <w:r>
+              <w:rPr>
+                <w:rFonts w:ascii="Courier New" w:hAnsi="Courier New"/>
+                <w:color w:val="F05922"/>
+                <w:sz w:val="20"/>
+              </w:rPr>
+              <w:t>btn-reboot-device</w:t>
+            </w:r>
+            <w:r>
+              <w:rPr>
+                <w:sz w:val="20"/>
+              </w:rPr>
+              <w:t xml:space="preserve">; thêm </w:t>
+            </w:r>
+            <w:r>
+              <w:rPr>
+                <w:rFonts w:ascii="Courier New" w:hAnsi="Courier New"/>
+                <w:color w:val="F05922"/>
+                <w:sz w:val="20"/>
+              </w:rPr>
+              <w:t>window.KZ_API_KEY</w:t>
+            </w:r>
+            <w:r>
+              <w:rPr>
+                <w:sz w:val="20"/>
+              </w:rPr>
+              <w:t xml:space="preserve"> script [adb-app-status-reboot-api]</w:t>
+            </w:r>
+          </w:p>
+        </w:tc>
+      </w:tr>
+      <w:tr>
+        <w:tc>
+          <w:tcPr>
+            <w:tcW w:type="dxa" w:w="3230"/>
+            <w:tcBorders>
+              <w:top w:val="single" w:sz="4" w:space="0" w:color="CBCBCB"/>
+              <w:left w:val="single" w:sz="4" w:space="0" w:color="CBCBCB"/>
+              <w:bottom w:val="single" w:sz="4" w:space="0" w:color="CBCBCB"/>
+              <w:right w:val="single" w:sz="4" w:space="0" w:color="CBCBCB"/>
+            </w:tcBorders>
+          </w:tcPr>
+          <w:p>
+            <w:r>
+              <w:rPr>
+                <w:sz w:val="20"/>
+              </w:rPr>
+              <w:t>2026-08-24</w:t>
+            </w:r>
+          </w:p>
+        </w:tc>
+        <w:tc>
+          <w:tcPr>
+            <w:tcW w:type="dxa" w:w="3230"/>
+            <w:tcBorders>
+              <w:top w:val="single" w:sz="4" w:space="0" w:color="CBCBCB"/>
+              <w:left w:val="single" w:sz="4" w:space="0" w:color="CBCBCB"/>
+              <w:bottom w:val="single" w:sz="4" w:space="0" w:color="CBCBCB"/>
+              <w:right w:val="single" w:sz="4" w:space="0" w:color="CBCBCB"/>
+            </w:tcBorders>
+          </w:tcPr>
+          <w:p>
+            <w:r>
+              <w:rPr>
+                <w:rFonts w:ascii="Courier New" w:hAnsi="Courier New"/>
+                <w:color w:val="F05922"/>
+                <w:sz w:val="20"/>
+              </w:rPr>
+              <w:t>src/.../wwwroot/js/dashboard.js</w:t>
+            </w:r>
+          </w:p>
+        </w:tc>
+        <w:tc>
+          <w:tcPr>
+            <w:tcW w:type="dxa" w:w="3230"/>
+            <w:tcBorders>
+              <w:top w:val="single" w:sz="4" w:space="0" w:color="CBCBCB"/>
+              <w:left w:val="single" w:sz="4" w:space="0" w:color="CBCBCB"/>
+              <w:bottom w:val="single" w:sz="4" w:space="0" w:color="CBCBCB"/>
+              <w:right w:val="single" w:sz="4" w:space="0" w:color="CBCBCB"/>
+            </w:tcBorders>
+          </w:tcPr>
+          <w:p>
+            <w:r>
+              <w:rPr>
+                <w:sz w:val="20"/>
+              </w:rPr>
+              <w:t xml:space="preserve">Thêm </w:t>
+            </w:r>
+            <w:r>
+              <w:rPr>
+                <w:rFonts w:ascii="Courier New" w:hAnsi="Courier New"/>
+                <w:color w:val="F05922"/>
+                <w:sz w:val="20"/>
+              </w:rPr>
+              <w:t>apiHeaders()</w:t>
+            </w:r>
+            <w:r>
+              <w:rPr>
+                <w:sz w:val="20"/>
+              </w:rPr>
+              <w:t xml:space="preserve"> helper; cập nhật </w:t>
+            </w:r>
+            <w:r>
+              <w:rPr>
+                <w:rFonts w:ascii="Courier New" w:hAnsi="Courier New"/>
+                <w:color w:val="F05922"/>
+                <w:sz w:val="20"/>
+              </w:rPr>
+              <w:t>summarizeParams</w:t>
+            </w:r>
+            <w:r>
+              <w:rPr>
+                <w:sz w:val="20"/>
+              </w:rPr>
+              <w:t xml:space="preserve"> nhận </w:t>
+            </w:r>
+            <w:r>
+              <w:rPr>
+                <w:rFonts w:ascii="Courier New" w:hAnsi="Courier New"/>
+                <w:color w:val="F05922"/>
+                <w:sz w:val="20"/>
+              </w:rPr>
+              <w:t>entry</w:t>
+            </w:r>
+            <w:r>
+              <w:rPr>
+                <w:sz w:val="20"/>
+              </w:rPr>
+              <w:t xml:space="preserve"> param (dùng path cho AppStatus/RebootDevice); thêm 2 event handler [adb-app-status-reboot-api]</w:t>
+            </w:r>
+          </w:p>
+        </w:tc>
+      </w:tr>
+      <w:tr>
+        <w:tc>
+          <w:tcPr>
+            <w:tcW w:type="dxa" w:w="3230"/>
+            <w:shd w:val="clear" w:color="auto" w:fill="B8B3D6"/>
+            <w:tcBorders>
+              <w:top w:val="single" w:sz="4" w:space="0" w:color="CBCBCB"/>
+              <w:left w:val="single" w:sz="4" w:space="0" w:color="CBCBCB"/>
+              <w:bottom w:val="single" w:sz="4" w:space="0" w:color="CBCBCB"/>
+              <w:right w:val="single" w:sz="4" w:space="0" w:color="CBCBCB"/>
+            </w:tcBorders>
+          </w:tcPr>
+          <w:p>
+            <w:r>
+              <w:rPr>
+                <w:sz w:val="20"/>
+              </w:rPr>
+              <w:t>2026-08-24</w:t>
+            </w:r>
+          </w:p>
+        </w:tc>
+        <w:tc>
+          <w:tcPr>
+            <w:tcW w:type="dxa" w:w="3230"/>
+            <w:shd w:val="clear" w:color="auto" w:fill="B8B3D6"/>
+            <w:tcBorders>
+              <w:top w:val="single" w:sz="4" w:space="0" w:color="CBCBCB"/>
+              <w:left w:val="single" w:sz="4" w:space="0" w:color="CBCBCB"/>
+              <w:bottom w:val="single" w:sz="4" w:space="0" w:color="CBCBCB"/>
+              <w:right w:val="single" w:sz="4" w:space="0" w:color="CBCBCB"/>
+            </w:tcBorders>
+          </w:tcPr>
+          <w:p>
+            <w:r>
+              <w:rPr>
+                <w:rFonts w:ascii="Courier New" w:hAnsi="Courier New"/>
+                <w:color w:val="F05922"/>
+                <w:sz w:val="20"/>
+              </w:rPr>
+              <w:t>src/.../Program.cs</w:t>
+            </w:r>
+          </w:p>
+        </w:tc>
+        <w:tc>
+          <w:tcPr>
+            <w:tcW w:type="dxa" w:w="3230"/>
+            <w:shd w:val="clear" w:color="auto" w:fill="B8B3D6"/>
+            <w:tcBorders>
+              <w:top w:val="single" w:sz="4" w:space="0" w:color="CBCBCB"/>
+              <w:left w:val="single" w:sz="4" w:space="0" w:color="CBCBCB"/>
+              <w:bottom w:val="single" w:sz="4" w:space="0" w:color="CBCBCB"/>
+              <w:right w:val="single" w:sz="4" w:space="0" w:color="CBCBCB"/>
+            </w:tcBorders>
+          </w:tcPr>
+          <w:p>
+            <w:r>
+              <w:rPr>
+                <w:sz w:val="20"/>
+              </w:rPr>
+              <w:t xml:space="preserve">Thêm </w:t>
+            </w:r>
+            <w:r>
+              <w:rPr>
+                <w:rFonts w:ascii="Courier New" w:hAnsi="Courier New"/>
+                <w:color w:val="F05922"/>
+                <w:sz w:val="20"/>
+              </w:rPr>
+              <w:t>MapAppStatusEndpoints()</w:t>
+            </w:r>
+            <w:r>
+              <w:rPr>
+                <w:sz w:val="20"/>
+              </w:rPr>
+              <w:t xml:space="preserve"> + </w:t>
+            </w:r>
+            <w:r>
+              <w:rPr>
+                <w:rFonts w:ascii="Courier New" w:hAnsi="Courier New"/>
+                <w:color w:val="F05922"/>
+                <w:sz w:val="20"/>
+              </w:rPr>
+              <w:t>MapRebootEndpoints()</w:t>
+            </w:r>
+            <w:r>
+              <w:rPr>
+                <w:sz w:val="20"/>
+              </w:rPr>
+              <w:t xml:space="preserve"> [adb-app-status-reboot-api]</w:t>
+            </w:r>
+          </w:p>
+        </w:tc>
+      </w:tr>
+      <w:tr>
+        <w:tc>
+          <w:tcPr>
+            <w:tcW w:type="dxa" w:w="3230"/>
+            <w:tcBorders>
+              <w:top w:val="single" w:sz="4" w:space="0" w:color="CBCBCB"/>
+              <w:left w:val="single" w:sz="4" w:space="0" w:color="CBCBCB"/>
+              <w:bottom w:val="single" w:sz="4" w:space="0" w:color="CBCBCB"/>
+              <w:right w:val="single" w:sz="4" w:space="0" w:color="CBCBCB"/>
+            </w:tcBorders>
+          </w:tcPr>
+          <w:p>
+            <w:r>
+              <w:rPr>
+                <w:sz w:val="20"/>
+              </w:rPr>
+              <w:t>2026-08-24</w:t>
+            </w:r>
+          </w:p>
+        </w:tc>
+        <w:tc>
+          <w:tcPr>
+            <w:tcW w:type="dxa" w:w="3230"/>
+            <w:tcBorders>
+              <w:top w:val="single" w:sz="4" w:space="0" w:color="CBCBCB"/>
+              <w:left w:val="single" w:sz="4" w:space="0" w:color="CBCBCB"/>
+              <w:bottom w:val="single" w:sz="4" w:space="0" w:color="CBCBCB"/>
+              <w:right w:val="single" w:sz="4" w:space="0" w:color="CBCBCB"/>
+            </w:tcBorders>
+          </w:tcPr>
+          <w:p>
+            <w:r>
+              <w:rPr>
+                <w:rFonts w:ascii="Courier New" w:hAnsi="Courier New"/>
+                <w:color w:val="F05922"/>
+                <w:sz w:val="20"/>
+              </w:rPr>
+              <w:t>tests/.../AppStatusEndpointsTests.cs</w:t>
+            </w:r>
+          </w:p>
+        </w:tc>
+        <w:tc>
+          <w:tcPr>
+            <w:tcW w:type="dxa" w:w="3230"/>
+            <w:tcBorders>
+              <w:top w:val="single" w:sz="4" w:space="0" w:color="CBCBCB"/>
+              <w:left w:val="single" w:sz="4" w:space="0" w:color="CBCBCB"/>
+              <w:bottom w:val="single" w:sz="4" w:space="0" w:color="CBCBCB"/>
+              <w:right w:val="single" w:sz="4" w:space="0" w:color="CBCBCB"/>
+            </w:tcBorders>
+          </w:tcPr>
+          <w:p>
+            <w:r>
+              <w:rPr>
+                <w:b/>
+                <w:sz w:val="20"/>
+              </w:rPr>
+              <w:t>MỚI</w:t>
+            </w:r>
+            <w:r>
+              <w:rPr>
+                <w:sz w:val="20"/>
+              </w:rPr>
+              <w:t xml:space="preserve"> — 9 unit tests: ValidateInput x3, CheckDeviceState x2, MapAppStatusResult x4 (3 states + AdbNotFound + AdbTimeout + AdbError)</w:t>
+            </w:r>
+          </w:p>
+        </w:tc>
+      </w:tr>
+      <w:tr>
+        <w:tc>
+          <w:tcPr>
+            <w:tcW w:type="dxa" w:w="3230"/>
+            <w:shd w:val="clear" w:color="auto" w:fill="B8B3D6"/>
+            <w:tcBorders>
+              <w:top w:val="single" w:sz="4" w:space="0" w:color="CBCBCB"/>
+              <w:left w:val="single" w:sz="4" w:space="0" w:color="CBCBCB"/>
+              <w:bottom w:val="single" w:sz="4" w:space="0" w:color="CBCBCB"/>
+              <w:right w:val="single" w:sz="4" w:space="0" w:color="CBCBCB"/>
+            </w:tcBorders>
+          </w:tcPr>
+          <w:p>
+            <w:r>
+              <w:rPr>
+                <w:sz w:val="20"/>
+              </w:rPr>
+              <w:t>2026-08-24</w:t>
+            </w:r>
+          </w:p>
+        </w:tc>
+        <w:tc>
+          <w:tcPr>
+            <w:tcW w:type="dxa" w:w="3230"/>
+            <w:shd w:val="clear" w:color="auto" w:fill="B8B3D6"/>
+            <w:tcBorders>
+              <w:top w:val="single" w:sz="4" w:space="0" w:color="CBCBCB"/>
+              <w:left w:val="single" w:sz="4" w:space="0" w:color="CBCBCB"/>
+              <w:bottom w:val="single" w:sz="4" w:space="0" w:color="CBCBCB"/>
+              <w:right w:val="single" w:sz="4" w:space="0" w:color="CBCBCB"/>
+            </w:tcBorders>
+          </w:tcPr>
+          <w:p>
+            <w:r>
+              <w:rPr>
+                <w:rFonts w:ascii="Courier New" w:hAnsi="Courier New"/>
+                <w:color w:val="F05922"/>
+                <w:sz w:val="20"/>
+              </w:rPr>
+              <w:t>tests/.../RebootEndpointsTests.cs</w:t>
+            </w:r>
+          </w:p>
+        </w:tc>
+        <w:tc>
+          <w:tcPr>
+            <w:tcW w:type="dxa" w:w="3230"/>
+            <w:shd w:val="clear" w:color="auto" w:fill="B8B3D6"/>
+            <w:tcBorders>
+              <w:top w:val="single" w:sz="4" w:space="0" w:color="CBCBCB"/>
+              <w:left w:val="single" w:sz="4" w:space="0" w:color="CBCBCB"/>
+              <w:bottom w:val="single" w:sz="4" w:space="0" w:color="CBCBCB"/>
+              <w:right w:val="single" w:sz="4" w:space="0" w:color="CBCBCB"/>
+            </w:tcBorders>
+          </w:tcPr>
+          <w:p>
+            <w:r>
+              <w:rPr>
+                <w:b/>
+                <w:sz w:val="20"/>
+              </w:rPr>
+              <w:t>MỚI</w:t>
+            </w:r>
+            <w:r>
+              <w:rPr>
+                <w:sz w:val="20"/>
+              </w:rPr>
+              <w:t xml:space="preserve"> — 6 unit tests: CheckDeviceState x2, MapRebootResult x4 (Success + AdbNotFound + AdbTimeout + AdbError)</w:t>
+            </w:r>
+          </w:p>
+        </w:tc>
+      </w:tr>
+      <w:tr>
+        <w:tc>
+          <w:tcPr>
+            <w:tcW w:type="dxa" w:w="3230"/>
+            <w:tcBorders>
+              <w:top w:val="single" w:sz="4" w:space="0" w:color="CBCBCB"/>
+              <w:left w:val="single" w:sz="4" w:space="0" w:color="CBCBCB"/>
+              <w:bottom w:val="single" w:sz="4" w:space="0" w:color="CBCBCB"/>
+              <w:right w:val="single" w:sz="4" w:space="0" w:color="CBCBCB"/>
+            </w:tcBorders>
+          </w:tcPr>
+          <w:p>
+            <w:r>
+              <w:rPr>
+                <w:sz w:val="20"/>
+              </w:rPr>
+              <w:t>2026-08-24</w:t>
+            </w:r>
+          </w:p>
+        </w:tc>
+        <w:tc>
+          <w:tcPr>
+            <w:tcW w:type="dxa" w:w="3230"/>
+            <w:tcBorders>
+              <w:top w:val="single" w:sz="4" w:space="0" w:color="CBCBCB"/>
+              <w:left w:val="single" w:sz="4" w:space="0" w:color="CBCBCB"/>
+              <w:bottom w:val="single" w:sz="4" w:space="0" w:color="CBCBCB"/>
+              <w:right w:val="single" w:sz="4" w:space="0" w:color="CBCBCB"/>
+            </w:tcBorders>
+          </w:tcPr>
+          <w:p>
+            <w:r>
+              <w:rPr>
+                <w:rFonts w:ascii="Courier New" w:hAnsi="Courier New"/>
+                <w:color w:val="F05922"/>
+                <w:sz w:val="20"/>
+              </w:rPr>
+              <w:t>tests/.../AdbServiceAppStatusTests.cs</w:t>
+            </w:r>
+          </w:p>
+        </w:tc>
+        <w:tc>
+          <w:tcPr>
+            <w:tcW w:type="dxa" w:w="3230"/>
+            <w:tcBorders>
+              <w:top w:val="single" w:sz="4" w:space="0" w:color="CBCBCB"/>
+              <w:left w:val="single" w:sz="4" w:space="0" w:color="CBCBCB"/>
+              <w:bottom w:val="single" w:sz="4" w:space="0" w:color="CBCBCB"/>
+              <w:right w:val="single" w:sz="4" w:space="0" w:color="CBCBCB"/>
+            </w:tcBorders>
+          </w:tcPr>
+          <w:p>
+            <w:r>
+              <w:rPr>
+                <w:b/>
+                <w:sz w:val="20"/>
+              </w:rPr>
+              <w:t>MỚI</w:t>
+            </w:r>
+            <w:r>
+              <w:rPr>
+                <w:sz w:val="20"/>
+              </w:rPr>
+              <w:t xml:space="preserve"> — 5 unit tests: IsForegroundInDumpsys (mResumedActivity found, other package, empty, mFocusedActivity fallback, neither)</w:t>
             </w:r>
           </w:p>
         </w:tc>

</xml_diff>